<commit_message>
Documentation Version 2 with introductions
</commit_message>
<xml_diff>
--- a/Dokumentation/Dokumentation.docx
+++ b/Dokumentation/Dokumentation.docx
@@ -1,6 +1,6 @@
 
 <file path=word/document.xml><?xml version="1.0" encoding="utf-8"?>
-<w:document xmlns:wpc="http://schemas.microsoft.com/office/word/2010/wordprocessingCanvas" xmlns:cx="http://schemas.microsoft.com/office/drawing/2014/chartex" xmlns:cx1="http://schemas.microsoft.com/office/drawing/2015/9/8/chartex" xmlns:cx2="http://schemas.microsoft.com/office/drawing/2015/10/21/chartex" xmlns:cx3="http://schemas.microsoft.com/office/drawing/2016/5/9/chartex" xmlns:cx4="http://schemas.microsoft.com/office/drawing/2016/5/10/chartex" xmlns:cx5="http://schemas.microsoft.com/office/drawing/2016/5/11/chartex" xmlns:cx6="http://schemas.microsoft.com/office/drawing/2016/5/12/chartex" xmlns:cx7="http://schemas.microsoft.com/office/drawing/2016/5/13/chartex" xmlns:cx8="http://schemas.microsoft.com/office/drawing/2016/5/14/chartex" xmlns:mc="http://schemas.openxmlformats.org/markup-compatibility/2006" xmlns:aink="http://schemas.microsoft.com/office/drawing/2016/ink" xmlns:am3d="http://schemas.microsoft.com/office/drawing/2017/model3d" xmlns:o="urn:schemas-microsoft-com:office:office" xmlns:oel="http://schemas.microsoft.com/office/2019/extlst" xmlns:r="http://schemas.openxmlformats.org/officeDocument/2006/relationships" xmlns:m="http://schemas.openxmlformats.org/officeDocument/2006/math" xmlns:v="urn:schemas-microsoft-com:vml" xmlns:wp14="http://schemas.microsoft.com/office/word/2010/wordprocessingDrawing" xmlns:wp="http://schemas.openxmlformats.org/drawingml/2006/wordprocessingDrawing" xmlns:w10="urn:schemas-microsoft-com:office:word" xmlns:w="http://schemas.openxmlformats.org/wordprocessingml/2006/main" xmlns:w14="http://schemas.microsoft.com/office/word/2010/wordml" xmlns:w15="http://schemas.microsoft.com/office/word/2012/wordml" xmlns:w16cex="http://schemas.microsoft.com/office/word/2018/wordml/cex" xmlns:w16cid="http://schemas.microsoft.com/office/word/2016/wordml/cid" xmlns:w16="http://schemas.microsoft.com/office/word/2018/wordml" xmlns:w16du="http://schemas.microsoft.com/office/word/2023/wordml/word16du" xmlns:w16sdtdh="http://schemas.microsoft.com/office/word/2020/wordml/sdtdatahash" xmlns:w16sdtfl="http://schemas.microsoft.com/office/word/2024/wordml/sdtformatlock" xmlns:w16se="http://schemas.microsoft.com/office/word/2015/wordml/symex" xmlns:wpg="http://schemas.microsoft.com/office/word/2010/wordprocessingGroup" xmlns:wpi="http://schemas.microsoft.com/office/word/2010/wordprocessingInk" xmlns:wne="http://schemas.microsoft.com/office/word/2006/wordml" xmlns:wps="http://schemas.microsoft.com/office/word/2010/wordprocessingShape" mc:Ignorable="w14 w15 w16se w16cid w16 w16cex w16sdtdh w16sdtfl w16du wp14">
+<w:document xmlns:wpc="http://schemas.microsoft.com/office/word/2010/wordprocessingCanvas" xmlns:cx="http://schemas.microsoft.com/office/drawing/2014/chartex" xmlns:cx1="http://schemas.microsoft.com/office/drawing/2015/9/8/chartex" xmlns:cx2="http://schemas.microsoft.com/office/drawing/2015/10/21/chartex" xmlns:cx3="http://schemas.microsoft.com/office/drawing/2016/5/9/chartex" xmlns:cx4="http://schemas.microsoft.com/office/drawing/2016/5/10/chartex" xmlns:cx5="http://schemas.microsoft.com/office/drawing/2016/5/11/chartex" xmlns:cx6="http://schemas.microsoft.com/office/drawing/2016/5/12/chartex" xmlns:cx7="http://schemas.microsoft.com/office/drawing/2016/5/13/chartex" xmlns:cx8="http://schemas.microsoft.com/office/drawing/2016/5/14/chartex" xmlns:mc="http://schemas.openxmlformats.org/markup-compatibility/2006" xmlns:aink="http://schemas.microsoft.com/office/drawing/2016/ink" xmlns:am3d="http://schemas.microsoft.com/office/drawing/2017/model3d" xmlns:o="urn:schemas-microsoft-com:office:office" xmlns:oel="http://schemas.microsoft.com/office/2019/extlst" xmlns:r="http://schemas.openxmlformats.org/officeDocument/2006/relationships" xmlns:m="http://schemas.openxmlformats.org/officeDocument/2006/math" xmlns:v="urn:schemas-microsoft-com:vml" xmlns:wp14="http://schemas.microsoft.com/office/word/2010/wordprocessingDrawing" xmlns:wp="http://schemas.openxmlformats.org/drawingml/2006/wordprocessingDrawing" xmlns:w10="urn:schemas-microsoft-com:office:word" xmlns:w="http://schemas.openxmlformats.org/wordprocessingml/2006/main" xmlns:w14="http://schemas.microsoft.com/office/word/2010/wordml" xmlns:w15="http://schemas.microsoft.com/office/word/2012/wordml" xmlns:w16cex="http://schemas.microsoft.com/office/word/2018/wordml/cex" xmlns:w16cid="http://schemas.microsoft.com/office/word/2016/wordml/cid" xmlns:w16="http://schemas.microsoft.com/office/word/2018/wordml" xmlns:w16sdtdh="http://schemas.microsoft.com/office/word/2020/wordml/sdtdatahash" xmlns:w16se="http://schemas.microsoft.com/office/word/2015/wordml/symex" xmlns:wpg="http://schemas.microsoft.com/office/word/2010/wordprocessingGroup" xmlns:wpi="http://schemas.microsoft.com/office/word/2010/wordprocessingInk" xmlns:wne="http://schemas.microsoft.com/office/word/2006/wordml" xmlns:wps="http://schemas.microsoft.com/office/word/2010/wordprocessingShape" mc:Ignorable="w14 w15 w16se w16cid w16 w16cex w16sdtdh wp14">
   <w:body>
     <w:sdt>
       <w:sdtPr>
@@ -34,7 +34,7 @@
                 <mc:AlternateContent>
                   <mc:Choice Requires="wpg">
                     <w:drawing>
-                      <wp:anchor distT="0" distB="0" distL="114300" distR="114300" simplePos="0" relativeHeight="251658246" behindDoc="0" locked="0" layoutInCell="1" allowOverlap="1" wp14:anchorId="508BE44B" wp14:editId="03F3F47C">
+                      <wp:anchor distT="0" distB="0" distL="114300" distR="114300" simplePos="0" relativeHeight="251658243" behindDoc="0" locked="0" layoutInCell="1" allowOverlap="1" wp14:anchorId="508BE44B" wp14:editId="03F3F47C">
                         <wp:simplePos x="0" y="0"/>
                         <wp:positionH relativeFrom="page">
                           <wp:posOffset>228600</wp:posOffset>
@@ -274,13 +274,13 @@
                       </wp:anchor>
                     </w:drawing>
                   </mc:Choice>
-                  <mc:Fallback>
+                  <mc:Fallback xmlns:w16sdtfl="http://schemas.microsoft.com/office/word/2024/wordml/sdtformatlock" xmlns:w16du="http://schemas.microsoft.com/office/word/2023/wordml/word16du">
                     <w:pict>
-                      <v:group w14:anchorId="70738D2E" id="Gruppe 149" o:spid="_x0000_s1026" style="position:absolute;margin-left:18pt;margin-top:18.95pt;width:8in;height:205.5pt;z-index:251658246;mso-width-percent:941;mso-position-horizontal-relative:page;mso-position-vertical-relative:page;mso-width-percent:941" coordorigin="" coordsize="73152,12161" o:gfxdata="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">
-                        <v:shape id="Rechteck 51" o:spid="_x0000_s1027" style="position:absolute;width:73152;height:11303;visibility:visible;mso-wrap-style:square;v-text-anchor:middle" coordsize="7312660,1129665" o:gfxdata="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" path="m,l7312660,r,1129665l3619500,733425,,1091565,,xe" fillcolor="#af0000" stroked="f" strokeweight="1pt">
+                      <v:group w14:anchorId="1E7B5112" id="Gruppe 149" o:spid="_x0000_s1026" style="position:absolute;margin-left:18pt;margin-top:18.95pt;width:8in;height:205.5pt;z-index:251658246;mso-width-percent:941;mso-position-horizontal-relative:page;mso-position-vertical-relative:page;mso-width-percent:941" coordorigin="" coordsize="73152,12161" o:gfxdata="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">
+                        <v:shape id="Rechteck 51" o:spid="_x0000_s1027" style="position:absolute;width:73152;height:11303;visibility:visible;mso-wrap-style:square;v-text-anchor:middle" coordsize="7312660,1129665" o:gfxdata="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" path="m,l7312660,r,1129665l3619500,733425,,1091565,,xe" fillcolor="#af0000" stroked="f" strokeweight="1pt">
                           <v:path arrowok="t" o:connecttype="custom" o:connectlocs="0,0;7315200,0;7315200,1130373;3620757,733885;0,1092249;0,0" o:connectangles="0,0,0,0,0,0"/>
                         </v:shape>
-                        <v:rect id="Rechteck 1404434590" o:spid="_x0000_s1028" style="position:absolute;width:73152;height:12161;visibility:visible;mso-wrap-style:square;v-text-anchor:middle" o:gfxdata="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" stroked="f" strokeweight="1pt">
+                        <v:rect id="Rechteck 1404434590" o:spid="_x0000_s1028" style="position:absolute;width:73152;height:12161;visibility:visible;mso-wrap-style:square;v-text-anchor:middle" o:gfxdata="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" stroked="f" strokeweight="1pt">
                           <v:fill r:id="rId10" o:title="" recolor="t" rotate="t" type="frame"/>
                         </v:rect>
                         <w10:wrap anchorx="page" anchory="page"/>
@@ -296,7 +296,7 @@
                 <mc:AlternateContent>
                   <mc:Choice Requires="wpg">
                     <w:drawing>
-                      <wp:anchor distT="0" distB="0" distL="114300" distR="114300" simplePos="0" relativeHeight="251658242" behindDoc="0" locked="0" layoutInCell="1" allowOverlap="1" wp14:anchorId="3FC6F67B" wp14:editId="6CB8DA18">
+                      <wp:anchor distT="0" distB="0" distL="114300" distR="114300" simplePos="0" relativeHeight="251658241" behindDoc="0" locked="0" layoutInCell="1" allowOverlap="1" wp14:anchorId="3FC6F67B" wp14:editId="6CB8DA18">
                         <wp:simplePos x="0" y="0"/>
                         <wp:positionH relativeFrom="page">
                           <wp:align>center</wp:align>
@@ -545,13 +545,13 @@
                       </wp:anchor>
                     </w:drawing>
                   </mc:Choice>
-                  <mc:Fallback>
+                  <mc:Fallback xmlns:w16sdtfl="http://schemas.microsoft.com/office/word/2024/wordml/sdtformatlock" xmlns:w16du="http://schemas.microsoft.com/office/word/2023/wordml/word16du">
                     <w:pict>
-                      <v:group w14:anchorId="64AB2E1C" id="Gruppe 149" o:spid="_x0000_s1026" style="position:absolute;margin-left:0;margin-top:0;width:8in;height:205.5pt;z-index:251658242;mso-width-percent:941;mso-top-percent:23;mso-position-horizontal:center;mso-position-horizontal-relative:page;mso-position-vertical-relative:page;mso-width-percent:941;mso-top-percent:23" coordorigin="" coordsize="73152,12161" o:gfxdata="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">
-                        <v:shape id="Rechteck 51" o:spid="_x0000_s1027" style="position:absolute;width:73152;height:11303;visibility:visible;mso-wrap-style:square;v-text-anchor:middle" coordsize="7312660,1129665" o:gfxdata="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" path="m,l7312660,r,1129665l3619500,733425,,1091565,,xe" fillcolor="#af0000" stroked="f" strokeweight="1pt">
+                      <v:group w14:anchorId="759757FE" id="Gruppe 149" o:spid="_x0000_s1026" style="position:absolute;margin-left:0;margin-top:0;width:8in;height:205.5pt;z-index:251658242;mso-width-percent:941;mso-top-percent:23;mso-position-horizontal:center;mso-position-horizontal-relative:page;mso-position-vertical-relative:page;mso-width-percent:941;mso-top-percent:23" coordorigin="" coordsize="73152,12161" o:gfxdata="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">
+                        <v:shape id="Rechteck 51" o:spid="_x0000_s1027" style="position:absolute;width:73152;height:11303;visibility:visible;mso-wrap-style:square;v-text-anchor:middle" coordsize="7312660,1129665" o:gfxdata="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" path="m,l7312660,r,1129665l3619500,733425,,1091565,,xe" fillcolor="#af0000" stroked="f" strokeweight="1pt">
                           <v:path arrowok="t" o:connecttype="custom" o:connectlocs="0,0;7315200,0;7315200,1130373;3620757,733885;0,1092249;0,0" o:connectangles="0,0,0,0,0,0"/>
                         </v:shape>
-                        <v:rect id="Rechteck 151" o:spid="_x0000_s1028" style="position:absolute;width:73152;height:12161;visibility:visible;mso-wrap-style:square;v-text-anchor:middle" o:gfxdata="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" stroked="f" strokeweight="1pt">
+                        <v:rect id="Rechteck 151" o:spid="_x0000_s1028" style="position:absolute;width:73152;height:12161;visibility:visible;mso-wrap-style:square;v-text-anchor:middle" o:gfxdata="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" stroked="f" strokeweight="1pt">
                           <v:fill r:id="rId10" o:title="" recolor="t" rotate="t" type="frame"/>
                         </v:rect>
                         <w10:wrap anchorx="page" anchory="page"/>
@@ -578,15 +578,15 @@
                 <mc:AlternateContent>
                   <mc:Choice Requires="wps">
                     <w:drawing>
-                      <wp:anchor distT="0" distB="0" distL="114300" distR="114300" simplePos="0" relativeHeight="251662343" behindDoc="0" locked="0" layoutInCell="1" allowOverlap="1" wp14:anchorId="5AD38AA3" wp14:editId="5AC1449B">
+                      <wp:anchor distT="0" distB="0" distL="114300" distR="114300" simplePos="0" relativeHeight="251658247" behindDoc="0" locked="0" layoutInCell="1" allowOverlap="1" wp14:anchorId="5AD38AA3" wp14:editId="20AE065E">
                         <wp:simplePos x="0" y="0"/>
                         <wp:positionH relativeFrom="column">
-                          <wp:posOffset>-425885</wp:posOffset>
+                          <wp:posOffset>-424815</wp:posOffset>
                         </wp:positionH>
                         <wp:positionV relativeFrom="paragraph">
-                          <wp:posOffset>3762358</wp:posOffset>
+                          <wp:posOffset>3901233</wp:posOffset>
                         </wp:positionV>
-                        <wp:extent cx="6664203" cy="1678305"/>
+                        <wp:extent cx="6664203" cy="1371600"/>
                         <wp:effectExtent l="0" t="0" r="3810" b="0"/>
                         <wp:wrapNone/>
                         <wp:docPr id="1198034368" name="Textfeld 12"/>
@@ -598,7 +598,7 @@
                               <wps:spPr>
                                 <a:xfrm>
                                   <a:off x="0" y="0"/>
-                                  <a:ext cx="6664203" cy="1678305"/>
+                                  <a:ext cx="6664203" cy="1371600"/>
                                 </a:xfrm>
                                 <a:prstGeom prst="rect">
                                   <a:avLst/>
@@ -657,31 +657,12 @@
                                   </w:p>
                                   <w:p>
                                     <w:pPr>
-                                      <w:pStyle w:val="KeinLeerraum"/>
-                                      <w:jc w:val="both"/>
-                                      <w:rPr>
-                                        <w:sz w:val="28"/>
-                                        <w:szCs w:val="28"/>
-                                        <w:lang w:val="de-DE"/>
-                                      </w:rPr>
-                                    </w:pPr>
-                                  </w:p>
-                                  <w:p>
-                                    <w:pPr>
                                       <w:ind w:firstLine="0"/>
                                       <w:rPr>
                                         <w:sz w:val="28"/>
                                         <w:szCs w:val="28"/>
                                       </w:rPr>
                                     </w:pPr>
-                                    <w:r>
-                                      <w:rPr>
-                                        <w:sz w:val="28"/>
-                                        <w:szCs w:val="28"/>
-                                        <w:lang w:val="de-DE"/>
-                                      </w:rPr>
-                                      <w:t>Dieses Dokument beschreibt die Anforderungen, User Stories und technische Umsetzung des Projekts.</w:t>
-                                    </w:r>
                                   </w:p>
                                 </w:txbxContent>
                               </wps:txbx>
@@ -709,7 +690,7 @@
                         <v:stroke joinstyle="miter"/>
                         <v:path gradientshapeok="t" o:connecttype="rect"/>
                       </v:shapetype>
-                      <v:shape id="Textfeld 12" o:spid="_x0000_s1026" type="#_x0000_t202" style="position:absolute;left:0;text-align:left;margin-left:-33.55pt;margin-top:296.25pt;width:524.75pt;height:132.15pt;z-index:251662343;visibility:visible;mso-wrap-style:square;mso-width-percent:0;mso-height-percent:0;mso-wrap-distance-left:9pt;mso-wrap-distance-top:0;mso-wrap-distance-right:9pt;mso-wrap-distance-bottom:0;mso-position-horizontal:absolute;mso-position-horizontal-relative:text;mso-position-vertical:absolute;mso-position-vertical-relative:text;mso-width-percent:0;mso-height-percent:0;mso-width-relative:margin;mso-height-relative:margin;v-text-anchor:top" o:gfxdata="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" fillcolor="white [3201]" stroked="f" strokeweight=".5pt">
+                      <v:shape id="Textfeld 12" o:spid="_x0000_s1026" type="#_x0000_t202" style="position:absolute;left:0;text-align:left;margin-left:-33.45pt;margin-top:307.2pt;width:524.75pt;height:108pt;z-index:251658247;visibility:visible;mso-wrap-style:square;mso-width-percent:0;mso-height-percent:0;mso-wrap-distance-left:9pt;mso-wrap-distance-top:0;mso-wrap-distance-right:9pt;mso-wrap-distance-bottom:0;mso-position-horizontal:absolute;mso-position-horizontal-relative:text;mso-position-vertical:absolute;mso-position-vertical-relative:text;mso-width-percent:0;mso-height-percent:0;mso-width-relative:margin;mso-height-relative:margin;v-text-anchor:top" o:gfxdata="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" fillcolor="white [3201]" stroked="f" strokeweight=".5pt">
                         <v:textbox>
                           <w:txbxContent>
                             <w:p>
@@ -757,31 +738,12 @@
                             </w:p>
                             <w:p>
                               <w:pPr>
-                                <w:pStyle w:val="KeinLeerraum"/>
-                                <w:jc w:val="both"/>
-                                <w:rPr>
-                                  <w:sz w:val="28"/>
-                                  <w:szCs w:val="28"/>
-                                  <w:lang w:val="de-DE"/>
-                                </w:rPr>
-                              </w:pPr>
-                            </w:p>
-                            <w:p>
-                              <w:pPr>
                                 <w:ind w:firstLine="0"/>
                                 <w:rPr>
                                   <w:sz w:val="28"/>
                                   <w:szCs w:val="28"/>
                                 </w:rPr>
                               </w:pPr>
-                              <w:r>
-                                <w:rPr>
-                                  <w:sz w:val="28"/>
-                                  <w:szCs w:val="28"/>
-                                  <w:lang w:val="de-DE"/>
-                                </w:rPr>
-                                <w:t>Dieses Dokument beschreibt die Anforderungen, User Stories und technische Umsetzung des Projekts.</w:t>
-                              </w:r>
                             </w:p>
                           </w:txbxContent>
                         </v:textbox>
@@ -795,18 +757,18 @@
                   <w:noProof/>
                 </w:rPr>
                 <w:drawing>
-                  <wp:anchor distT="0" distB="0" distL="114300" distR="114300" simplePos="0" relativeHeight="251663367" behindDoc="0" locked="0" layoutInCell="1" allowOverlap="1" wp14:anchorId="17FA092B" wp14:editId="23EA21CF">
+                  <wp:anchor distT="0" distB="0" distL="114300" distR="114300" simplePos="0" relativeHeight="251658245" behindDoc="0" locked="0" layoutInCell="1" allowOverlap="1" wp14:anchorId="1889DA42" wp14:editId="50F7A151">
                     <wp:simplePos x="0" y="0"/>
                     <wp:positionH relativeFrom="column">
-                      <wp:posOffset>3336995</wp:posOffset>
+                      <wp:posOffset>-357372</wp:posOffset>
                     </wp:positionH>
                     <wp:positionV relativeFrom="paragraph">
-                      <wp:posOffset>111952</wp:posOffset>
+                      <wp:posOffset>6300190</wp:posOffset>
                     </wp:positionV>
-                    <wp:extent cx="2906965" cy="1481256"/>
+                    <wp:extent cx="2021125" cy="1250950"/>
                     <wp:effectExtent l="0" t="0" r="0" b="0"/>
                     <wp:wrapNone/>
-                    <wp:docPr id="346677769" name="Grafik 16"/>
+                    <wp:docPr id="989626486" name="Grafik 10" descr="Ein Bild, das Rad, Fahrzeug, Landfahrzeug, Sportwagen enthält.&#10;&#10;KI-generierte Inhalte können fehlerhaft sein."/>
                     <wp:cNvGraphicFramePr>
                       <a:graphicFrameLocks xmlns:a="http://schemas.openxmlformats.org/drawingml/2006/main" noChangeAspect="1"/>
                     </wp:cNvGraphicFramePr>
@@ -814,11 +776,11 @@
                       <a:graphicData uri="http://schemas.openxmlformats.org/drawingml/2006/picture">
                         <pic:pic xmlns:pic="http://schemas.openxmlformats.org/drawingml/2006/picture">
                           <pic:nvPicPr>
-                            <pic:cNvPr id="346677769" name="Grafik 346677769"/>
+                            <pic:cNvPr id="989626486" name="Grafik 10" descr="Ein Bild, das Rad, Fahrzeug, Landfahrzeug, Sportwagen enthält.&#10;&#10;KI-generierte Inhalte können fehlerhaft sein."/>
                             <pic:cNvPicPr/>
                           </pic:nvPicPr>
                           <pic:blipFill>
-                            <a:blip r:embed="rId11">
+                            <a:blip r:embed="rId11" cstate="print">
                               <a:extLst>
                                 <a:ext uri="{28A0092B-C50C-407E-A947-70E740481C1C}">
                                   <a14:useLocalDpi xmlns:a14="http://schemas.microsoft.com/office/drawing/2010/main" val="0"/>
@@ -832,7 +794,7 @@
                           <pic:spPr>
                             <a:xfrm>
                               <a:off x="0" y="0"/>
-                              <a:ext cx="2906965" cy="1481256"/>
+                              <a:ext cx="2021125" cy="1250950"/>
                             </a:xfrm>
                             <a:prstGeom prst="rect">
                               <a:avLst/>
@@ -857,13 +819,13 @@
                 <mc:AlternateContent>
                   <mc:Choice Requires="wps">
                     <w:drawing>
-                      <wp:anchor distT="0" distB="0" distL="114300" distR="114300" simplePos="0" relativeHeight="251661319" behindDoc="0" locked="0" layoutInCell="1" allowOverlap="1" wp14:anchorId="3E5119B9" wp14:editId="330FCF60">
+                      <wp:anchor distT="0" distB="0" distL="114300" distR="114300" simplePos="0" relativeHeight="251658246" behindDoc="0" locked="0" layoutInCell="1" allowOverlap="1" wp14:anchorId="3E5119B9" wp14:editId="12A77096">
                         <wp:simplePos x="0" y="0"/>
                         <wp:positionH relativeFrom="column">
-                          <wp:posOffset>132011</wp:posOffset>
+                          <wp:posOffset>131445</wp:posOffset>
                         </wp:positionH>
                         <wp:positionV relativeFrom="paragraph">
-                          <wp:posOffset>5565270</wp:posOffset>
+                          <wp:posOffset>5278061</wp:posOffset>
                         </wp:positionV>
                         <wp:extent cx="5606321" cy="839449"/>
                         <wp:effectExtent l="0" t="0" r="0" b="0"/>
@@ -972,7 +934,7 @@
                   </mc:Choice>
                   <mc:Fallback>
                     <w:pict>
-                      <v:shape w14:anchorId="3E5119B9" id="Textfeld 11" o:spid="_x0000_s1027" type="#_x0000_t202" style="position:absolute;left:0;text-align:left;margin-left:10.4pt;margin-top:438.2pt;width:441.45pt;height:66.1pt;z-index:251661319;visibility:visible;mso-wrap-style:square;mso-width-percent:0;mso-height-percent:0;mso-wrap-distance-left:9pt;mso-wrap-distance-top:0;mso-wrap-distance-right:9pt;mso-wrap-distance-bottom:0;mso-position-horizontal:absolute;mso-position-horizontal-relative:text;mso-position-vertical:absolute;mso-position-vertical-relative:text;mso-width-percent:0;mso-height-percent:0;mso-width-relative:margin;mso-height-relative:margin;v-text-anchor:middle" o:gfxdata="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" fillcolor="white [3201]" stroked="f" strokeweight=".5pt">
+                      <v:shape w14:anchorId="3E5119B9" id="Textfeld 11" o:spid="_x0000_s1027" type="#_x0000_t202" style="position:absolute;left:0;text-align:left;margin-left:10.35pt;margin-top:415.6pt;width:441.45pt;height:66.1pt;z-index:251658246;visibility:visible;mso-wrap-style:square;mso-width-percent:0;mso-height-percent:0;mso-wrap-distance-left:9pt;mso-wrap-distance-top:0;mso-wrap-distance-right:9pt;mso-wrap-distance-bottom:0;mso-position-horizontal:absolute;mso-position-horizontal-relative:text;mso-position-vertical:absolute;mso-position-vertical-relative:text;mso-width-percent:0;mso-height-percent:0;mso-width-relative:margin;mso-height-relative:margin;v-text-anchor:middle" o:gfxdata="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" fillcolor="white [3201]" stroked="f" strokeweight=".5pt">
                         <v:textbox>
                           <w:txbxContent>
                             <w:sdt>
@@ -1045,10 +1007,70 @@
                 <w:rPr>
                   <w:noProof/>
                 </w:rPr>
+                <w:drawing>
+                  <wp:anchor distT="0" distB="0" distL="114300" distR="114300" simplePos="0" relativeHeight="251658248" behindDoc="0" locked="0" layoutInCell="1" allowOverlap="1" wp14:anchorId="17FA092B" wp14:editId="525E5EE1">
+                    <wp:simplePos x="0" y="0"/>
+                    <wp:positionH relativeFrom="column">
+                      <wp:posOffset>3336995</wp:posOffset>
+                    </wp:positionH>
+                    <wp:positionV relativeFrom="paragraph">
+                      <wp:posOffset>111952</wp:posOffset>
+                    </wp:positionV>
+                    <wp:extent cx="2906965" cy="1481256"/>
+                    <wp:effectExtent l="0" t="0" r="0" b="0"/>
+                    <wp:wrapNone/>
+                    <wp:docPr id="346677769" name="Grafik 16"/>
+                    <wp:cNvGraphicFramePr>
+                      <a:graphicFrameLocks xmlns:a="http://schemas.openxmlformats.org/drawingml/2006/main" noChangeAspect="1"/>
+                    </wp:cNvGraphicFramePr>
+                    <a:graphic xmlns:a="http://schemas.openxmlformats.org/drawingml/2006/main">
+                      <a:graphicData uri="http://schemas.openxmlformats.org/drawingml/2006/picture">
+                        <pic:pic xmlns:pic="http://schemas.openxmlformats.org/drawingml/2006/picture">
+                          <pic:nvPicPr>
+                            <pic:cNvPr id="346677769" name="Grafik 346677769"/>
+                            <pic:cNvPicPr/>
+                          </pic:nvPicPr>
+                          <pic:blipFill>
+                            <a:blip r:embed="rId12">
+                              <a:extLst>
+                                <a:ext uri="{28A0092B-C50C-407E-A947-70E740481C1C}">
+                                  <a14:useLocalDpi xmlns:a14="http://schemas.microsoft.com/office/drawing/2010/main" val="0"/>
+                                </a:ext>
+                              </a:extLst>
+                            </a:blip>
+                            <a:stretch>
+                              <a:fillRect/>
+                            </a:stretch>
+                          </pic:blipFill>
+                          <pic:spPr>
+                            <a:xfrm>
+                              <a:off x="0" y="0"/>
+                              <a:ext cx="2906965" cy="1481256"/>
+                            </a:xfrm>
+                            <a:prstGeom prst="rect">
+                              <a:avLst/>
+                            </a:prstGeom>
+                          </pic:spPr>
+                        </pic:pic>
+                      </a:graphicData>
+                    </a:graphic>
+                    <wp14:sizeRelH relativeFrom="page">
+                      <wp14:pctWidth>0</wp14:pctWidth>
+                    </wp14:sizeRelH>
+                    <wp14:sizeRelV relativeFrom="page">
+                      <wp14:pctHeight>0</wp14:pctHeight>
+                    </wp14:sizeRelV>
+                  </wp:anchor>
+                </w:drawing>
+              </w:r>
+              <w:r>
+                <w:rPr>
+                  <w:noProof/>
+                </w:rPr>
                 <mc:AlternateContent>
                   <mc:Choice Requires="wps">
                     <w:drawing>
-                      <wp:anchor distT="0" distB="0" distL="114300" distR="114300" simplePos="0" relativeHeight="251658245" behindDoc="0" locked="0" layoutInCell="1" allowOverlap="1" wp14:anchorId="562EB3FE" wp14:editId="556C74B3">
+                      <wp:anchor distT="0" distB="0" distL="114300" distR="114300" simplePos="0" relativeHeight="251658242" behindDoc="0" locked="0" layoutInCell="1" allowOverlap="1" wp14:anchorId="562EB3FE" wp14:editId="2D39549E">
                         <wp:simplePos x="0" y="0"/>
                         <wp:positionH relativeFrom="column">
                           <wp:posOffset>-677586</wp:posOffset>
@@ -1141,7 +1163,7 @@
                   </mc:Choice>
                   <mc:Fallback>
                     <w:pict>
-                      <v:shape w14:anchorId="562EB3FE" id="Textfeld 1" o:spid="_x0000_s1028" type="#_x0000_t202" style="position:absolute;left:0;text-align:left;margin-left:-53.35pt;margin-top:139.05pt;width:560.2pt;height:139.2pt;z-index:251658245;visibility:visible;mso-wrap-style:square;mso-width-percent:0;mso-height-percent:0;mso-wrap-distance-left:9pt;mso-wrap-distance-top:0;mso-wrap-distance-right:9pt;mso-wrap-distance-bottom:0;mso-position-horizontal:absolute;mso-position-horizontal-relative:text;mso-position-vertical:absolute;mso-position-vertical-relative:text;mso-width-percent:0;mso-height-percent:0;mso-width-relative:margin;mso-height-relative:margin;v-text-anchor:top" o:gfxdata="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" fillcolor="white [3201]" stroked="f" strokeweight=".5pt">
+                      <v:shape w14:anchorId="562EB3FE" id="Textfeld 1" o:spid="_x0000_s1028" type="#_x0000_t202" style="position:absolute;left:0;text-align:left;margin-left:-53.35pt;margin-top:139.05pt;width:560.2pt;height:139.2pt;z-index:251658242;visibility:visible;mso-wrap-style:square;mso-width-percent:0;mso-height-percent:0;mso-wrap-distance-left:9pt;mso-wrap-distance-top:0;mso-wrap-distance-right:9pt;mso-wrap-distance-bottom:0;mso-position-horizontal:absolute;mso-position-horizontal-relative:text;mso-position-vertical:absolute;mso-position-vertical-relative:text;mso-width-percent:0;mso-height-percent:0;mso-width-relative:margin;mso-height-relative:margin;v-text-anchor:top" o:gfxdata="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" fillcolor="white [3201]" stroked="f" strokeweight=".5pt">
                         <v:textbox>
                           <w:txbxContent>
                             <w:p>
@@ -1192,70 +1214,10 @@
                 <w:rPr>
                   <w:noProof/>
                 </w:rPr>
-                <w:drawing>
-                  <wp:anchor distT="0" distB="0" distL="114300" distR="114300" simplePos="0" relativeHeight="251660295" behindDoc="0" locked="0" layoutInCell="1" allowOverlap="1" wp14:anchorId="1889DA42" wp14:editId="6C4FC19A">
-                    <wp:simplePos x="0" y="0"/>
-                    <wp:positionH relativeFrom="column">
-                      <wp:posOffset>-431800</wp:posOffset>
-                    </wp:positionH>
-                    <wp:positionV relativeFrom="paragraph">
-                      <wp:posOffset>6406515</wp:posOffset>
-                    </wp:positionV>
-                    <wp:extent cx="2021125" cy="1250950"/>
-                    <wp:effectExtent l="0" t="0" r="0" b="0"/>
-                    <wp:wrapNone/>
-                    <wp:docPr id="989626486" name="Grafik 10" descr="Ein Bild, das Rad, Fahrzeug, Landfahrzeug, Sportwagen enthält.&#10;&#10;KI-generierte Inhalte können fehlerhaft sein."/>
-                    <wp:cNvGraphicFramePr>
-                      <a:graphicFrameLocks xmlns:a="http://schemas.openxmlformats.org/drawingml/2006/main" noChangeAspect="1"/>
-                    </wp:cNvGraphicFramePr>
-                    <a:graphic xmlns:a="http://schemas.openxmlformats.org/drawingml/2006/main">
-                      <a:graphicData uri="http://schemas.openxmlformats.org/drawingml/2006/picture">
-                        <pic:pic xmlns:pic="http://schemas.openxmlformats.org/drawingml/2006/picture">
-                          <pic:nvPicPr>
-                            <pic:cNvPr id="989626486" name="Grafik 10" descr="Ein Bild, das Rad, Fahrzeug, Landfahrzeug, Sportwagen enthält.&#10;&#10;KI-generierte Inhalte können fehlerhaft sein."/>
-                            <pic:cNvPicPr/>
-                          </pic:nvPicPr>
-                          <pic:blipFill>
-                            <a:blip r:embed="rId12" cstate="print">
-                              <a:extLst>
-                                <a:ext uri="{28A0092B-C50C-407E-A947-70E740481C1C}">
-                                  <a14:useLocalDpi xmlns:a14="http://schemas.microsoft.com/office/drawing/2010/main" val="0"/>
-                                </a:ext>
-                              </a:extLst>
-                            </a:blip>
-                            <a:stretch>
-                              <a:fillRect/>
-                            </a:stretch>
-                          </pic:blipFill>
-                          <pic:spPr>
-                            <a:xfrm>
-                              <a:off x="0" y="0"/>
-                              <a:ext cx="2021125" cy="1250950"/>
-                            </a:xfrm>
-                            <a:prstGeom prst="rect">
-                              <a:avLst/>
-                            </a:prstGeom>
-                          </pic:spPr>
-                        </pic:pic>
-                      </a:graphicData>
-                    </a:graphic>
-                    <wp14:sizeRelH relativeFrom="page">
-                      <wp14:pctWidth>0</wp14:pctWidth>
-                    </wp14:sizeRelH>
-                    <wp14:sizeRelV relativeFrom="page">
-                      <wp14:pctHeight>0</wp14:pctHeight>
-                    </wp14:sizeRelV>
-                  </wp:anchor>
-                </w:drawing>
-              </w:r>
-              <w:r>
-                <w:rPr>
-                  <w:noProof/>
-                </w:rPr>
                 <mc:AlternateContent>
                   <mc:Choice Requires="wpg">
                     <w:drawing>
-                      <wp:anchor distT="0" distB="0" distL="114300" distR="114300" simplePos="0" relativeHeight="251658247" behindDoc="0" locked="0" layoutInCell="1" allowOverlap="1" wp14:anchorId="3ED48299" wp14:editId="747CCA15">
+                      <wp:anchor distT="0" distB="0" distL="114300" distR="114300" simplePos="0" relativeHeight="251658244" behindDoc="0" locked="0" layoutInCell="1" allowOverlap="1" wp14:anchorId="3ED48299" wp14:editId="747CCA15">
                         <wp:simplePos x="0" y="0"/>
                         <wp:positionH relativeFrom="page">
                           <wp:posOffset>228600</wp:posOffset>
@@ -1495,13 +1457,13 @@
                       </wp:anchor>
                     </w:drawing>
                   </mc:Choice>
-                  <mc:Fallback>
+                  <mc:Fallback xmlns:w16sdtfl="http://schemas.microsoft.com/office/word/2024/wordml/sdtformatlock" xmlns:w16du="http://schemas.microsoft.com/office/word/2023/wordml/word16du">
                     <w:pict>
-                      <v:group w14:anchorId="2A3B501F" id="Gruppe 149" o:spid="_x0000_s1026" style="position:absolute;margin-left:18pt;margin-top:620.6pt;width:8in;height:205.5pt;flip:x y;z-index:251658247;mso-width-percent:941;mso-position-horizontal-relative:page;mso-position-vertical-relative:page;mso-width-percent:941" coordorigin="" coordsize="73152,12161" o:gfxdata="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">
-                        <v:shape id="Rechteck 51" o:spid="_x0000_s1027" style="position:absolute;width:73152;height:11303;visibility:visible;mso-wrap-style:square;v-text-anchor:middle" coordsize="7312660,1129665" o:gfxdata="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" path="m,l7312660,r,1129665l3619500,733425,,1091565,,xe" fillcolor="#af0000" stroked="f" strokeweight="1pt">
+                      <v:group w14:anchorId="78300F58" id="Gruppe 149" o:spid="_x0000_s1026" style="position:absolute;margin-left:18pt;margin-top:620.6pt;width:8in;height:205.5pt;flip:x y;z-index:251658247;mso-width-percent:941;mso-position-horizontal-relative:page;mso-position-vertical-relative:page;mso-width-percent:941" coordorigin="" coordsize="73152,12161" o:gfxdata="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">
+                        <v:shape id="Rechteck 51" o:spid="_x0000_s1027" style="position:absolute;width:73152;height:11303;visibility:visible;mso-wrap-style:square;v-text-anchor:middle" coordsize="7312660,1129665" o:gfxdata="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" path="m,l7312660,r,1129665l3619500,733425,,1091565,,xe" fillcolor="#af0000" stroked="f" strokeweight="1pt">
                           <v:path arrowok="t" o:connecttype="custom" o:connectlocs="0,0;7315200,0;7315200,1130373;3620757,733885;0,1092249;0,0" o:connectangles="0,0,0,0,0,0"/>
                         </v:shape>
-                        <v:rect id="Rechteck 1043210579" o:spid="_x0000_s1028" style="position:absolute;width:73152;height:12161;visibility:visible;mso-wrap-style:square;v-text-anchor:middle" o:gfxdata="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" stroked="f" strokeweight="1pt">
+                        <v:rect id="Rechteck 1043210579" o:spid="_x0000_s1028" style="position:absolute;width:73152;height:12161;visibility:visible;mso-wrap-style:square;v-text-anchor:middle" o:gfxdata="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" stroked="f" strokeweight="1pt">
                           <v:fill r:id="rId10" o:title="" recolor="t" rotate="t" type="frame"/>
                         </v:rect>
                         <w10:wrap anchorx="page" anchory="page"/>
@@ -1587,13 +1549,14 @@
             </w:rPr>
             <w:fldChar w:fldCharType="separate"/>
           </w:r>
-          <w:hyperlink w:anchor="_Toc215650435" w:history="1">
+          <w:hyperlink w:anchor="_Toc216338482" w:history="1">
             <w:r>
               <w:rPr>
                 <w:rStyle w:val="Hyperlink"/>
                 <w:noProof/>
-              </w:rPr>
-              <w:t>User Stories</w:t>
+                <w:lang w:val="de-DE"/>
+              </w:rPr>
+              <w:t>Einleitung</w:t>
             </w:r>
             <w:r>
               <w:rPr>
@@ -1614,7 +1577,7 @@
                 <w:noProof/>
                 <w:webHidden/>
               </w:rPr>
-              <w:instrText xml:space="preserve"> PAGEREF _Toc215650435 \h </w:instrText>
+              <w:instrText xml:space="preserve"> PAGEREF _Toc216338482 \h </w:instrText>
             </w:r>
             <w:r>
               <w:rPr>
@@ -1635,81 +1598,6 @@
                 <w:webHidden/>
               </w:rPr>
               <w:t>2</w:t>
-            </w:r>
-            <w:r>
-              <w:rPr>
-                <w:noProof/>
-                <w:webHidden/>
-              </w:rPr>
-              <w:fldChar w:fldCharType="end"/>
-            </w:r>
-          </w:hyperlink>
-        </w:p>
-        <w:p>
-          <w:pPr>
-            <w:pStyle w:val="Verzeichnis2"/>
-            <w:tabs>
-              <w:tab w:val="right" w:leader="dot" w:pos="9016"/>
-            </w:tabs>
-            <w:rPr>
-              <w:smallCaps w:val="0"/>
-              <w:noProof/>
-              <w:kern w:val="2"/>
-              <w:sz w:val="24"/>
-              <w:szCs w:val="24"/>
-              <w:lang w:val="de-DE" w:eastAsia="de-DE"/>
-              <w14:ligatures w14:val="standardContextual"/>
-            </w:rPr>
-          </w:pPr>
-          <w:hyperlink w:anchor="_Toc215650436" w:history="1">
-            <w:r>
-              <w:rPr>
-                <w:rStyle w:val="Hyperlink"/>
-                <w:noProof/>
-                <w:lang w:val="de-DE"/>
-              </w:rPr>
-              <w:t>User Cards</w:t>
-            </w:r>
-            <w:r>
-              <w:rPr>
-                <w:noProof/>
-                <w:webHidden/>
-              </w:rPr>
-              <w:tab/>
-            </w:r>
-            <w:r>
-              <w:rPr>
-                <w:noProof/>
-                <w:webHidden/>
-              </w:rPr>
-              <w:fldChar w:fldCharType="begin"/>
-            </w:r>
-            <w:r>
-              <w:rPr>
-                <w:noProof/>
-                <w:webHidden/>
-              </w:rPr>
-              <w:instrText xml:space="preserve"> PAGEREF _Toc215650436 \h </w:instrText>
-            </w:r>
-            <w:r>
-              <w:rPr>
-                <w:noProof/>
-                <w:webHidden/>
-              </w:rPr>
-            </w:r>
-            <w:r>
-              <w:rPr>
-                <w:noProof/>
-                <w:webHidden/>
-              </w:rPr>
-              <w:fldChar w:fldCharType="separate"/>
-            </w:r>
-            <w:r>
-              <w:rPr>
-                <w:noProof/>
-                <w:webHidden/>
-              </w:rPr>
-              <w:t>4</w:t>
             </w:r>
             <w:r>
               <w:rPr>
@@ -1738,14 +1626,13 @@
               <w14:ligatures w14:val="standardContextual"/>
             </w:rPr>
           </w:pPr>
-          <w:hyperlink w:anchor="_Toc215650437" w:history="1">
+          <w:hyperlink w:anchor="_Toc216338483" w:history="1">
             <w:r>
               <w:rPr>
                 <w:rStyle w:val="Hyperlink"/>
                 <w:noProof/>
-                <w:lang w:val="de-DE"/>
-              </w:rPr>
-              <w:t>Anforderungsanalyse abgeleitet aus den User Cards / User Stories</w:t>
+              </w:rPr>
+              <w:t>User Stories</w:t>
             </w:r>
             <w:r>
               <w:rPr>
@@ -1766,7 +1653,7 @@
                 <w:noProof/>
                 <w:webHidden/>
               </w:rPr>
-              <w:instrText xml:space="preserve"> PAGEREF _Toc215650437 \h </w:instrText>
+              <w:instrText xml:space="preserve"> PAGEREF _Toc216338483 \h </w:instrText>
             </w:r>
             <w:r>
               <w:rPr>
@@ -1786,7 +1673,7 @@
                 <w:noProof/>
                 <w:webHidden/>
               </w:rPr>
-              <w:t>6</w:t>
+              <w:t>3</w:t>
             </w:r>
             <w:r>
               <w:rPr>
@@ -1813,14 +1700,14 @@
               <w14:ligatures w14:val="standardContextual"/>
             </w:rPr>
           </w:pPr>
-          <w:hyperlink w:anchor="_Toc215650438" w:history="1">
+          <w:hyperlink w:anchor="_Toc216338484" w:history="1">
             <w:r>
               <w:rPr>
                 <w:rStyle w:val="Hyperlink"/>
                 <w:noProof/>
                 <w:lang w:val="de-DE"/>
               </w:rPr>
-              <w:t>Vereinbarungen zur Umsetzung</w:t>
+              <w:t>User Cards</w:t>
             </w:r>
             <w:r>
               <w:rPr>
@@ -1841,7 +1728,7 @@
                 <w:noProof/>
                 <w:webHidden/>
               </w:rPr>
-              <w:instrText xml:space="preserve"> PAGEREF _Toc215650438 \h </w:instrText>
+              <w:instrText xml:space="preserve"> PAGEREF _Toc216338484 \h </w:instrText>
             </w:r>
             <w:r>
               <w:rPr>
@@ -1861,7 +1748,7 @@
                 <w:noProof/>
                 <w:webHidden/>
               </w:rPr>
-              <w:t>7</w:t>
+              <w:t>6</w:t>
             </w:r>
             <w:r>
               <w:rPr>
@@ -1890,14 +1777,14 @@
               <w14:ligatures w14:val="standardContextual"/>
             </w:rPr>
           </w:pPr>
-          <w:hyperlink w:anchor="_Toc215650439" w:history="1">
+          <w:hyperlink w:anchor="_Toc216338485" w:history="1">
             <w:r>
               <w:rPr>
                 <w:rStyle w:val="Hyperlink"/>
                 <w:noProof/>
                 <w:lang w:val="de-DE"/>
               </w:rPr>
-              <w:t>Entwurf</w:t>
+              <w:t>Anforderungsanalyse abgeleitet aus den User Stories</w:t>
             </w:r>
             <w:r>
               <w:rPr>
@@ -1918,7 +1805,7 @@
                 <w:noProof/>
                 <w:webHidden/>
               </w:rPr>
-              <w:instrText xml:space="preserve"> PAGEREF _Toc215650439 \h </w:instrText>
+              <w:instrText xml:space="preserve"> PAGEREF _Toc216338485 \h </w:instrText>
             </w:r>
             <w:r>
               <w:rPr>
@@ -1938,7 +1825,7 @@
                 <w:noProof/>
                 <w:webHidden/>
               </w:rPr>
-              <w:t>0</w:t>
+              <w:t>9</w:t>
             </w:r>
             <w:r>
               <w:rPr>
@@ -1965,14 +1852,14 @@
               <w14:ligatures w14:val="standardContextual"/>
             </w:rPr>
           </w:pPr>
-          <w:hyperlink w:anchor="_Toc215650440" w:history="1">
+          <w:hyperlink w:anchor="_Toc216338486" w:history="1">
             <w:r>
               <w:rPr>
                 <w:rStyle w:val="Hyperlink"/>
                 <w:noProof/>
                 <w:lang w:val="de-DE"/>
               </w:rPr>
-              <w:t>Entwurf der Hardwarekomponenten am Auto</w:t>
+              <w:t>Vereinbarungen zur Umsetzung</w:t>
             </w:r>
             <w:r>
               <w:rPr>
@@ -1993,7 +1880,84 @@
                 <w:noProof/>
                 <w:webHidden/>
               </w:rPr>
-              <w:instrText xml:space="preserve"> PAGEREF _Toc215650440 \h </w:instrText>
+              <w:instrText xml:space="preserve"> PAGEREF _Toc216338486 \h </w:instrText>
+            </w:r>
+            <w:r>
+              <w:rPr>
+                <w:noProof/>
+                <w:webHidden/>
+              </w:rPr>
+            </w:r>
+            <w:r>
+              <w:rPr>
+                <w:noProof/>
+                <w:webHidden/>
+              </w:rPr>
+              <w:fldChar w:fldCharType="separate"/>
+            </w:r>
+            <w:r>
+              <w:rPr>
+                <w:noProof/>
+                <w:webHidden/>
+              </w:rPr>
+              <w:t>10</w:t>
+            </w:r>
+            <w:r>
+              <w:rPr>
+                <w:noProof/>
+                <w:webHidden/>
+              </w:rPr>
+              <w:fldChar w:fldCharType="end"/>
+            </w:r>
+          </w:hyperlink>
+        </w:p>
+        <w:p>
+          <w:pPr>
+            <w:pStyle w:val="Verzeichnis1"/>
+            <w:tabs>
+              <w:tab w:val="right" w:leader="dot" w:pos="9016"/>
+            </w:tabs>
+            <w:rPr>
+              <w:b w:val="0"/>
+              <w:bCs w:val="0"/>
+              <w:caps w:val="0"/>
+              <w:noProof/>
+              <w:kern w:val="2"/>
+              <w:sz w:val="24"/>
+              <w:szCs w:val="24"/>
+              <w:lang w:val="de-DE" w:eastAsia="de-DE"/>
+              <w14:ligatures w14:val="standardContextual"/>
+            </w:rPr>
+          </w:pPr>
+          <w:hyperlink w:anchor="_Toc216338487" w:history="1">
+            <w:r>
+              <w:rPr>
+                <w:rStyle w:val="Hyperlink"/>
+                <w:noProof/>
+                <w:lang w:val="de-DE"/>
+              </w:rPr>
+              <w:t>Entwurf</w:t>
+            </w:r>
+            <w:r>
+              <w:rPr>
+                <w:noProof/>
+                <w:webHidden/>
+              </w:rPr>
+              <w:tab/>
+            </w:r>
+            <w:r>
+              <w:rPr>
+                <w:noProof/>
+                <w:webHidden/>
+              </w:rPr>
+              <w:fldChar w:fldCharType="begin"/>
+            </w:r>
+            <w:r>
+              <w:rPr>
+                <w:noProof/>
+                <w:webHidden/>
+              </w:rPr>
+              <w:instrText xml:space="preserve"> PAGEREF _Toc216338487 \h </w:instrText>
             </w:r>
             <w:r>
               <w:rPr>
@@ -2040,13 +2004,88 @@
               <w14:ligatures w14:val="standardContextual"/>
             </w:rPr>
           </w:pPr>
-          <w:hyperlink w:anchor="_Toc215650441" w:history="1">
+          <w:hyperlink w:anchor="_Toc216338488" w:history="1">
             <w:r>
               <w:rPr>
                 <w:rStyle w:val="Hyperlink"/>
                 <w:noProof/>
                 <w:lang w:val="de-DE"/>
               </w:rPr>
+              <w:t>Entwurf der Hardwarekomponenten am Auto</w:t>
+            </w:r>
+            <w:r>
+              <w:rPr>
+                <w:noProof/>
+                <w:webHidden/>
+              </w:rPr>
+              <w:tab/>
+            </w:r>
+            <w:r>
+              <w:rPr>
+                <w:noProof/>
+                <w:webHidden/>
+              </w:rPr>
+              <w:fldChar w:fldCharType="begin"/>
+            </w:r>
+            <w:r>
+              <w:rPr>
+                <w:noProof/>
+                <w:webHidden/>
+              </w:rPr>
+              <w:instrText xml:space="preserve"> PAGEREF _Toc216338488 \h </w:instrText>
+            </w:r>
+            <w:r>
+              <w:rPr>
+                <w:noProof/>
+                <w:webHidden/>
+              </w:rPr>
+            </w:r>
+            <w:r>
+              <w:rPr>
+                <w:noProof/>
+                <w:webHidden/>
+              </w:rPr>
+              <w:fldChar w:fldCharType="separate"/>
+            </w:r>
+            <w:r>
+              <w:rPr>
+                <w:noProof/>
+                <w:webHidden/>
+              </w:rPr>
+              <w:t>0</w:t>
+            </w:r>
+            <w:r>
+              <w:rPr>
+                <w:noProof/>
+                <w:webHidden/>
+              </w:rPr>
+              <w:fldChar w:fldCharType="end"/>
+            </w:r>
+          </w:hyperlink>
+        </w:p>
+        <w:p>
+          <w:pPr>
+            <w:pStyle w:val="Verzeichnis2"/>
+            <w:tabs>
+              <w:tab w:val="right" w:leader="dot" w:pos="9016"/>
+            </w:tabs>
+            <w:rPr>
+              <w:smallCaps w:val="0"/>
+              <w:noProof/>
+              <w:kern w:val="2"/>
+              <w:sz w:val="24"/>
+              <w:szCs w:val="24"/>
+              <w:lang w:val="de-DE" w:eastAsia="de-DE"/>
+              <w14:ligatures w14:val="standardContextual"/>
+            </w:rPr>
+          </w:pPr>
+          <w:hyperlink w:anchor="_Toc216338489" w:history="1">
+            <w:r>
+              <w:rPr>
+                <w:rStyle w:val="Hyperlink"/>
+                <w:noProof/>
+                <w:lang w:val="de-DE"/>
+              </w:rPr>
               <w:t>Entwurf des Benutzerinterfaces für die Applikation</w:t>
             </w:r>
             <w:r>
@@ -2068,7 +2107,7 @@
                 <w:noProof/>
                 <w:webHidden/>
               </w:rPr>
-              <w:instrText xml:space="preserve"> PAGEREF _Toc215650441 \h </w:instrText>
+              <w:instrText xml:space="preserve"> PAGEREF _Toc216338489 \h </w:instrText>
             </w:r>
             <w:r>
               <w:rPr>
@@ -2116,7 +2155,7 @@
               <w14:ligatures w14:val="standardContextual"/>
             </w:rPr>
           </w:pPr>
-          <w:hyperlink w:anchor="_Toc215650442" w:history="1">
+          <w:hyperlink w:anchor="_Toc216338490" w:history="1">
             <w:r>
               <w:rPr>
                 <w:rStyle w:val="Hyperlink"/>
@@ -2144,7 +2183,7 @@
                 <w:noProof/>
                 <w:webHidden/>
               </w:rPr>
-              <w:instrText xml:space="preserve"> PAGEREF _Toc215650442 \h </w:instrText>
+              <w:instrText xml:space="preserve"> PAGEREF _Toc216338490 \h </w:instrText>
             </w:r>
             <w:r>
               <w:rPr>
@@ -2192,7 +2231,7 @@
               <w14:ligatures w14:val="standardContextual"/>
             </w:rPr>
           </w:pPr>
-          <w:hyperlink w:anchor="_Toc215650443" w:history="1">
+          <w:hyperlink w:anchor="_Toc216338491" w:history="1">
             <w:r>
               <w:rPr>
                 <w:rStyle w:val="Hyperlink"/>
@@ -2220,7 +2259,7 @@
                 <w:noProof/>
                 <w:webHidden/>
               </w:rPr>
-              <w:instrText xml:space="preserve"> PAGEREF _Toc215650443 \h </w:instrText>
+              <w:instrText xml:space="preserve"> PAGEREF _Toc216338491 \h </w:instrText>
             </w:r>
             <w:r>
               <w:rPr>
@@ -2268,7 +2307,7 @@
               <w14:ligatures w14:val="standardContextual"/>
             </w:rPr>
           </w:pPr>
-          <w:hyperlink w:anchor="_Toc215650444" w:history="1">
+          <w:hyperlink w:anchor="_Toc216338492" w:history="1">
             <w:r>
               <w:rPr>
                 <w:rStyle w:val="Hyperlink"/>
@@ -2296,7 +2335,7 @@
                 <w:noProof/>
                 <w:webHidden/>
               </w:rPr>
-              <w:instrText xml:space="preserve"> PAGEREF _Toc215650444 \h </w:instrText>
+              <w:instrText xml:space="preserve"> PAGEREF _Toc216338492 \h </w:instrText>
             </w:r>
             <w:r>
               <w:rPr>
@@ -2344,7 +2383,7 @@
               <w14:ligatures w14:val="standardContextual"/>
             </w:rPr>
           </w:pPr>
-          <w:hyperlink w:anchor="_Toc215650445" w:history="1">
+          <w:hyperlink w:anchor="_Toc216338493" w:history="1">
             <w:r>
               <w:rPr>
                 <w:rStyle w:val="Hyperlink"/>
@@ -2372,7 +2411,7 @@
                 <w:noProof/>
                 <w:webHidden/>
               </w:rPr>
-              <w:instrText xml:space="preserve"> PAGEREF _Toc215650445 \h </w:instrText>
+              <w:instrText xml:space="preserve"> PAGEREF _Toc216338493 \h </w:instrText>
             </w:r>
             <w:r>
               <w:rPr>
@@ -2420,7 +2459,7 @@
               <w14:ligatures w14:val="standardContextual"/>
             </w:rPr>
           </w:pPr>
-          <w:hyperlink w:anchor="_Toc215650446" w:history="1">
+          <w:hyperlink w:anchor="_Toc216338494" w:history="1">
             <w:r>
               <w:rPr>
                 <w:rStyle w:val="Hyperlink"/>
@@ -2448,7 +2487,7 @@
                 <w:noProof/>
                 <w:webHidden/>
               </w:rPr>
-              <w:instrText xml:space="preserve"> PAGEREF _Toc215650446 \h </w:instrText>
+              <w:instrText xml:space="preserve"> PAGEREF _Toc216338494 \h </w:instrText>
             </w:r>
             <w:r>
               <w:rPr>
@@ -2507,17 +2546,1090 @@
     <w:p>
       <w:pPr>
         <w:pStyle w:val="berschrift1"/>
-      </w:pPr>
-      <w:bookmarkStart w:id="0" w:name="_Toc215650435"/>
+        <w:rPr>
+          <w:lang w:val="de-DE"/>
+        </w:rPr>
+      </w:pPr>
+      <w:bookmarkStart w:id="0" w:name="_Toc216338482"/>
+      <w:r>
+        <w:rPr>
+          <w:lang w:val="de-DE"/>
+        </w:rPr>
+        <w:lastRenderedPageBreak/>
+        <w:t>Einleitung</w:t>
+      </w:r>
+      <w:bookmarkEnd w:id="0"/>
+      <w:r>
+        <w:rPr>
+          <w:lang w:val="de-DE"/>
+        </w:rPr>
+        <w:t xml:space="preserve"> </w:t>
+      </w:r>
+    </w:p>
+    <w:p>
+      <w:pPr>
+        <w:spacing w:before="100" w:beforeAutospacing="1" w:after="100" w:afterAutospacing="1" w:line="300" w:lineRule="atLeast"/>
+        <w:ind w:firstLine="0"/>
+        <w:jc w:val="both"/>
+        <w:rPr>
+          <w:rFonts w:eastAsia="Times New Roman" w:cs="Segoe UI"/>
+          <w:lang w:val="de-DE" w:eastAsia="de-DE"/>
+        </w:rPr>
+      </w:pPr>
+      <w:r>
+        <w:rPr>
+          <w:rFonts w:eastAsia="Times New Roman" w:cs="Segoe UI"/>
+          <w:lang w:val="de-DE" w:eastAsia="de-DE"/>
+        </w:rPr>
+        <w:t xml:space="preserve">Dieses Dokument dient als umfassende Dokumentation für das Software-Engineering-Projekt R.E.D. – Real-time Environment Driver, </w:t>
+      </w:r>
+      <w:r>
+        <w:rPr>
+          <w:rFonts w:eastAsia="Times New Roman" w:cs="Segoe UI"/>
+          <w:lang w:val="de-DE" w:eastAsia="de-DE"/>
+        </w:rPr>
+        <w:t>welches</w:t>
+      </w:r>
+      <w:r>
+        <w:rPr>
+          <w:rFonts w:eastAsia="Times New Roman" w:cs="Segoe UI"/>
+          <w:lang w:val="de-DE" w:eastAsia="de-DE"/>
+        </w:rPr>
+        <w:t xml:space="preserve"> im Rahmen des Kurses TINF24CS2 an der Hochschule </w:t>
+      </w:r>
+      <w:r>
+        <w:rPr>
+          <w:rFonts w:eastAsia="Times New Roman" w:cs="Segoe UI"/>
+          <w:lang w:val="de-DE" w:eastAsia="de-DE"/>
+        </w:rPr>
+        <w:t xml:space="preserve">DHBW Mannheim </w:t>
+      </w:r>
+      <w:r>
+        <w:rPr>
+          <w:rFonts w:eastAsia="Times New Roman" w:cs="Segoe UI"/>
+          <w:lang w:val="de-DE" w:eastAsia="de-DE"/>
+        </w:rPr>
+        <w:t xml:space="preserve">durchgeführt wird. Ziel des Projekts ist die Entwicklung eines interaktiven Fahrerlebnisses, bei dem Nutzer ein </w:t>
+      </w:r>
+      <w:r>
+        <w:rPr>
+          <w:rFonts w:eastAsia="Times New Roman" w:cs="Segoe UI"/>
+          <w:lang w:val="de-DE" w:eastAsia="de-DE"/>
+        </w:rPr>
+        <w:t xml:space="preserve">kleines </w:t>
+      </w:r>
+      <w:r>
+        <w:rPr>
+          <w:rFonts w:eastAsia="Times New Roman" w:cs="Segoe UI"/>
+          <w:lang w:val="de-DE" w:eastAsia="de-DE"/>
+        </w:rPr>
+        <w:t xml:space="preserve">Fahrzeug über eine mobile Applikation steuern </w:t>
+      </w:r>
+      <w:r>
+        <w:rPr>
+          <w:rFonts w:eastAsia="Times New Roman" w:cs="Segoe UI"/>
+          <w:lang w:val="de-DE" w:eastAsia="de-DE"/>
+        </w:rPr>
+        <w:t>k</w:t>
+      </w:r>
+      <w:r>
+        <w:rPr>
+          <w:rFonts w:eastAsia="Times New Roman" w:cs="Segoe UI"/>
+          <w:lang w:val="de-DE" w:eastAsia="de-DE"/>
+        </w:rPr>
+        <w:t>önnen</w:t>
+      </w:r>
+      <w:r>
+        <w:rPr>
+          <w:rFonts w:eastAsia="Times New Roman" w:cs="Segoe UI"/>
+          <w:lang w:val="de-DE" w:eastAsia="de-DE"/>
+        </w:rPr>
+        <w:t xml:space="preserve"> und außerdem in der Lage </w:t>
+      </w:r>
+      <w:r>
+        <w:rPr>
+          <w:rFonts w:eastAsia="Times New Roman" w:cs="Segoe UI"/>
+          <w:lang w:val="de-DE" w:eastAsia="de-DE"/>
+        </w:rPr>
+        <w:t>sind,</w:t>
+      </w:r>
+      <w:r>
+        <w:rPr>
+          <w:rFonts w:eastAsia="Times New Roman" w:cs="Segoe UI"/>
+          <w:lang w:val="de-DE" w:eastAsia="de-DE"/>
+        </w:rPr>
+        <w:t xml:space="preserve"> es autonom </w:t>
+      </w:r>
+      <w:r>
+        <w:rPr>
+          <w:rFonts w:eastAsia="Times New Roman" w:cs="Segoe UI"/>
+          <w:lang w:val="de-DE" w:eastAsia="de-DE"/>
+        </w:rPr>
+        <w:t>fahren</w:t>
+      </w:r>
+      <w:r>
+        <w:rPr>
+          <w:rFonts w:eastAsia="Times New Roman" w:cs="Segoe UI"/>
+          <w:lang w:val="de-DE" w:eastAsia="de-DE"/>
+        </w:rPr>
+        <w:t xml:space="preserve"> </w:t>
+      </w:r>
+      <w:r>
+        <w:rPr>
+          <w:rFonts w:eastAsia="Times New Roman" w:cs="Segoe UI"/>
+          <w:lang w:val="de-DE" w:eastAsia="de-DE"/>
+        </w:rPr>
+        <w:t xml:space="preserve">zu </w:t>
+      </w:r>
+      <w:r>
+        <w:rPr>
+          <w:rFonts w:eastAsia="Times New Roman" w:cs="Segoe UI"/>
+          <w:lang w:val="de-DE" w:eastAsia="de-DE"/>
+        </w:rPr>
+        <w:t xml:space="preserve">lassen. </w:t>
+      </w:r>
+    </w:p>
+    <w:p>
+      <w:pPr>
+        <w:spacing w:before="100" w:beforeAutospacing="1" w:after="100" w:afterAutospacing="1" w:line="300" w:lineRule="atLeast"/>
+        <w:ind w:firstLine="0"/>
+        <w:jc w:val="both"/>
+        <w:rPr>
+          <w:rFonts w:eastAsia="Times New Roman" w:cs="Segoe UI"/>
+          <w:lang w:val="de-DE" w:eastAsia="de-DE"/>
+        </w:rPr>
+      </w:pPr>
+      <w:r>
+        <w:rPr>
+          <w:rFonts w:eastAsia="Times New Roman" w:cs="Segoe UI"/>
+          <w:lang w:val="de-DE" w:eastAsia="de-DE"/>
+        </w:rPr>
+        <w:t xml:space="preserve">Das Dokument ergänzt das auf dem Deckblatt dargestellte Exposé und geht über die </w:t>
+      </w:r>
+      <w:r>
+        <w:rPr>
+          <w:rFonts w:eastAsia="Times New Roman" w:cs="Segoe UI"/>
+          <w:lang w:val="de-DE" w:eastAsia="de-DE"/>
+        </w:rPr>
+        <w:t xml:space="preserve">dort dargestellte </w:t>
+      </w:r>
+      <w:r>
+        <w:rPr>
+          <w:rFonts w:eastAsia="Times New Roman" w:cs="Segoe UI"/>
+          <w:lang w:val="de-DE" w:eastAsia="de-DE"/>
+        </w:rPr>
+        <w:t xml:space="preserve">reine Vision hinaus, indem es die detaillierte Ausarbeitung der Projektinhalte </w:t>
+      </w:r>
+      <w:r>
+        <w:rPr>
+          <w:rFonts w:eastAsia="Times New Roman" w:cs="Segoe UI"/>
+          <w:lang w:val="de-DE" w:eastAsia="de-DE"/>
+        </w:rPr>
+        <w:t xml:space="preserve">und insbesondere der Vorgehensweise der Gruppe </w:t>
+      </w:r>
+      <w:r>
+        <w:rPr>
+          <w:rFonts w:eastAsia="Times New Roman" w:cs="Segoe UI"/>
+          <w:lang w:val="de-DE" w:eastAsia="de-DE"/>
+        </w:rPr>
+        <w:t>darstellt. Es enthält:</w:t>
+      </w:r>
+    </w:p>
+    <w:p>
+      <w:pPr>
+        <w:numPr>
+          <w:ilvl w:val="0"/>
+          <w:numId w:val="9"/>
+        </w:numPr>
+        <w:spacing w:before="100" w:beforeAutospacing="1" w:after="100" w:afterAutospacing="1" w:line="300" w:lineRule="atLeast"/>
+        <w:jc w:val="both"/>
+        <w:rPr>
+          <w:rFonts w:eastAsia="Times New Roman" w:cs="Segoe UI"/>
+          <w:lang w:val="de-DE" w:eastAsia="de-DE"/>
+        </w:rPr>
+      </w:pPr>
+      <w:r>
+        <w:rPr>
+          <w:rFonts w:eastAsia="Times New Roman" w:cs="Segoe UI"/>
+          <w:lang w:val="de-DE" w:eastAsia="de-DE"/>
+        </w:rPr>
+        <w:t>User Stories und User Cards, die die Grundlage für die funktionalen Anforderungen bilden</w:t>
+      </w:r>
+      <w:r>
+        <w:rPr>
+          <w:rFonts w:eastAsia="Times New Roman" w:cs="Segoe UI"/>
+          <w:lang w:val="de-DE" w:eastAsia="de-DE"/>
+        </w:rPr>
+        <w:t>.</w:t>
+      </w:r>
+    </w:p>
+    <w:p>
+      <w:pPr>
+        <w:numPr>
+          <w:ilvl w:val="0"/>
+          <w:numId w:val="9"/>
+        </w:numPr>
+        <w:spacing w:before="100" w:beforeAutospacing="1" w:after="100" w:afterAutospacing="1" w:line="300" w:lineRule="atLeast"/>
+        <w:jc w:val="both"/>
+        <w:rPr>
+          <w:rFonts w:eastAsia="Times New Roman" w:cs="Segoe UI"/>
+          <w:lang w:val="de-DE" w:eastAsia="de-DE"/>
+        </w:rPr>
+      </w:pPr>
+      <w:r>
+        <w:rPr>
+          <w:rFonts w:eastAsia="Times New Roman" w:cs="Segoe UI"/>
+          <w:lang w:val="de-DE" w:eastAsia="de-DE"/>
+        </w:rPr>
+        <w:t xml:space="preserve">eine Anforderungsanalyse, die aus diesen User Stories </w:t>
+      </w:r>
+      <w:r>
+        <w:rPr>
+          <w:rFonts w:eastAsia="Times New Roman" w:cs="Segoe UI"/>
+          <w:lang w:val="de-DE" w:eastAsia="de-DE"/>
+        </w:rPr>
+        <w:t xml:space="preserve">und User Cards </w:t>
+      </w:r>
+      <w:r>
+        <w:rPr>
+          <w:rFonts w:eastAsia="Times New Roman" w:cs="Segoe UI"/>
+          <w:lang w:val="de-DE" w:eastAsia="de-DE"/>
+        </w:rPr>
+        <w:t>abgeleitet wurde und die Systemfunktionen strukturiert beschreibt</w:t>
+      </w:r>
+      <w:r>
+        <w:rPr>
+          <w:rFonts w:eastAsia="Times New Roman" w:cs="Segoe UI"/>
+          <w:lang w:val="de-DE" w:eastAsia="de-DE"/>
+        </w:rPr>
+        <w:t>.</w:t>
+      </w:r>
+    </w:p>
+    <w:p>
+      <w:pPr>
+        <w:numPr>
+          <w:ilvl w:val="0"/>
+          <w:numId w:val="9"/>
+        </w:numPr>
+        <w:spacing w:before="100" w:beforeAutospacing="1" w:after="100" w:afterAutospacing="1" w:line="300" w:lineRule="atLeast"/>
+        <w:jc w:val="both"/>
+        <w:rPr>
+          <w:rFonts w:eastAsia="Times New Roman" w:cs="Segoe UI"/>
+          <w:lang w:val="de-DE" w:eastAsia="de-DE"/>
+        </w:rPr>
+      </w:pPr>
+      <w:r>
+        <w:rPr>
+          <w:rFonts w:eastAsia="Times New Roman" w:cs="Segoe UI"/>
+          <w:lang w:val="de-DE" w:eastAsia="de-DE"/>
+        </w:rPr>
+        <w:t>Entwürfe für die Benutzeroberfläche (UI), die die Interaktion mit dem System visualisieren</w:t>
+      </w:r>
+      <w:r>
+        <w:rPr>
+          <w:rFonts w:eastAsia="Times New Roman" w:cs="Segoe UI"/>
+          <w:lang w:val="de-DE" w:eastAsia="de-DE"/>
+        </w:rPr>
+        <w:t>.</w:t>
+      </w:r>
+    </w:p>
+    <w:p>
+      <w:pPr>
+        <w:numPr>
+          <w:ilvl w:val="0"/>
+          <w:numId w:val="9"/>
+        </w:numPr>
+        <w:spacing w:before="100" w:beforeAutospacing="1" w:after="100" w:afterAutospacing="1" w:line="300" w:lineRule="atLeast"/>
+        <w:jc w:val="both"/>
+        <w:rPr>
+          <w:rFonts w:eastAsia="Times New Roman" w:cs="Segoe UI"/>
+          <w:lang w:val="de-DE" w:eastAsia="de-DE"/>
+        </w:rPr>
+      </w:pPr>
+      <w:r>
+        <w:rPr>
+          <w:rFonts w:eastAsia="Times New Roman" w:cs="Segoe UI"/>
+          <w:lang w:val="de-DE" w:eastAsia="de-DE"/>
+        </w:rPr>
+        <w:t>die Hardwarekomponenten, die für die Umsetzung der Steuerung und Sensorintegration erforderlich sind.</w:t>
+      </w:r>
+    </w:p>
+    <w:p>
+      <w:pPr>
+        <w:numPr>
+          <w:ilvl w:val="0"/>
+          <w:numId w:val="9"/>
+        </w:numPr>
+        <w:spacing w:before="100" w:beforeAutospacing="1" w:after="100" w:afterAutospacing="1" w:line="300" w:lineRule="atLeast"/>
+        <w:jc w:val="both"/>
+        <w:rPr>
+          <w:rFonts w:eastAsia="Times New Roman" w:cs="Segoe UI"/>
+          <w:lang w:val="de-DE" w:eastAsia="de-DE"/>
+        </w:rPr>
+      </w:pPr>
+      <w:r>
+        <w:rPr>
+          <w:rFonts w:eastAsia="Times New Roman" w:cs="Segoe UI"/>
+          <w:lang w:val="de-DE" w:eastAsia="de-DE"/>
+        </w:rPr>
+        <w:t>Vereinbarungen zur Umsetzung, die in der Gruppe getroffen wurden.</w:t>
+      </w:r>
+    </w:p>
+    <w:p>
+      <w:pPr>
+        <w:spacing w:before="100" w:beforeAutospacing="1" w:after="100" w:afterAutospacing="1" w:line="300" w:lineRule="atLeast"/>
+        <w:ind w:firstLine="0"/>
+        <w:jc w:val="both"/>
+        <w:rPr>
+          <w:rFonts w:eastAsia="Times New Roman" w:cs="Segoe UI"/>
+          <w:lang w:val="de-DE" w:eastAsia="de-DE"/>
+        </w:rPr>
+      </w:pPr>
+      <w:r>
+        <w:rPr>
+          <w:rFonts w:eastAsia="Times New Roman" w:cs="Segoe UI"/>
+          <w:lang w:val="de-DE" w:eastAsia="de-DE"/>
+        </w:rPr>
+        <w:t>Ziel ist es</w:t>
+      </w:r>
+      <w:r>
+        <w:rPr>
+          <w:rFonts w:eastAsia="Times New Roman" w:cs="Segoe UI"/>
+          <w:lang w:val="de-DE" w:eastAsia="de-DE"/>
+        </w:rPr>
+        <w:t xml:space="preserve"> dabei</w:t>
+      </w:r>
+      <w:r>
+        <w:rPr>
+          <w:rFonts w:eastAsia="Times New Roman" w:cs="Segoe UI"/>
+          <w:lang w:val="de-DE" w:eastAsia="de-DE"/>
+        </w:rPr>
+        <w:t xml:space="preserve">, eine klare und nachvollziehbare Grundlage für die Entwicklung, das Testen und die Qualitätssicherung zu schaffen. </w:t>
+      </w:r>
+    </w:p>
+    <w:p>
+      <w:pPr>
+        <w:spacing w:before="100" w:beforeAutospacing="1" w:after="100" w:afterAutospacing="1" w:line="300" w:lineRule="atLeast"/>
+        <w:ind w:firstLine="0"/>
+        <w:rPr>
+          <w:rFonts w:eastAsia="Times New Roman" w:cs="Segoe UI"/>
+          <w:lang w:val="de-DE" w:eastAsia="de-DE"/>
+        </w:rPr>
+      </w:pPr>
+    </w:p>
+    <w:p>
+      <w:pPr>
+        <w:rPr>
+          <w:rFonts w:eastAsiaTheme="majorEastAsia" w:cstheme="majorBidi"/>
+          <w:bCs/>
+          <w:sz w:val="28"/>
+          <w:szCs w:val="24"/>
+        </w:rPr>
+      </w:pPr>
+      <w:r>
+        <w:br w:type="page"/>
+      </w:r>
+    </w:p>
+    <w:p>
+      <w:pPr>
+        <w:pStyle w:val="berschrift1"/>
+      </w:pPr>
+      <w:bookmarkStart w:id="1" w:name="_Toc216338483"/>
       <w:r>
         <w:lastRenderedPageBreak/>
         <w:t>User Stories</w:t>
       </w:r>
-      <w:bookmarkEnd w:id="0"/>
+      <w:bookmarkEnd w:id="1"/>
     </w:p>
     <w:p>
       <w:pPr>
+        <w:spacing w:before="100" w:beforeAutospacing="1" w:after="100" w:afterAutospacing="1" w:line="300" w:lineRule="atLeast"/>
         <w:ind w:firstLine="0"/>
+        <w:jc w:val="both"/>
+        <w:rPr>
+          <w:rFonts w:eastAsia="Times New Roman" w:cs="Segoe UI"/>
+          <w:lang w:val="de-DE" w:eastAsia="de-DE"/>
+        </w:rPr>
+      </w:pPr>
+      <w:r>
+        <w:rPr>
+          <w:rFonts w:eastAsia="Times New Roman" w:cs="Segoe UI"/>
+          <w:lang w:val="de-DE" w:eastAsia="de-DE"/>
+        </w:rPr>
+        <w:t xml:space="preserve">Die </w:t>
+      </w:r>
+      <w:r>
+        <w:rPr>
+          <w:rFonts w:eastAsia="Times New Roman" w:cs="Segoe UI"/>
+          <w:lang w:val="de-DE" w:eastAsia="de-DE"/>
+        </w:rPr>
+        <w:t xml:space="preserve">im Weiteren betrachteten </w:t>
+      </w:r>
+      <w:r>
+        <w:rPr>
+          <w:rFonts w:eastAsia="Times New Roman" w:cs="Segoe UI"/>
+          <w:lang w:val="de-DE" w:eastAsia="de-DE"/>
+        </w:rPr>
+        <w:t xml:space="preserve">User Stories bilden die Grundlage für die funktionale </w:t>
+      </w:r>
+      <w:r>
+        <w:rPr>
+          <w:rFonts w:eastAsia="Times New Roman" w:cs="Segoe UI"/>
+          <w:lang w:val="de-DE" w:eastAsia="de-DE"/>
+        </w:rPr>
+        <w:t>Anforderungen an</w:t>
+      </w:r>
+      <w:r>
+        <w:rPr>
+          <w:rFonts w:eastAsia="Times New Roman" w:cs="Segoe UI"/>
+          <w:lang w:val="de-DE" w:eastAsia="de-DE"/>
+        </w:rPr>
+        <w:t xml:space="preserve"> d</w:t>
+      </w:r>
+      <w:r>
+        <w:rPr>
+          <w:rFonts w:eastAsia="Times New Roman" w:cs="Segoe UI"/>
+          <w:lang w:val="de-DE" w:eastAsia="de-DE"/>
+        </w:rPr>
+        <w:t>as</w:t>
+      </w:r>
+      <w:r>
+        <w:rPr>
+          <w:rFonts w:eastAsia="Times New Roman" w:cs="Segoe UI"/>
+          <w:lang w:val="de-DE" w:eastAsia="de-DE"/>
+        </w:rPr>
+        <w:t xml:space="preserve"> Projekts R.E.D. – Real-time Environment Driver. </w:t>
+      </w:r>
+      <w:r>
+        <w:rPr>
+          <w:rFonts w:eastAsia="Times New Roman" w:cs="Segoe UI"/>
+          <w:lang w:val="de-DE" w:eastAsia="de-DE"/>
+        </w:rPr>
+        <w:t>Dafür enthalten sie eine Beschreibung</w:t>
+      </w:r>
+      <w:r>
+        <w:rPr>
+          <w:rFonts w:eastAsia="Times New Roman" w:cs="Segoe UI"/>
+          <w:lang w:val="de-DE" w:eastAsia="de-DE"/>
+        </w:rPr>
+        <w:t xml:space="preserve"> d</w:t>
+      </w:r>
+      <w:r>
+        <w:rPr>
+          <w:rFonts w:eastAsia="Times New Roman" w:cs="Segoe UI"/>
+          <w:lang w:val="de-DE" w:eastAsia="de-DE"/>
+        </w:rPr>
+        <w:t>er</w:t>
+      </w:r>
+      <w:r>
+        <w:rPr>
+          <w:rFonts w:eastAsia="Times New Roman" w:cs="Segoe UI"/>
+          <w:lang w:val="de-DE" w:eastAsia="de-DE"/>
+        </w:rPr>
+        <w:t xml:space="preserve"> Anforderungen aus Sicht der Endnutzer und </w:t>
+      </w:r>
+      <w:r>
+        <w:rPr>
+          <w:rFonts w:eastAsia="Times New Roman" w:cs="Segoe UI"/>
+          <w:lang w:val="de-DE" w:eastAsia="de-DE"/>
+        </w:rPr>
+        <w:t>sollen sicher</w:t>
+      </w:r>
+      <w:r>
+        <w:rPr>
+          <w:rFonts w:eastAsia="Times New Roman" w:cs="Segoe UI"/>
+          <w:lang w:val="de-DE" w:eastAsia="de-DE"/>
+        </w:rPr>
+        <w:t>stelle</w:t>
+      </w:r>
+      <w:r>
+        <w:rPr>
+          <w:rFonts w:eastAsia="Times New Roman" w:cs="Segoe UI"/>
+          <w:lang w:val="de-DE" w:eastAsia="de-DE"/>
+        </w:rPr>
+        <w:t>n</w:t>
+      </w:r>
+      <w:r>
+        <w:rPr>
+          <w:rFonts w:eastAsia="Times New Roman" w:cs="Segoe UI"/>
+          <w:lang w:val="de-DE" w:eastAsia="de-DE"/>
+        </w:rPr>
+        <w:t xml:space="preserve">, dass die Entwicklung </w:t>
+      </w:r>
+      <w:r>
+        <w:rPr>
+          <w:rFonts w:eastAsia="Times New Roman" w:cs="Segoe UI"/>
+          <w:lang w:val="de-DE" w:eastAsia="de-DE"/>
+        </w:rPr>
+        <w:t xml:space="preserve">der Applikation </w:t>
+      </w:r>
+      <w:r>
+        <w:rPr>
+          <w:rFonts w:eastAsia="Times New Roman" w:cs="Segoe UI"/>
+          <w:lang w:val="de-DE" w:eastAsia="de-DE"/>
+        </w:rPr>
+        <w:t>konsequent an den Bedürfnissen der Anwender ausgerichtet ist</w:t>
+      </w:r>
+      <w:r>
+        <w:rPr>
+          <w:rFonts w:eastAsia="Times New Roman" w:cs="Segoe UI"/>
+          <w:lang w:val="de-DE" w:eastAsia="de-DE"/>
+        </w:rPr>
+        <w:t xml:space="preserve"> und diesen bei Abschluss des Projektes entspricht</w:t>
+      </w:r>
+      <w:r>
+        <w:rPr>
+          <w:rFonts w:eastAsia="Times New Roman" w:cs="Segoe UI"/>
+          <w:lang w:val="de-DE" w:eastAsia="de-DE"/>
+        </w:rPr>
+        <w:t>.</w:t>
+      </w:r>
+    </w:p>
+    <w:p>
+      <w:pPr>
+        <w:spacing w:before="100" w:beforeAutospacing="1" w:line="300" w:lineRule="atLeast"/>
+        <w:ind w:firstLine="0"/>
+        <w:jc w:val="both"/>
+        <w:rPr>
+          <w:rFonts w:eastAsia="Times New Roman" w:cs="Segoe UI"/>
+          <w:lang w:val="de-DE" w:eastAsia="de-DE"/>
+        </w:rPr>
+      </w:pPr>
+      <w:r>
+        <w:rPr>
+          <w:rFonts w:eastAsia="Times New Roman" w:cs="Segoe UI"/>
+          <w:lang w:val="de-DE" w:eastAsia="de-DE"/>
+        </w:rPr>
+        <w:t xml:space="preserve">Die folgenden </w:t>
+      </w:r>
+      <w:r>
+        <w:rPr>
+          <w:rFonts w:eastAsia="Times New Roman" w:cs="Segoe UI"/>
+          <w:lang w:val="de-DE" w:eastAsia="de-DE"/>
+        </w:rPr>
+        <w:t xml:space="preserve">User Stories sind </w:t>
+      </w:r>
+      <w:r>
+        <w:rPr>
+          <w:rFonts w:eastAsia="Times New Roman" w:cs="Segoe UI"/>
+          <w:lang w:val="de-DE" w:eastAsia="de-DE"/>
+        </w:rPr>
+        <w:t xml:space="preserve">als </w:t>
+      </w:r>
+      <w:r>
+        <w:rPr>
+          <w:rFonts w:eastAsia="Times New Roman" w:cs="Segoe UI"/>
+          <w:lang w:val="de-DE" w:eastAsia="de-DE"/>
+        </w:rPr>
+        <w:t>zentrales Element agiler Methoden</w:t>
+      </w:r>
+      <w:r>
+        <w:rPr>
+          <w:rFonts w:eastAsia="Times New Roman" w:cs="Segoe UI"/>
+          <w:lang w:val="de-DE" w:eastAsia="de-DE"/>
+        </w:rPr>
+        <w:t xml:space="preserve"> ein wichtiger Bestandteil</w:t>
+      </w:r>
+      <w:r>
+        <w:rPr>
+          <w:rFonts w:eastAsia="Times New Roman" w:cs="Segoe UI"/>
+          <w:lang w:val="de-DE" w:eastAsia="de-DE"/>
+        </w:rPr>
+        <w:t xml:space="preserve"> </w:t>
+      </w:r>
+      <w:r>
+        <w:rPr>
+          <w:rFonts w:eastAsia="Times New Roman" w:cs="Segoe UI"/>
+          <w:lang w:val="de-DE" w:eastAsia="de-DE"/>
+        </w:rPr>
+        <w:t>der</w:t>
+      </w:r>
+      <w:r>
+        <w:rPr>
+          <w:rFonts w:eastAsia="Times New Roman" w:cs="Segoe UI"/>
+          <w:lang w:val="de-DE" w:eastAsia="de-DE"/>
+        </w:rPr>
+        <w:t xml:space="preserve"> vorliegenden</w:t>
+      </w:r>
+      <w:r>
+        <w:rPr>
+          <w:rFonts w:eastAsia="Times New Roman" w:cs="Segoe UI"/>
+          <w:lang w:val="de-DE" w:eastAsia="de-DE"/>
+        </w:rPr>
+        <w:t xml:space="preserve"> Dokumentation </w:t>
+      </w:r>
+      <w:r>
+        <w:rPr>
+          <w:rFonts w:eastAsia="Times New Roman" w:cs="Segoe UI"/>
+          <w:lang w:val="de-DE" w:eastAsia="de-DE"/>
+        </w:rPr>
+        <w:t>und folgen dem</w:t>
+      </w:r>
+      <w:r>
+        <w:rPr>
+          <w:rFonts w:eastAsia="Times New Roman" w:cs="Segoe UI"/>
+          <w:lang w:val="de-DE" w:eastAsia="de-DE"/>
+        </w:rPr>
+        <w:t xml:space="preserve"> in der Vorlesung vorgestellten</w:t>
+      </w:r>
+      <w:r>
+        <w:rPr>
+          <w:rFonts w:eastAsia="Times New Roman" w:cs="Segoe UI"/>
+          <w:lang w:val="de-DE" w:eastAsia="de-DE"/>
+        </w:rPr>
+        <w:t xml:space="preserve"> Prinzip:</w:t>
+      </w:r>
+      <w:r>
+        <w:rPr>
+          <w:rFonts w:eastAsia="Times New Roman" w:cs="Segoe UI"/>
+          <w:lang w:val="de-DE" w:eastAsia="de-DE"/>
+        </w:rPr>
+        <w:t xml:space="preserve"> </w:t>
+      </w:r>
+    </w:p>
+    <w:p>
+      <w:pPr>
+        <w:spacing w:after="100" w:afterAutospacing="1" w:line="300" w:lineRule="atLeast"/>
+        <w:ind w:firstLine="0"/>
+        <w:jc w:val="both"/>
+        <w:rPr>
+          <w:rFonts w:eastAsia="Times New Roman" w:cs="Segoe UI"/>
+          <w:lang w:val="de-DE" w:eastAsia="de-DE"/>
+        </w:rPr>
+      </w:pPr>
+      <w:r>
+        <w:rPr>
+          <w:rFonts w:eastAsia="Times New Roman" w:cs="Segoe UI"/>
+          <w:lang w:val="de-DE" w:eastAsia="de-DE"/>
+        </w:rPr>
+        <w:t>„Als [Rolle] möchte ich [Ziel], um [Nutzen].“</w:t>
+      </w:r>
+      <w:r>
+        <w:rPr>
+          <w:rFonts w:eastAsia="Times New Roman" w:cs="Segoe UI"/>
+          <w:lang w:val="de-DE" w:eastAsia="de-DE"/>
+        </w:rPr>
+        <w:br/>
+        <w:t>Dieses Format ermöglicht eine klare und verständliche Darstellung der Funktione</w:t>
+      </w:r>
+      <w:r>
+        <w:rPr>
+          <w:rFonts w:eastAsia="Times New Roman" w:cs="Segoe UI"/>
+          <w:lang w:val="de-DE" w:eastAsia="de-DE"/>
+        </w:rPr>
+        <w:t>n, indem j</w:t>
+      </w:r>
+      <w:r>
+        <w:rPr>
+          <w:rFonts w:eastAsia="Times New Roman" w:cs="Segoe UI"/>
+          <w:lang w:val="de-DE" w:eastAsia="de-DE"/>
+        </w:rPr>
+        <w:t xml:space="preserve">ede </w:t>
+      </w:r>
+      <w:r>
+        <w:rPr>
+          <w:rFonts w:eastAsia="Times New Roman" w:cs="Segoe UI"/>
+          <w:lang w:val="de-DE" w:eastAsia="de-DE"/>
+        </w:rPr>
+        <w:t xml:space="preserve">User </w:t>
+      </w:r>
+      <w:r>
+        <w:rPr>
+          <w:rFonts w:eastAsia="Times New Roman" w:cs="Segoe UI"/>
+          <w:lang w:val="de-DE" w:eastAsia="de-DE"/>
+        </w:rPr>
+        <w:t>Story beschreibt wer die Funktion benötigt, was umgesetzt werden soll und warum dies wichtig ist.</w:t>
+      </w:r>
+      <w:r>
+        <w:rPr>
+          <w:rFonts w:eastAsia="Times New Roman" w:cs="Segoe UI"/>
+          <w:lang w:val="de-DE" w:eastAsia="de-DE"/>
+        </w:rPr>
+        <w:t xml:space="preserve"> Es vermeidet außerdem die</w:t>
+      </w:r>
+      <w:r>
+        <w:rPr>
+          <w:rFonts w:eastAsia="Times New Roman" w:cs="Segoe UI"/>
+          <w:lang w:val="de-DE" w:eastAsia="de-DE"/>
+        </w:rPr>
+        <w:t xml:space="preserve"> Vertiefung</w:t>
+      </w:r>
+      <w:r>
+        <w:rPr>
+          <w:rFonts w:eastAsia="Times New Roman" w:cs="Segoe UI"/>
+          <w:lang w:val="de-DE" w:eastAsia="de-DE"/>
+        </w:rPr>
+        <w:t xml:space="preserve"> </w:t>
+      </w:r>
+      <w:proofErr w:type="gramStart"/>
+      <w:r>
+        <w:rPr>
+          <w:rFonts w:eastAsia="Times New Roman" w:cs="Segoe UI"/>
+          <w:lang w:val="de-DE" w:eastAsia="de-DE"/>
+        </w:rPr>
+        <w:t>der</w:t>
+      </w:r>
+      <w:r>
+        <w:rPr>
+          <w:rFonts w:eastAsia="Times New Roman" w:cs="Segoe UI"/>
+          <w:lang w:val="de-DE" w:eastAsia="de-DE"/>
+        </w:rPr>
+        <w:t xml:space="preserve"> technische Details</w:t>
+      </w:r>
+      <w:proofErr w:type="gramEnd"/>
+      <w:r>
+        <w:rPr>
+          <w:rFonts w:eastAsia="Times New Roman" w:cs="Segoe UI"/>
+          <w:lang w:val="de-DE" w:eastAsia="de-DE"/>
+        </w:rPr>
+        <w:t>, die zu Beginn der Entwicklung n</w:t>
+      </w:r>
+      <w:r>
+        <w:rPr>
+          <w:rFonts w:eastAsia="Times New Roman" w:cs="Segoe UI"/>
+          <w:lang w:val="de-DE" w:eastAsia="de-DE"/>
+        </w:rPr>
+        <w:t>och nicht relevant sind</w:t>
+      </w:r>
+      <w:r>
+        <w:rPr>
+          <w:rFonts w:eastAsia="Times New Roman" w:cs="Segoe UI"/>
+          <w:lang w:val="de-DE" w:eastAsia="de-DE"/>
+        </w:rPr>
+        <w:t>, was die Fokussierung auf die Anforderungen an die Applikation erleichtert.</w:t>
+      </w:r>
+    </w:p>
+    <w:p>
+      <w:pPr>
+        <w:spacing w:before="100" w:beforeAutospacing="1" w:after="100" w:afterAutospacing="1" w:line="300" w:lineRule="atLeast"/>
+        <w:ind w:firstLine="0"/>
+        <w:jc w:val="both"/>
+        <w:rPr>
+          <w:rFonts w:eastAsia="Times New Roman" w:cs="Segoe UI"/>
+          <w:lang w:val="de-DE" w:eastAsia="de-DE"/>
+        </w:rPr>
+      </w:pPr>
+      <w:r>
+        <w:rPr>
+          <w:rFonts w:eastAsia="Times New Roman" w:cs="Segoe UI"/>
+          <w:lang w:val="de-DE" w:eastAsia="de-DE"/>
+        </w:rPr>
+        <w:t xml:space="preserve">Im Rahmen dieses Projekts dienen die </w:t>
+      </w:r>
+      <w:r>
+        <w:rPr>
+          <w:rFonts w:eastAsia="Times New Roman" w:cs="Segoe UI"/>
+          <w:lang w:val="de-DE" w:eastAsia="de-DE"/>
+        </w:rPr>
+        <w:t xml:space="preserve">folgenden </w:t>
+      </w:r>
+      <w:r>
+        <w:rPr>
+          <w:rFonts w:eastAsia="Times New Roman" w:cs="Segoe UI"/>
+          <w:lang w:val="de-DE" w:eastAsia="de-DE"/>
+        </w:rPr>
+        <w:t>User Stories dazu</w:t>
+      </w:r>
+      <w:r>
+        <w:rPr>
+          <w:rFonts w:eastAsia="Times New Roman" w:cs="Segoe UI"/>
+          <w:lang w:val="de-DE" w:eastAsia="de-DE"/>
+        </w:rPr>
+        <w:t xml:space="preserve"> </w:t>
+      </w:r>
+      <w:r>
+        <w:rPr>
+          <w:rFonts w:eastAsia="Times New Roman" w:cs="Segoe UI"/>
+          <w:lang w:val="de-DE" w:eastAsia="de-DE"/>
+        </w:rPr>
+        <w:t>die Kernfunktionen aus Nutzersicht zu definieren</w:t>
+      </w:r>
+      <w:r>
+        <w:rPr>
+          <w:rFonts w:eastAsia="Times New Roman" w:cs="Segoe UI"/>
+          <w:lang w:val="de-DE" w:eastAsia="de-DE"/>
+        </w:rPr>
+        <w:t xml:space="preserve">. Außerdem schaffen sie </w:t>
+      </w:r>
+      <w:r>
+        <w:rPr>
+          <w:rFonts w:eastAsia="Times New Roman" w:cs="Segoe UI"/>
+          <w:lang w:val="de-DE" w:eastAsia="de-DE"/>
+        </w:rPr>
+        <w:t>die Grundlage für die Anforderungsanalyse</w:t>
+      </w:r>
+      <w:r>
+        <w:rPr>
+          <w:rFonts w:eastAsia="Times New Roman" w:cs="Segoe UI"/>
+          <w:lang w:val="de-DE" w:eastAsia="de-DE"/>
+        </w:rPr>
+        <w:t xml:space="preserve"> und unterstützen </w:t>
+      </w:r>
+      <w:r>
+        <w:rPr>
+          <w:rFonts w:eastAsia="Times New Roman" w:cs="Segoe UI"/>
+          <w:lang w:val="de-DE" w:eastAsia="de-DE"/>
+        </w:rPr>
+        <w:t>die Priorisierung der Funktionen</w:t>
+      </w:r>
+      <w:r>
+        <w:rPr>
+          <w:rFonts w:eastAsia="Times New Roman" w:cs="Segoe UI"/>
+          <w:lang w:val="de-DE" w:eastAsia="de-DE"/>
+        </w:rPr>
+        <w:t xml:space="preserve">. Hier wird eine Priorisierung mit den Werten 1 – 5 verwendet, </w:t>
+      </w:r>
+      <w:r>
+        <w:rPr>
+          <w:rFonts w:eastAsia="Times New Roman" w:cs="Segoe UI"/>
+          <w:lang w:val="de-DE" w:eastAsia="de-DE"/>
+        </w:rPr>
+        <w:t xml:space="preserve">wobei 1 die höchste und 5 die niedrigste Priorität hat. Für diese Priorisierung wurde sich durch die Gruppe entschieden, </w:t>
+      </w:r>
+      <w:r>
+        <w:rPr>
+          <w:rFonts w:eastAsia="Times New Roman" w:cs="Segoe UI"/>
+          <w:lang w:val="de-DE" w:eastAsia="de-DE"/>
+        </w:rPr>
+        <w:t>um keine zu große Skala zu verwenden.</w:t>
+      </w:r>
+    </w:p>
+    <w:p>
+      <w:pPr>
+        <w:spacing w:before="100" w:beforeAutospacing="1" w:after="100" w:afterAutospacing="1" w:line="300" w:lineRule="atLeast"/>
+        <w:ind w:firstLine="0"/>
+        <w:jc w:val="both"/>
+        <w:rPr>
+          <w:rFonts w:eastAsia="Times New Roman" w:cs="Segoe UI"/>
+          <w:lang w:val="de-DE" w:eastAsia="de-DE"/>
+        </w:rPr>
+      </w:pPr>
+      <w:r>
+        <w:rPr>
+          <w:rFonts w:eastAsia="Times New Roman" w:cs="Segoe UI"/>
+          <w:lang w:val="de-DE" w:eastAsia="de-DE"/>
+        </w:rPr>
+        <w:t xml:space="preserve">Die Gruppe hat sich in der Gemeinschaft für die Priorisierungen entschieden und in dem Wert „Schätzung“ eine Schätzung </w:t>
+      </w:r>
+      <w:r>
+        <w:rPr>
+          <w:rFonts w:eastAsia="Times New Roman" w:cs="Segoe UI"/>
+          <w:lang w:val="de-DE" w:eastAsia="de-DE"/>
+        </w:rPr>
+        <w:t>für d</w:t>
+      </w:r>
+      <w:r>
+        <w:rPr>
+          <w:rFonts w:eastAsia="Times New Roman" w:cs="Segoe UI"/>
+          <w:lang w:val="de-DE" w:eastAsia="de-DE"/>
+        </w:rPr>
+        <w:t>en</w:t>
+      </w:r>
+      <w:r>
+        <w:rPr>
+          <w:rFonts w:eastAsia="Times New Roman" w:cs="Segoe UI"/>
+          <w:lang w:val="de-DE" w:eastAsia="de-DE"/>
+        </w:rPr>
+        <w:t xml:space="preserve"> </w:t>
+      </w:r>
+      <w:r>
+        <w:rPr>
+          <w:rFonts w:eastAsia="Times New Roman" w:cs="Segoe UI"/>
+          <w:lang w:val="de-DE" w:eastAsia="de-DE"/>
+        </w:rPr>
+        <w:t xml:space="preserve">benötigten Zeitaufwand der zuvor definierten User Stories </w:t>
+      </w:r>
+      <w:r>
+        <w:rPr>
+          <w:rFonts w:eastAsia="Times New Roman" w:cs="Segoe UI"/>
+          <w:lang w:val="de-DE" w:eastAsia="de-DE"/>
+        </w:rPr>
+        <w:t xml:space="preserve">eingetragen. </w:t>
+      </w:r>
+    </w:p>
+    <w:p>
+      <w:pPr>
+        <w:spacing w:before="100" w:beforeAutospacing="1" w:after="100" w:afterAutospacing="1" w:line="300" w:lineRule="atLeast"/>
+        <w:ind w:firstLine="0"/>
+        <w:jc w:val="both"/>
+        <w:rPr>
+          <w:rFonts w:eastAsia="Times New Roman" w:cs="Segoe UI"/>
+          <w:lang w:val="de-DE" w:eastAsia="de-DE"/>
+        </w:rPr>
+      </w:pPr>
+      <w:r>
+        <w:rPr>
+          <w:rFonts w:eastAsia="Times New Roman" w:cs="Segoe UI"/>
+          <w:lang w:val="de-DE" w:eastAsia="de-DE"/>
+        </w:rPr>
+        <w:t>Ergänzend zu den User Stories werden </w:t>
+      </w:r>
+      <w:r>
+        <w:rPr>
+          <w:rFonts w:eastAsia="Times New Roman" w:cs="Segoe UI"/>
+          <w:lang w:val="de-DE" w:eastAsia="de-DE"/>
+        </w:rPr>
+        <w:t xml:space="preserve">außerdem </w:t>
+      </w:r>
+      <w:r>
+        <w:rPr>
+          <w:rFonts w:eastAsia="Times New Roman" w:cs="Segoe UI"/>
+          <w:lang w:val="de-DE" w:eastAsia="de-DE"/>
+        </w:rPr>
+        <w:t>User Cards eingesetzt. Diese visualisieren die wichtigsten Interaktionen und erleichtern die Kommunikation i</w:t>
+      </w:r>
+      <w:r>
+        <w:rPr>
+          <w:rFonts w:eastAsia="Times New Roman" w:cs="Segoe UI"/>
+          <w:lang w:val="de-DE" w:eastAsia="de-DE"/>
+        </w:rPr>
+        <w:t>n der Gruppe</w:t>
+      </w:r>
+      <w:r>
+        <w:rPr>
+          <w:rFonts w:eastAsia="Times New Roman" w:cs="Segoe UI"/>
+          <w:lang w:val="de-DE" w:eastAsia="de-DE"/>
+        </w:rPr>
+        <w:t xml:space="preserve">. Dabei wird jede </w:t>
+      </w:r>
+      <w:r>
+        <w:rPr>
+          <w:rFonts w:eastAsia="Times New Roman" w:cs="Segoe UI"/>
+          <w:lang w:val="de-DE" w:eastAsia="de-DE"/>
+        </w:rPr>
+        <w:t xml:space="preserve">User </w:t>
+      </w:r>
+      <w:r>
+        <w:rPr>
+          <w:rFonts w:eastAsia="Times New Roman" w:cs="Segoe UI"/>
+          <w:lang w:val="de-DE" w:eastAsia="de-DE"/>
+        </w:rPr>
+        <w:t>Card</w:t>
+      </w:r>
+      <w:r>
+        <w:rPr>
+          <w:rFonts w:eastAsia="Times New Roman" w:cs="Segoe UI"/>
+          <w:lang w:val="de-DE" w:eastAsia="de-DE"/>
+        </w:rPr>
+        <w:t xml:space="preserve"> </w:t>
+      </w:r>
+      <w:r>
+        <w:rPr>
+          <w:rFonts w:eastAsia="Times New Roman" w:cs="Segoe UI"/>
+          <w:lang w:val="de-DE" w:eastAsia="de-DE"/>
+        </w:rPr>
+        <w:t>durch </w:t>
+      </w:r>
+      <w:r>
+        <w:rPr>
+          <w:rFonts w:eastAsia="Times New Roman" w:cs="Segoe UI"/>
+          <w:lang w:val="de-DE" w:eastAsia="de-DE"/>
+        </w:rPr>
+        <w:t xml:space="preserve">ein </w:t>
+      </w:r>
+      <w:r>
+        <w:rPr>
+          <w:rFonts w:eastAsia="Times New Roman" w:cs="Segoe UI"/>
+          <w:lang w:val="de-DE" w:eastAsia="de-DE"/>
+        </w:rPr>
+        <w:t>Akzeptanzkriteri</w:t>
+      </w:r>
+      <w:r>
+        <w:rPr>
+          <w:rFonts w:eastAsia="Times New Roman" w:cs="Segoe UI"/>
+          <w:lang w:val="de-DE" w:eastAsia="de-DE"/>
+        </w:rPr>
+        <w:t>um</w:t>
+      </w:r>
+      <w:r>
+        <w:rPr>
+          <w:rFonts w:eastAsia="Times New Roman" w:cs="Segoe UI"/>
+          <w:lang w:val="de-DE" w:eastAsia="de-DE"/>
+        </w:rPr>
+        <w:t xml:space="preserve"> ergänzt, </w:t>
+      </w:r>
+      <w:r>
+        <w:rPr>
+          <w:rFonts w:eastAsia="Times New Roman" w:cs="Segoe UI"/>
+          <w:lang w:val="de-DE" w:eastAsia="de-DE"/>
+        </w:rPr>
+        <w:t>welches</w:t>
+      </w:r>
+      <w:r>
+        <w:rPr>
+          <w:rFonts w:eastAsia="Times New Roman" w:cs="Segoe UI"/>
+          <w:lang w:val="de-DE" w:eastAsia="de-DE"/>
+        </w:rPr>
+        <w:t xml:space="preserve"> definier</w:t>
+      </w:r>
+      <w:r>
+        <w:rPr>
+          <w:rFonts w:eastAsia="Times New Roman" w:cs="Segoe UI"/>
+          <w:lang w:val="de-DE" w:eastAsia="de-DE"/>
+        </w:rPr>
+        <w:t>t</w:t>
+      </w:r>
+      <w:r>
+        <w:rPr>
+          <w:rFonts w:eastAsia="Times New Roman" w:cs="Segoe UI"/>
+          <w:lang w:val="de-DE" w:eastAsia="de-DE"/>
+        </w:rPr>
+        <w:t xml:space="preserve">, wann die </w:t>
+      </w:r>
+      <w:r>
+        <w:rPr>
+          <w:rFonts w:eastAsia="Times New Roman" w:cs="Segoe UI"/>
+          <w:lang w:val="de-DE" w:eastAsia="de-DE"/>
+        </w:rPr>
+        <w:t xml:space="preserve">gestellte Anforderung des Nutzers </w:t>
+      </w:r>
+      <w:r>
+        <w:rPr>
+          <w:rFonts w:eastAsia="Times New Roman" w:cs="Segoe UI"/>
+          <w:lang w:val="de-DE" w:eastAsia="de-DE"/>
+        </w:rPr>
+        <w:t>als erfüllt gilt. Dadurch wird sichergestellt, dass die Umsetzung überprüfbar und messbar ist</w:t>
+      </w:r>
+      <w:r>
+        <w:rPr>
+          <w:rFonts w:eastAsia="Times New Roman" w:cs="Segoe UI"/>
+          <w:lang w:val="de-DE" w:eastAsia="de-DE"/>
+        </w:rPr>
+        <w:t xml:space="preserve"> und keine Missverständnisse entstehen.</w:t>
+      </w:r>
+      <w:r>
+        <w:rPr>
+          <w:rFonts w:eastAsia="Times New Roman" w:cs="Segoe UI"/>
+          <w:lang w:val="de-DE" w:eastAsia="de-DE"/>
+        </w:rPr>
+        <w:t xml:space="preserve"> Als Medium zur Erstellung der User Cards wurde Draw.io verwendet.</w:t>
+      </w:r>
+    </w:p>
+    <w:p>
+      <w:pPr>
+        <w:spacing w:before="100" w:beforeAutospacing="1" w:after="100" w:afterAutospacing="1" w:line="300" w:lineRule="atLeast"/>
+        <w:ind w:firstLine="0"/>
+        <w:rPr>
+          <w:rFonts w:eastAsia="Times New Roman" w:cs="Segoe UI"/>
+          <w:lang w:val="de-DE" w:eastAsia="de-DE"/>
+        </w:rPr>
+      </w:pPr>
+    </w:p>
+    <w:p>
+      <w:pPr>
+        <w:ind w:firstLine="0"/>
+        <w:rPr>
+          <w:rFonts w:eastAsiaTheme="majorEastAsia" w:cstheme="majorBidi"/>
+          <w:bCs/>
+        </w:rPr>
+      </w:pPr>
+      <w:r>
+        <w:br w:type="page"/>
+      </w:r>
+    </w:p>
+    <w:p>
+      <w:pPr>
+        <w:ind w:firstLine="0"/>
         <w:rPr>
           <w:lang w:val="de-DE"/>
         </w:rPr>
@@ -2526,7 +3638,8 @@
         <w:rPr>
           <w:noProof/>
         </w:rPr>
-        <w:object w:dxaOrig="1440" w:dyaOrig="1440" w14:anchorId="64935BCD">
+        <w:lastRenderedPageBreak/>
+        <w:object w:dxaOrig="1440" w:dyaOrig="1440" w14:anchorId="6D37DE80">
           <v:shapetype id="_x0000_t75" coordsize="21600,21600" o:spt="75" o:preferrelative="t" path="m@4@5l@4@11@9@11@9@5xe" filled="f" stroked="f">
             <v:stroke joinstyle="miter"/>
             <v:formulas>
@@ -2546,11 +3659,11 @@
             <v:path o:extrusionok="f" gradientshapeok="t" o:connecttype="rect"/>
             <o:lock v:ext="edit" aspectratio="t"/>
           </v:shapetype>
-          <v:shape id="_x0000_s1027" type="#_x0000_t75" alt="" style="position:absolute;margin-left:-7.5pt;margin-top:11.8pt;width:479pt;height:644pt;z-index:251658240;mso-wrap-edited:f;mso-width-percent:0;mso-height-percent:0;mso-width-percent:0;mso-height-percent:0">
+          <v:shape id="_x0000_s1029" type="#_x0000_t75" alt="" style="position:absolute;margin-left:-7.5pt;margin-top:11.8pt;width:479pt;height:644pt;z-index:251658240;mso-wrap-edited:f;mso-width-percent:0;mso-height-percent:0;mso-width-percent:0;mso-height-percent:0">
             <v:imagedata r:id="rId13" o:title=""/>
             <w10:wrap type="topAndBottom"/>
           </v:shape>
-          <o:OLEObject Type="Embed" ProgID="Excel.Sheet.12" ShapeID="_x0000_s1027" DrawAspect="Content" ObjectID="_1826263692" r:id="rId14"/>
+          <o:OLEObject Type="Embed" ProgID="Excel.Sheet.12" ShapeID="_x0000_s1029" DrawAspect="Content" ObjectID="_1826951228" r:id="rId14"/>
         </w:object>
       </w:r>
       <w:r>
@@ -2568,17 +3681,25 @@
           <w:lang w:val="de-DE"/>
         </w:rPr>
       </w:pPr>
+    </w:p>
+    <w:p>
+      <w:pPr>
+        <w:ind w:firstLine="0"/>
+        <w:jc w:val="both"/>
+        <w:rPr>
+          <w:lang w:val="de-DE"/>
+        </w:rPr>
+      </w:pPr>
       <w:r>
         <w:rPr>
           <w:noProof/>
         </w:rPr>
-        <w:lastRenderedPageBreak/>
-        <w:object w:dxaOrig="1440" w:dyaOrig="1440" w14:anchorId="5D12DB9A">
-          <v:shape id="_x0000_s1026" type="#_x0000_t75" alt="" style="position:absolute;left:0;text-align:left;margin-left:0;margin-top:0;width:467pt;height:654pt;z-index:251666439;mso-wrap-edited:f;mso-width-percent:0;mso-height-percent:0;mso-position-horizontal-relative:text;mso-position-vertical-relative:text;mso-width-percent:0;mso-height-percent:0">
+        <w:object w:dxaOrig="1440" w:dyaOrig="1440" w14:anchorId="55F5C7D6">
+          <v:shape id="_x0000_s1028" type="#_x0000_t75" alt="" style="position:absolute;left:0;text-align:left;margin-left:0;margin-top:0;width:467pt;height:654pt;z-index:251658250;mso-wrap-edited:f;mso-width-percent:0;mso-height-percent:0;mso-position-horizontal-relative:text;mso-position-vertical-relative:text;mso-width-percent:0;mso-height-percent:0">
             <v:imagedata r:id="rId15" o:title=""/>
             <w10:wrap type="topAndBottom"/>
           </v:shape>
-          <o:OLEObject Type="Embed" ProgID="Excel.Sheet.12" ShapeID="_x0000_s1026" DrawAspect="Content" ObjectID="_1826263691" r:id="rId16"/>
+          <o:OLEObject Type="Embed" ProgID="Excel.Sheet.12" ShapeID="_x0000_s1028" DrawAspect="Content" ObjectID="_1826951229" r:id="rId16"/>
         </w:object>
       </w:r>
     </w:p>
@@ -2589,7 +3710,7 @@
           <w:lang w:val="de-DE"/>
         </w:rPr>
       </w:pPr>
-      <w:bookmarkStart w:id="1" w:name="_Toc215650436"/>
+      <w:bookmarkStart w:id="2" w:name="_Toc216338484"/>
       <w:r>
         <w:rPr>
           <w:noProof/>
@@ -2597,15 +3718,15 @@
         </w:rPr>
         <w:lastRenderedPageBreak/>
         <w:drawing>
-          <wp:anchor distT="0" distB="0" distL="114300" distR="114300" simplePos="0" relativeHeight="251667463" behindDoc="0" locked="0" layoutInCell="1" allowOverlap="1" wp14:anchorId="0C3F59E6" wp14:editId="15F98854">
+          <wp:anchor distT="0" distB="0" distL="114300" distR="114300" simplePos="0" relativeHeight="251658251" behindDoc="0" locked="0" layoutInCell="1" allowOverlap="1" wp14:anchorId="0C3F59E6" wp14:editId="51017FB0">
             <wp:simplePos x="0" y="0"/>
             <wp:positionH relativeFrom="column">
-              <wp:posOffset>0</wp:posOffset>
+              <wp:posOffset>-106045</wp:posOffset>
             </wp:positionH>
             <wp:positionV relativeFrom="paragraph">
-              <wp:posOffset>300596</wp:posOffset>
+              <wp:posOffset>397510</wp:posOffset>
             </wp:positionV>
-            <wp:extent cx="5845210" cy="8553691"/>
+            <wp:extent cx="6062345" cy="8375650"/>
             <wp:effectExtent l="0" t="0" r="0" b="6350"/>
             <wp:wrapTopAndBottom/>
             <wp:docPr id="890147207" name="Grafik 23"/>
@@ -2616,12 +3737,12 @@
               <a:graphicData uri="http://schemas.openxmlformats.org/drawingml/2006/picture">
                 <pic:pic xmlns:pic="http://schemas.openxmlformats.org/drawingml/2006/picture">
                   <pic:nvPicPr>
-                    <pic:cNvPr id="890147207" name="Grafik 890147207"/>
+                    <pic:cNvPr id="890147207" name="Grafik 23"/>
                     <pic:cNvPicPr/>
                   </pic:nvPicPr>
                   <pic:blipFill rotWithShape="1">
                     <a:blip r:embed="rId17"/>
-                    <a:srcRect l="13874" t="5039" r="20885" b="27501"/>
+                    <a:srcRect l="15339" t="4582" r="15073" b="27497"/>
                     <a:stretch>
                       <a:fillRect/>
                     </a:stretch>
@@ -2629,7 +3750,7 @@
                   <pic:spPr bwMode="auto">
                     <a:xfrm>
                       <a:off x="0" y="0"/>
-                      <a:ext cx="5858100" cy="8572554"/>
+                      <a:ext cx="6062345" cy="8375650"/>
                     </a:xfrm>
                     <a:prstGeom prst="rect">
                       <a:avLst/>
@@ -2661,7 +3782,7 @@
         </w:rPr>
         <w:t>User Cards</w:t>
       </w:r>
-      <w:bookmarkEnd w:id="1"/>
+      <w:bookmarkEnd w:id="2"/>
       <w:r>
         <w:rPr>
           <w:lang w:val="de-DE"/>
@@ -2673,6 +3794,17 @@
       <w:pPr>
         <w:ind w:firstLine="0"/>
         <w:rPr>
+          <w:lang w:val="de-DE"/>
+        </w:rPr>
+      </w:pPr>
+    </w:p>
+    <w:p>
+      <w:pPr>
+        <w:rPr>
+          <w:rFonts w:eastAsiaTheme="majorEastAsia" w:cstheme="majorBidi"/>
+          <w:bCs/>
+          <w:sz w:val="28"/>
+          <w:szCs w:val="24"/>
           <w:lang w:val="de-DE"/>
         </w:rPr>
       </w:pPr>
@@ -2685,15 +3817,14 @@
           <w:szCs w:val="24"/>
           <w:lang w:val="de-DE"/>
         </w:rPr>
-        <w:lastRenderedPageBreak/>
         <w:drawing>
-          <wp:anchor distT="0" distB="0" distL="114300" distR="114300" simplePos="0" relativeHeight="251668487" behindDoc="0" locked="0" layoutInCell="1" allowOverlap="1" wp14:anchorId="6AE970D8" wp14:editId="16AB8ED2">
+          <wp:anchor distT="0" distB="0" distL="114300" distR="114300" simplePos="0" relativeHeight="251658252" behindDoc="0" locked="0" layoutInCell="1" allowOverlap="1" wp14:anchorId="6AE970D8" wp14:editId="7B30191F">
             <wp:simplePos x="0" y="0"/>
             <wp:positionH relativeFrom="column">
-              <wp:posOffset>563245</wp:posOffset>
+              <wp:posOffset>403363</wp:posOffset>
             </wp:positionH>
             <wp:positionV relativeFrom="paragraph">
-              <wp:posOffset>2842895</wp:posOffset>
+              <wp:posOffset>2864733</wp:posOffset>
             </wp:positionV>
             <wp:extent cx="4646930" cy="5662930"/>
             <wp:effectExtent l="0" t="0" r="1270" b="1270"/>
@@ -2755,13 +3886,13 @@
           <w:lang w:val="de-DE"/>
         </w:rPr>
         <w:drawing>
-          <wp:anchor distT="0" distB="0" distL="114300" distR="114300" simplePos="0" relativeHeight="251669511" behindDoc="0" locked="0" layoutInCell="1" allowOverlap="1" wp14:anchorId="2B1AAEC8" wp14:editId="15942D37">
+          <wp:anchor distT="0" distB="0" distL="114300" distR="114300" simplePos="0" relativeHeight="251658253" behindDoc="0" locked="0" layoutInCell="1" allowOverlap="1" wp14:anchorId="2B1AAEC8" wp14:editId="2D4B7ED2">
             <wp:simplePos x="0" y="0"/>
             <wp:positionH relativeFrom="column">
-              <wp:posOffset>563367</wp:posOffset>
+              <wp:posOffset>403860</wp:posOffset>
             </wp:positionH>
             <wp:positionV relativeFrom="paragraph">
-              <wp:posOffset>-261</wp:posOffset>
+              <wp:posOffset>0</wp:posOffset>
             </wp:positionV>
             <wp:extent cx="4646930" cy="2865120"/>
             <wp:effectExtent l="0" t="0" r="1270" b="5080"/>
@@ -2778,7 +3909,7 @@
                     <pic:cNvPicPr/>
                   </pic:nvPicPr>
                   <pic:blipFill rotWithShape="1">
-                    <a:blip r:embed="rId17"/>
+                    <a:blip r:embed="rId19"/>
                     <a:srcRect l="20738" t="72122" r="27127" b="5159"/>
                     <a:stretch>
                       <a:fillRect/>
@@ -2813,15 +3944,12 @@
           </wp:anchor>
         </w:drawing>
       </w:r>
-    </w:p>
-    <w:p>
-      <w:pPr>
-        <w:pStyle w:val="berschrift1"/>
-        <w:rPr>
-          <w:lang w:val="de-DE"/>
-        </w:rPr>
-      </w:pPr>
-      <w:bookmarkStart w:id="2" w:name="_Toc215650437"/>
+      <w:r>
+        <w:rPr>
+          <w:lang w:val="de-DE"/>
+        </w:rPr>
+        <w:br w:type="page"/>
+      </w:r>
       <w:r>
         <w:rPr>
           <w:noProof/>
@@ -2829,13 +3957,13 @@
         </w:rPr>
         <w:lastRenderedPageBreak/>
         <w:drawing>
-          <wp:anchor distT="0" distB="0" distL="114300" distR="114300" simplePos="0" relativeHeight="251670535" behindDoc="0" locked="0" layoutInCell="1" allowOverlap="1" wp14:anchorId="324815B0" wp14:editId="1AE3E36B">
+          <wp:anchor distT="0" distB="0" distL="114300" distR="114300" simplePos="0" relativeHeight="251658254" behindDoc="0" locked="0" layoutInCell="1" allowOverlap="1" wp14:anchorId="324815B0" wp14:editId="6F560E1A">
             <wp:simplePos x="0" y="0"/>
             <wp:positionH relativeFrom="column">
-              <wp:posOffset>538254</wp:posOffset>
+              <wp:posOffset>306346</wp:posOffset>
             </wp:positionH>
             <wp:positionV relativeFrom="paragraph">
-              <wp:posOffset>0</wp:posOffset>
+              <wp:posOffset>331</wp:posOffset>
             </wp:positionV>
             <wp:extent cx="4772025" cy="5698490"/>
             <wp:effectExtent l="0" t="0" r="3175" b="3810"/>
@@ -2893,533 +4021,1156 @@
         </w:rPr>
         <w:br w:type="page"/>
       </w:r>
-      <w:r>
-        <w:rPr>
-          <w:lang w:val="de-DE"/>
-        </w:rPr>
-        <w:lastRenderedPageBreak/>
-        <w:t>Anforderungsanalyse abgeleitet aus den User Cards / User Stories</w:t>
-      </w:r>
-      <w:bookmarkEnd w:id="2"/>
     </w:p>
     <w:p>
       <w:pPr>
-        <w:pStyle w:val="Listenabsatz"/>
-        <w:numPr>
-          <w:ilvl w:val="0"/>
-          <w:numId w:val="7"/>
-        </w:numPr>
-        <w:rPr>
-          <w:lang w:val="de-DE"/>
-        </w:rPr>
-      </w:pPr>
-      <w:r>
-        <w:rPr>
-          <w:lang w:val="de-DE"/>
-        </w:rPr>
-        <w:t xml:space="preserve">VAA15: </w:t>
-      </w:r>
-      <w:r>
-        <w:rPr>
-          <w:lang w:val="de-DE"/>
-        </w:rPr>
-        <w:t>Verbindung der Website oder Applikation mit dem Auto:</w:t>
-      </w:r>
+        <w:pStyle w:val="berschrift1"/>
+        <w:rPr>
+          <w:lang w:val="de-DE"/>
+        </w:rPr>
+      </w:pPr>
+      <w:bookmarkStart w:id="3" w:name="_Toc216338485"/>
+      <w:r>
+        <w:rPr>
+          <w:lang w:val="de-DE"/>
+        </w:rPr>
+        <w:lastRenderedPageBreak/>
+        <w:t>Anforderungsanalyse abgeleitet aus den User Stories</w:t>
+      </w:r>
+      <w:bookmarkEnd w:id="3"/>
     </w:p>
     <w:p>
       <w:pPr>
-        <w:pStyle w:val="Listenabsatz"/>
-        <w:numPr>
-          <w:ilvl w:val="1"/>
-          <w:numId w:val="3"/>
-        </w:numPr>
-        <w:rPr>
-          <w:lang w:val="de-DE"/>
-        </w:rPr>
-      </w:pPr>
-      <w:r>
-        <w:rPr>
-          <w:lang w:val="de-DE"/>
-        </w:rPr>
-        <w:t>Es muss eine Verbindung zwischen der Website bzw. Applikation und dem Auto erstellt werden. Dies geschieht mithilfe eines Access Points, bei welchem sich das Endgerät anmelden kann.</w:t>
+        <w:spacing w:after="240"/>
+        <w:ind w:firstLine="0"/>
+        <w:jc w:val="both"/>
+        <w:rPr>
+          <w:lang w:val="de-DE"/>
+        </w:rPr>
+      </w:pPr>
+      <w:r>
+        <w:rPr>
+          <w:lang w:val="de-DE"/>
+        </w:rPr>
+        <w:t xml:space="preserve">Die Anforderungsanalyse stellt die Grundlage zur praktischen Umsetzung des Projektes R.E.D </w:t>
+      </w:r>
+      <w:r>
+        <w:rPr>
+          <w:lang w:val="de-DE"/>
+        </w:rPr>
+        <w:t>dar.</w:t>
       </w:r>
     </w:p>
     <w:p>
       <w:pPr>
-        <w:pStyle w:val="Listenabsatz"/>
-        <w:numPr>
-          <w:ilvl w:val="0"/>
-          <w:numId w:val="3"/>
-        </w:numPr>
-        <w:rPr>
-          <w:lang w:val="de-DE"/>
-        </w:rPr>
-      </w:pPr>
-      <w:r>
-        <w:rPr>
-          <w:lang w:val="de-DE"/>
-        </w:rPr>
-        <w:t xml:space="preserve">F24: </w:t>
-      </w:r>
-      <w:r>
-        <w:rPr>
-          <w:lang w:val="de-DE"/>
-        </w:rPr>
-        <w:t xml:space="preserve">Fernsteuerung: </w:t>
+        <w:spacing w:after="240"/>
+        <w:ind w:firstLine="0"/>
+        <w:jc w:val="both"/>
+        <w:rPr>
+          <w:lang w:val="de-DE"/>
+        </w:rPr>
+      </w:pPr>
+      <w:r>
+        <w:rPr>
+          <w:lang w:val="de-DE"/>
+        </w:rPr>
+        <w:t>Im Folgenden werden die Anforderungen betrachtet, die aus den User Stories abgeleitet wurden</w:t>
+      </w:r>
+      <w:r>
+        <w:rPr>
+          <w:lang w:val="de-DE"/>
+        </w:rPr>
+        <w:t xml:space="preserve"> und die dort </w:t>
+      </w:r>
+      <w:r>
+        <w:rPr>
+          <w:lang w:val="de-DE"/>
+        </w:rPr>
+        <w:t>beschriebenen Nutzerbedürfnisse in präzise und überprüfbare Anforderungen überführt</w:t>
+      </w:r>
+      <w:r>
+        <w:rPr>
+          <w:lang w:val="de-DE"/>
+        </w:rPr>
+        <w:t>.</w:t>
+      </w:r>
+      <w:r>
+        <w:rPr>
+          <w:lang w:val="de-DE"/>
+        </w:rPr>
+        <w:t xml:space="preserve"> D</w:t>
+      </w:r>
+      <w:r>
+        <w:rPr>
+          <w:lang w:val="de-DE"/>
+        </w:rPr>
+        <w:t xml:space="preserve">afür </w:t>
+      </w:r>
+      <w:r>
+        <w:rPr>
+          <w:lang w:val="de-DE"/>
+        </w:rPr>
+        <w:t>beschreiben sie die grundlegenden funktionalen</w:t>
+      </w:r>
+      <w:r>
+        <w:rPr>
+          <w:lang w:val="de-DE"/>
+        </w:rPr>
+        <w:t xml:space="preserve"> Systemfunktionen und dienen damit als</w:t>
+      </w:r>
+      <w:r>
+        <w:rPr>
+          <w:lang w:val="de-DE"/>
+        </w:rPr>
+        <w:t xml:space="preserve"> Grundlage für das weitere Vorgehen und die Implementierung zur Umsetzung des Projekts. </w:t>
       </w:r>
     </w:p>
     <w:p>
       <w:pPr>
-        <w:pStyle w:val="Listenabsatz"/>
-        <w:numPr>
-          <w:ilvl w:val="1"/>
-          <w:numId w:val="3"/>
-        </w:numPr>
-        <w:rPr>
-          <w:lang w:val="de-DE"/>
-        </w:rPr>
-      </w:pPr>
-      <w:r>
-        <w:rPr>
-          <w:lang w:val="de-DE"/>
-        </w:rPr>
-        <w:t>Das Auto soll über das Benutzerinterface gesteuert werden können. Dabei soll die Richtungssteuerung sowie das Beschleunigen mithilfe eines Gas Pedals und das Verringern der Geschwindigkeit durch ein Bremspedal ermöglicht werden.</w:t>
+        <w:spacing w:after="240"/>
+        <w:ind w:firstLine="0"/>
+        <w:jc w:val="both"/>
+        <w:rPr>
+          <w:lang w:val="de-DE"/>
+        </w:rPr>
+      </w:pPr>
+      <w:r>
+        <w:rPr>
+          <w:lang w:val="de-DE"/>
+        </w:rPr>
+        <w:t xml:space="preserve">Mithilfe dieser Anforderungsanalyse wird sichergestellt, dass sämtliche Anforderungen </w:t>
+      </w:r>
+      <w:r>
+        <w:rPr>
+          <w:lang w:val="de-DE"/>
+        </w:rPr>
+        <w:t>vollständig und nachvollziehbar dokumentiert sind</w:t>
+      </w:r>
+      <w:r>
+        <w:rPr>
+          <w:lang w:val="de-DE"/>
+        </w:rPr>
+        <w:t>.</w:t>
       </w:r>
     </w:p>
     <w:p>
       <w:pPr>
-        <w:pStyle w:val="Listenabsatz"/>
-        <w:numPr>
-          <w:ilvl w:val="1"/>
-          <w:numId w:val="3"/>
-        </w:numPr>
-        <w:rPr>
-          <w:lang w:val="de-DE"/>
-        </w:rPr>
-      </w:pPr>
-      <w:r>
-        <w:rPr>
-          <w:lang w:val="de-DE"/>
-        </w:rPr>
-        <w:t>Das Rückwärtsfahren soll durch ein längeres Betätigen der Bremse möglich sein.</w:t>
-      </w:r>
+        <w:spacing w:after="240"/>
+        <w:ind w:firstLine="0"/>
+        <w:jc w:val="both"/>
+        <w:rPr>
+          <w:lang w:val="de-DE"/>
+        </w:rPr>
+      </w:pPr>
+      <w:r>
+        <w:rPr>
+          <w:lang w:val="de-DE"/>
+        </w:rPr>
+        <w:t>Die Darstellung der Anforderungen erfolgt in Tabellenform</w:t>
+      </w:r>
+      <w:r>
+        <w:rPr>
+          <w:lang w:val="de-DE"/>
+        </w:rPr>
+        <w:t xml:space="preserve">, um eine übersichtliche, strukturierte und gut nachvollziehbare </w:t>
+      </w:r>
+      <w:r>
+        <w:rPr>
+          <w:lang w:val="de-DE"/>
+        </w:rPr>
+        <w:t xml:space="preserve">Struktur zu gewährleisten. </w:t>
+      </w:r>
+    </w:p>
+    <w:tbl>
+      <w:tblPr>
+        <w:tblStyle w:val="Tabellenraster"/>
+        <w:tblW w:w="9252" w:type="dxa"/>
+        <w:tblLook w:val="04A0" w:firstRow="1" w:lastRow="0" w:firstColumn="1" w:lastColumn="0" w:noHBand="0" w:noVBand="1"/>
+      </w:tblPr>
+      <w:tblGrid>
+        <w:gridCol w:w="1104"/>
+        <w:gridCol w:w="1802"/>
+        <w:gridCol w:w="5261"/>
+        <w:gridCol w:w="1085"/>
+      </w:tblGrid>
+      <w:tr>
+        <w:trPr>
+          <w:trHeight w:val="495"/>
+        </w:trPr>
+        <w:tc>
+          <w:tcPr>
+            <w:tcW w:w="1104" w:type="dxa"/>
+          </w:tcPr>
+          <w:p>
+            <w:pPr>
+              <w:spacing w:after="240"/>
+              <w:ind w:firstLine="0"/>
+              <w:jc w:val="both"/>
+              <w:rPr>
+                <w:lang w:val="de-DE"/>
+              </w:rPr>
+            </w:pPr>
+            <w:r>
+              <w:rPr>
+                <w:lang w:val="de-DE"/>
+              </w:rPr>
+              <w:t>ID</w:t>
+            </w:r>
+          </w:p>
+        </w:tc>
+        <w:tc>
+          <w:tcPr>
+            <w:tcW w:w="1799" w:type="dxa"/>
+          </w:tcPr>
+          <w:p>
+            <w:pPr>
+              <w:spacing w:after="240"/>
+              <w:ind w:firstLine="0"/>
+              <w:jc w:val="both"/>
+              <w:rPr>
+                <w:lang w:val="de-DE"/>
+              </w:rPr>
+            </w:pPr>
+            <w:r>
+              <w:rPr>
+                <w:lang w:val="de-DE"/>
+              </w:rPr>
+              <w:t>Titel</w:t>
+            </w:r>
+          </w:p>
+        </w:tc>
+        <w:tc>
+          <w:tcPr>
+            <w:tcW w:w="5264" w:type="dxa"/>
+          </w:tcPr>
+          <w:p>
+            <w:pPr>
+              <w:spacing w:after="240"/>
+              <w:ind w:firstLine="0"/>
+              <w:jc w:val="both"/>
+              <w:rPr>
+                <w:lang w:val="de-DE"/>
+              </w:rPr>
+            </w:pPr>
+            <w:r>
+              <w:rPr>
+                <w:lang w:val="de-DE"/>
+              </w:rPr>
+              <w:t>Anforderung</w:t>
+            </w:r>
+          </w:p>
+        </w:tc>
+        <w:tc>
+          <w:tcPr>
+            <w:tcW w:w="1085" w:type="dxa"/>
+          </w:tcPr>
+          <w:p>
+            <w:pPr>
+              <w:spacing w:after="240"/>
+              <w:ind w:firstLine="0"/>
+              <w:jc w:val="both"/>
+              <w:rPr>
+                <w:lang w:val="de-DE"/>
+              </w:rPr>
+            </w:pPr>
+            <w:r>
+              <w:rPr>
+                <w:lang w:val="de-DE"/>
+              </w:rPr>
+              <w:t>Priorität</w:t>
+            </w:r>
+          </w:p>
+        </w:tc>
+      </w:tr>
+      <w:tr>
+        <w:trPr>
+          <w:trHeight w:val="495"/>
+        </w:trPr>
+        <w:tc>
+          <w:tcPr>
+            <w:tcW w:w="1104" w:type="dxa"/>
+          </w:tcPr>
+          <w:p>
+            <w:pPr>
+              <w:spacing w:after="240"/>
+              <w:ind w:firstLine="0"/>
+              <w:jc w:val="both"/>
+              <w:rPr>
+                <w:lang w:val="de-DE"/>
+              </w:rPr>
+            </w:pPr>
+            <w:r>
+              <w:rPr>
+                <w:lang w:val="de-DE"/>
+              </w:rPr>
+              <w:t>VAA15</w:t>
+            </w:r>
+          </w:p>
+        </w:tc>
+        <w:tc>
+          <w:tcPr>
+            <w:tcW w:w="1799" w:type="dxa"/>
+          </w:tcPr>
+          <w:p>
+            <w:pPr>
+              <w:spacing w:after="240"/>
+              <w:ind w:firstLine="0"/>
+              <w:jc w:val="both"/>
+              <w:rPr>
+                <w:lang w:val="de-DE"/>
+              </w:rPr>
+            </w:pPr>
+            <w:r>
+              <w:rPr>
+                <w:lang w:val="de-DE"/>
+              </w:rPr>
+              <w:t>Verbindung der Website oder Applikation mit dem Auto</w:t>
+            </w:r>
+          </w:p>
+        </w:tc>
+        <w:tc>
+          <w:tcPr>
+            <w:tcW w:w="5264" w:type="dxa"/>
+          </w:tcPr>
+          <w:p>
+            <w:pPr>
+              <w:ind w:firstLine="0"/>
+              <w:rPr>
+                <w:lang w:val="de-DE"/>
+              </w:rPr>
+            </w:pPr>
+            <w:r>
+              <w:rPr>
+                <w:lang w:val="de-DE"/>
+              </w:rPr>
+              <w:t>Es muss eine Verbindung zwischen der Website bzw. Applikation und dem Auto erstellt werden. Dies geschieht mithilfe eines Access Points, bei welchem sich das Endgerät anmelden kann.</w:t>
+            </w:r>
+          </w:p>
+        </w:tc>
+        <w:tc>
+          <w:tcPr>
+            <w:tcW w:w="1085" w:type="dxa"/>
+          </w:tcPr>
+          <w:p>
+            <w:pPr>
+              <w:spacing w:after="240"/>
+              <w:ind w:firstLine="0"/>
+              <w:jc w:val="both"/>
+              <w:rPr>
+                <w:lang w:val="de-DE"/>
+              </w:rPr>
+            </w:pPr>
+            <w:r>
+              <w:rPr>
+                <w:lang w:val="de-DE"/>
+              </w:rPr>
+              <w:t>1</w:t>
+            </w:r>
+          </w:p>
+        </w:tc>
+      </w:tr>
+      <w:tr>
+        <w:trPr>
+          <w:trHeight w:val="495"/>
+        </w:trPr>
+        <w:tc>
+          <w:tcPr>
+            <w:tcW w:w="1104" w:type="dxa"/>
+          </w:tcPr>
+          <w:p>
+            <w:pPr>
+              <w:spacing w:after="240"/>
+              <w:ind w:firstLine="0"/>
+              <w:jc w:val="both"/>
+              <w:rPr>
+                <w:lang w:val="de-DE"/>
+              </w:rPr>
+            </w:pPr>
+            <w:r>
+              <w:rPr>
+                <w:lang w:val="de-DE"/>
+              </w:rPr>
+              <w:t>F24</w:t>
+            </w:r>
+          </w:p>
+        </w:tc>
+        <w:tc>
+          <w:tcPr>
+            <w:tcW w:w="1799" w:type="dxa"/>
+          </w:tcPr>
+          <w:p>
+            <w:pPr>
+              <w:spacing w:after="240"/>
+              <w:ind w:firstLine="0"/>
+              <w:jc w:val="both"/>
+              <w:rPr>
+                <w:lang w:val="de-DE"/>
+              </w:rPr>
+            </w:pPr>
+            <w:r>
+              <w:rPr>
+                <w:lang w:val="de-DE"/>
+              </w:rPr>
+              <w:t>Fernsteuerung</w:t>
+            </w:r>
+          </w:p>
+        </w:tc>
+        <w:tc>
+          <w:tcPr>
+            <w:tcW w:w="5264" w:type="dxa"/>
+          </w:tcPr>
+          <w:p>
+            <w:pPr>
+              <w:ind w:firstLine="0"/>
+              <w:jc w:val="both"/>
+              <w:rPr>
+                <w:lang w:val="de-DE"/>
+              </w:rPr>
+            </w:pPr>
+            <w:r>
+              <w:rPr>
+                <w:lang w:val="de-DE"/>
+              </w:rPr>
+              <w:t xml:space="preserve">Das Auto soll über das Benutzerinterface gesteuert werden können. Dabei </w:t>
+            </w:r>
+            <w:proofErr w:type="gramStart"/>
+            <w:r>
+              <w:rPr>
+                <w:lang w:val="de-DE"/>
+              </w:rPr>
+              <w:t>soll</w:t>
+            </w:r>
+            <w:proofErr w:type="gramEnd"/>
+            <w:r>
+              <w:rPr>
+                <w:lang w:val="de-DE"/>
+              </w:rPr>
+              <w:t xml:space="preserve"> die Richtungssteuerung sowie das Beschleunigen mithilfe eines Gas Pedals und das Verringern der Geschwindigkeit durch ein Bremspedal ermöglicht werden.</w:t>
+            </w:r>
+          </w:p>
+          <w:p>
+            <w:pPr>
+              <w:spacing w:after="240"/>
+              <w:ind w:firstLine="0"/>
+              <w:jc w:val="both"/>
+              <w:rPr>
+                <w:lang w:val="de-DE"/>
+              </w:rPr>
+            </w:pPr>
+            <w:r>
+              <w:rPr>
+                <w:lang w:val="de-DE"/>
+              </w:rPr>
+              <w:t>Das Rückwärtsfahren soll durch ein längeres Betätigen der Bremse möglich sein.</w:t>
+            </w:r>
+          </w:p>
+        </w:tc>
+        <w:tc>
+          <w:tcPr>
+            <w:tcW w:w="1085" w:type="dxa"/>
+          </w:tcPr>
+          <w:p>
+            <w:pPr>
+              <w:spacing w:after="240"/>
+              <w:ind w:firstLine="0"/>
+              <w:jc w:val="both"/>
+              <w:rPr>
+                <w:lang w:val="de-DE"/>
+              </w:rPr>
+            </w:pPr>
+            <w:r>
+              <w:rPr>
+                <w:lang w:val="de-DE"/>
+              </w:rPr>
+              <w:t>2</w:t>
+            </w:r>
+          </w:p>
+        </w:tc>
+      </w:tr>
+      <w:tr>
+        <w:trPr>
+          <w:trHeight w:val="495"/>
+        </w:trPr>
+        <w:tc>
+          <w:tcPr>
+            <w:tcW w:w="1104" w:type="dxa"/>
+          </w:tcPr>
+          <w:p>
+            <w:pPr>
+              <w:spacing w:after="240"/>
+              <w:ind w:firstLine="0"/>
+              <w:jc w:val="both"/>
+              <w:rPr>
+                <w:lang w:val="de-DE"/>
+              </w:rPr>
+            </w:pPr>
+            <w:r>
+              <w:rPr>
+                <w:lang w:val="de-DE"/>
+              </w:rPr>
+              <w:t>WMB22</w:t>
+            </w:r>
+          </w:p>
+        </w:tc>
+        <w:tc>
+          <w:tcPr>
+            <w:tcW w:w="1799" w:type="dxa"/>
+          </w:tcPr>
+          <w:p>
+            <w:pPr>
+              <w:spacing w:after="240"/>
+              <w:ind w:firstLine="0"/>
+              <w:jc w:val="both"/>
+              <w:rPr>
+                <w:lang w:val="de-DE"/>
+              </w:rPr>
+            </w:pPr>
+            <w:r>
+              <w:rPr>
+                <w:lang w:val="de-DE"/>
+              </w:rPr>
+              <w:t>Wechseln der Modi im Benutzerinterface</w:t>
+            </w:r>
+          </w:p>
+        </w:tc>
+        <w:tc>
+          <w:tcPr>
+            <w:tcW w:w="5264" w:type="dxa"/>
+          </w:tcPr>
+          <w:p>
+            <w:pPr>
+              <w:ind w:firstLine="0"/>
+              <w:rPr>
+                <w:lang w:val="de-DE"/>
+              </w:rPr>
+            </w:pPr>
+            <w:r>
+              <w:rPr>
+                <w:lang w:val="de-DE"/>
+              </w:rPr>
+              <w:t>Nach der Willkommensseite erscheint ein Auswahlmenü mit verschiedenen Modi</w:t>
+            </w:r>
+            <w:r>
+              <w:rPr>
+                <w:lang w:val="de-DE"/>
+              </w:rPr>
+              <w:t>.</w:t>
+            </w:r>
+          </w:p>
+          <w:p>
+            <w:pPr>
+              <w:spacing w:after="240"/>
+              <w:ind w:firstLine="0"/>
+              <w:jc w:val="both"/>
+              <w:rPr>
+                <w:lang w:val="de-DE"/>
+              </w:rPr>
+            </w:pPr>
+            <w:r>
+              <w:rPr>
+                <w:lang w:val="de-DE"/>
+              </w:rPr>
+              <w:t>Diese sind Fahren, Raum Scannen und Strecke zeichnen, autonomes Fahren.</w:t>
+            </w:r>
+          </w:p>
+        </w:tc>
+        <w:tc>
+          <w:tcPr>
+            <w:tcW w:w="1085" w:type="dxa"/>
+          </w:tcPr>
+          <w:p>
+            <w:pPr>
+              <w:spacing w:after="240"/>
+              <w:ind w:firstLine="0"/>
+              <w:jc w:val="both"/>
+              <w:rPr>
+                <w:lang w:val="de-DE"/>
+              </w:rPr>
+            </w:pPr>
+            <w:r>
+              <w:rPr>
+                <w:lang w:val="de-DE"/>
+              </w:rPr>
+              <w:t>2</w:t>
+            </w:r>
+          </w:p>
+        </w:tc>
+      </w:tr>
+      <w:tr>
+        <w:trPr>
+          <w:trHeight w:val="495"/>
+        </w:trPr>
+        <w:tc>
+          <w:tcPr>
+            <w:tcW w:w="1104" w:type="dxa"/>
+          </w:tcPr>
+          <w:p>
+            <w:pPr>
+              <w:spacing w:after="240"/>
+              <w:ind w:firstLine="0"/>
+              <w:jc w:val="both"/>
+              <w:rPr>
+                <w:lang w:val="de-DE"/>
+              </w:rPr>
+            </w:pPr>
+            <w:r>
+              <w:rPr>
+                <w:lang w:val="de-DE"/>
+              </w:rPr>
+              <w:t>RLM21</w:t>
+            </w:r>
+          </w:p>
+        </w:tc>
+        <w:tc>
+          <w:tcPr>
+            <w:tcW w:w="1799" w:type="dxa"/>
+          </w:tcPr>
+          <w:p>
+            <w:pPr>
+              <w:spacing w:after="240"/>
+              <w:ind w:firstLine="0"/>
+              <w:jc w:val="both"/>
+              <w:rPr>
+                <w:lang w:val="de-DE"/>
+              </w:rPr>
+            </w:pPr>
+            <w:r>
+              <w:rPr>
+                <w:lang w:val="de-DE"/>
+              </w:rPr>
+              <w:t>Rechts- und Linkshänder Modus</w:t>
+            </w:r>
+          </w:p>
+        </w:tc>
+        <w:tc>
+          <w:tcPr>
+            <w:tcW w:w="5264" w:type="dxa"/>
+          </w:tcPr>
+          <w:p>
+            <w:pPr>
+              <w:spacing w:after="240"/>
+              <w:ind w:firstLine="0"/>
+              <w:jc w:val="both"/>
+              <w:rPr>
+                <w:lang w:val="de-DE"/>
+              </w:rPr>
+            </w:pPr>
+            <w:r>
+              <w:rPr>
+                <w:lang w:val="de-DE"/>
+              </w:rPr>
+              <w:t>Mit Klick auf einen Button werden die Buttons für die Steuerung (rechts und links) mit den Buttons Gas und Bremse gewechselt.</w:t>
+            </w:r>
+          </w:p>
+        </w:tc>
+        <w:tc>
+          <w:tcPr>
+            <w:tcW w:w="1085" w:type="dxa"/>
+          </w:tcPr>
+          <w:p>
+            <w:pPr>
+              <w:spacing w:after="240"/>
+              <w:ind w:firstLine="0"/>
+              <w:jc w:val="both"/>
+              <w:rPr>
+                <w:lang w:val="de-DE"/>
+              </w:rPr>
+            </w:pPr>
+            <w:r>
+              <w:rPr>
+                <w:lang w:val="de-DE"/>
+              </w:rPr>
+              <w:t>2</w:t>
+            </w:r>
+          </w:p>
+        </w:tc>
+      </w:tr>
+      <w:tr>
+        <w:trPr>
+          <w:trHeight w:val="495"/>
+        </w:trPr>
+        <w:tc>
+          <w:tcPr>
+            <w:tcW w:w="1104" w:type="dxa"/>
+          </w:tcPr>
+          <w:p>
+            <w:pPr>
+              <w:spacing w:after="240"/>
+              <w:ind w:firstLine="0"/>
+              <w:jc w:val="both"/>
+              <w:rPr>
+                <w:lang w:val="de-DE"/>
+              </w:rPr>
+            </w:pPr>
+            <w:r>
+              <w:rPr>
+                <w:lang w:val="de-DE"/>
+              </w:rPr>
+              <w:t>SAF38</w:t>
+            </w:r>
+          </w:p>
+        </w:tc>
+        <w:tc>
+          <w:tcPr>
+            <w:tcW w:w="1799" w:type="dxa"/>
+          </w:tcPr>
+          <w:p>
+            <w:pPr>
+              <w:spacing w:after="240"/>
+              <w:ind w:firstLine="0"/>
+              <w:jc w:val="both"/>
+              <w:rPr>
+                <w:lang w:val="de-DE"/>
+              </w:rPr>
+            </w:pPr>
+            <w:r>
+              <w:rPr>
+                <w:lang w:val="de-DE"/>
+              </w:rPr>
+              <w:t>Semi-autonomes Fahren</w:t>
+            </w:r>
+          </w:p>
+        </w:tc>
+        <w:tc>
+          <w:tcPr>
+            <w:tcW w:w="5264" w:type="dxa"/>
+          </w:tcPr>
+          <w:p>
+            <w:pPr>
+              <w:ind w:firstLine="0"/>
+              <w:rPr>
+                <w:lang w:val="de-DE"/>
+              </w:rPr>
+            </w:pPr>
+            <w:r>
+              <w:rPr>
+                <w:lang w:val="de-DE"/>
+              </w:rPr>
+              <w:t>Steuerung des Autos (Komponenten: Links, Rechts, Gas, Bremse, Licht).</w:t>
+            </w:r>
+          </w:p>
+          <w:p>
+            <w:pPr>
+              <w:ind w:firstLine="0"/>
+              <w:rPr>
+                <w:lang w:val="de-DE"/>
+              </w:rPr>
+            </w:pPr>
+            <w:r>
+              <w:rPr>
+                <w:lang w:val="de-DE"/>
+              </w:rPr>
+              <w:t xml:space="preserve">Einlesen von Sensordaten durch das Auto. </w:t>
+            </w:r>
+          </w:p>
+          <w:p>
+            <w:pPr>
+              <w:ind w:firstLine="0"/>
+              <w:rPr>
+                <w:lang w:val="de-DE"/>
+              </w:rPr>
+            </w:pPr>
+            <w:r>
+              <w:rPr>
+                <w:lang w:val="de-DE"/>
+              </w:rPr>
+              <w:t>Steuerung des Autos durch den Benutzer.</w:t>
+            </w:r>
+          </w:p>
+          <w:p>
+            <w:pPr>
+              <w:spacing w:after="240"/>
+              <w:ind w:firstLine="0"/>
+              <w:jc w:val="both"/>
+              <w:rPr>
+                <w:lang w:val="de-DE"/>
+              </w:rPr>
+            </w:pPr>
+            <w:r>
+              <w:rPr>
+                <w:lang w:val="de-DE"/>
+              </w:rPr>
+              <w:t>Reaktion des Autos auf die eingelesenen Daten mit Stoppen oder Ausweichen des Autos.</w:t>
+            </w:r>
+          </w:p>
+        </w:tc>
+        <w:tc>
+          <w:tcPr>
+            <w:tcW w:w="1085" w:type="dxa"/>
+          </w:tcPr>
+          <w:p>
+            <w:pPr>
+              <w:spacing w:after="240"/>
+              <w:ind w:firstLine="0"/>
+              <w:jc w:val="both"/>
+              <w:rPr>
+                <w:lang w:val="de-DE"/>
+              </w:rPr>
+            </w:pPr>
+            <w:r>
+              <w:rPr>
+                <w:lang w:val="de-DE"/>
+              </w:rPr>
+              <w:t>3</w:t>
+            </w:r>
+          </w:p>
+        </w:tc>
+      </w:tr>
+      <w:tr>
+        <w:trPr>
+          <w:trHeight w:val="495"/>
+        </w:trPr>
+        <w:tc>
+          <w:tcPr>
+            <w:tcW w:w="1104" w:type="dxa"/>
+          </w:tcPr>
+          <w:p>
+            <w:pPr>
+              <w:spacing w:after="240"/>
+              <w:ind w:firstLine="0"/>
+              <w:jc w:val="both"/>
+              <w:rPr>
+                <w:lang w:val="de-DE"/>
+              </w:rPr>
+            </w:pPr>
+            <w:r>
+              <w:rPr>
+                <w:lang w:val="de-DE"/>
+              </w:rPr>
+              <w:t>AF45</w:t>
+            </w:r>
+          </w:p>
+        </w:tc>
+        <w:tc>
+          <w:tcPr>
+            <w:tcW w:w="1799" w:type="dxa"/>
+          </w:tcPr>
+          <w:p>
+            <w:pPr>
+              <w:spacing w:after="240"/>
+              <w:ind w:firstLine="0"/>
+              <w:jc w:val="both"/>
+              <w:rPr>
+                <w:lang w:val="de-DE"/>
+              </w:rPr>
+            </w:pPr>
+            <w:r>
+              <w:rPr>
+                <w:lang w:val="de-DE"/>
+              </w:rPr>
+              <w:t>autonomes Fahren</w:t>
+            </w:r>
+          </w:p>
+        </w:tc>
+        <w:tc>
+          <w:tcPr>
+            <w:tcW w:w="5264" w:type="dxa"/>
+          </w:tcPr>
+          <w:p>
+            <w:pPr>
+              <w:ind w:firstLine="0"/>
+              <w:rPr>
+                <w:lang w:val="de-DE"/>
+              </w:rPr>
+            </w:pPr>
+            <w:r>
+              <w:rPr>
+                <w:lang w:val="de-DE"/>
+              </w:rPr>
+              <w:t>Autonomes Fahren (Start und Stopp).</w:t>
+            </w:r>
+          </w:p>
+          <w:p>
+            <w:pPr>
+              <w:ind w:firstLine="0"/>
+              <w:rPr>
+                <w:lang w:val="de-DE"/>
+              </w:rPr>
+            </w:pPr>
+            <w:r>
+              <w:rPr>
+                <w:lang w:val="de-DE"/>
+              </w:rPr>
+              <w:t>Einlesen von Sensordaten.</w:t>
+            </w:r>
+          </w:p>
+          <w:p>
+            <w:pPr>
+              <w:spacing w:after="240"/>
+              <w:ind w:firstLine="0"/>
+              <w:rPr>
+                <w:lang w:val="de-DE"/>
+              </w:rPr>
+            </w:pPr>
+            <w:r>
+              <w:rPr>
+                <w:lang w:val="de-DE"/>
+              </w:rPr>
+              <w:t>Algorithmus zum Selbstfahren des Autos in einem bestimmten Bereich.</w:t>
+            </w:r>
+          </w:p>
+        </w:tc>
+        <w:tc>
+          <w:tcPr>
+            <w:tcW w:w="1085" w:type="dxa"/>
+          </w:tcPr>
+          <w:p>
+            <w:pPr>
+              <w:spacing w:after="240"/>
+              <w:ind w:firstLine="0"/>
+              <w:jc w:val="both"/>
+              <w:rPr>
+                <w:lang w:val="de-DE"/>
+              </w:rPr>
+            </w:pPr>
+            <w:r>
+              <w:rPr>
+                <w:lang w:val="de-DE"/>
+              </w:rPr>
+              <w:t>4</w:t>
+            </w:r>
+          </w:p>
+        </w:tc>
+      </w:tr>
+      <w:tr>
+        <w:trPr>
+          <w:trHeight w:val="495"/>
+        </w:trPr>
+        <w:tc>
+          <w:tcPr>
+            <w:tcW w:w="1104" w:type="dxa"/>
+          </w:tcPr>
+          <w:p>
+            <w:pPr>
+              <w:spacing w:after="240"/>
+              <w:ind w:firstLine="0"/>
+              <w:jc w:val="both"/>
+              <w:rPr>
+                <w:lang w:val="de-DE"/>
+              </w:rPr>
+            </w:pPr>
+            <w:r>
+              <w:rPr>
+                <w:lang w:val="de-DE"/>
+              </w:rPr>
+              <w:t>KR54:</w:t>
+            </w:r>
+          </w:p>
+        </w:tc>
+        <w:tc>
+          <w:tcPr>
+            <w:tcW w:w="1799" w:type="dxa"/>
+          </w:tcPr>
+          <w:p>
+            <w:pPr>
+              <w:spacing w:after="240"/>
+              <w:ind w:firstLine="0"/>
+              <w:jc w:val="both"/>
+              <w:rPr>
+                <w:lang w:val="de-DE"/>
+              </w:rPr>
+            </w:pPr>
+            <w:r>
+              <w:rPr>
+                <w:lang w:val="de-DE"/>
+              </w:rPr>
+              <w:t>Karte des Raums</w:t>
+            </w:r>
+          </w:p>
+        </w:tc>
+        <w:tc>
+          <w:tcPr>
+            <w:tcW w:w="5264" w:type="dxa"/>
+          </w:tcPr>
+          <w:p>
+            <w:pPr>
+              <w:ind w:firstLine="0"/>
+              <w:rPr>
+                <w:lang w:val="de-DE"/>
+              </w:rPr>
+            </w:pPr>
+            <w:r>
+              <w:rPr>
+                <w:lang w:val="de-DE"/>
+              </w:rPr>
+              <w:t>Kartenansicht im Benutzerinterface.</w:t>
+            </w:r>
+          </w:p>
+          <w:p>
+            <w:pPr>
+              <w:ind w:firstLine="0"/>
+              <w:rPr>
+                <w:lang w:val="de-DE"/>
+              </w:rPr>
+            </w:pPr>
+            <w:r>
+              <w:rPr>
+                <w:lang w:val="de-DE"/>
+              </w:rPr>
+              <w:lastRenderedPageBreak/>
+              <w:t>Scannen des Raums durch das Auto und anschließend Anzeige der Karte.</w:t>
+            </w:r>
+          </w:p>
+          <w:p>
+            <w:pPr>
+              <w:ind w:firstLine="0"/>
+              <w:rPr>
+                <w:lang w:val="de-DE"/>
+              </w:rPr>
+            </w:pPr>
+            <w:r>
+              <w:rPr>
+                <w:lang w:val="de-DE"/>
+              </w:rPr>
+              <w:t>Zeichnen des Weges auf der Karte mittels Touch Screen, welchem das Auto anschließend folgt.</w:t>
+            </w:r>
+          </w:p>
+          <w:p>
+            <w:pPr>
+              <w:ind w:firstLine="0"/>
+              <w:rPr>
+                <w:lang w:val="de-DE"/>
+              </w:rPr>
+            </w:pPr>
+          </w:p>
+        </w:tc>
+        <w:tc>
+          <w:tcPr>
+            <w:tcW w:w="1085" w:type="dxa"/>
+          </w:tcPr>
+          <w:p>
+            <w:pPr>
+              <w:spacing w:after="240"/>
+              <w:ind w:firstLine="0"/>
+              <w:jc w:val="both"/>
+              <w:rPr>
+                <w:lang w:val="de-DE"/>
+              </w:rPr>
+            </w:pPr>
+            <w:r>
+              <w:rPr>
+                <w:lang w:val="de-DE"/>
+              </w:rPr>
+              <w:lastRenderedPageBreak/>
+              <w:t>5</w:t>
+            </w:r>
+          </w:p>
+        </w:tc>
+      </w:tr>
+      <w:tr>
+        <w:trPr>
+          <w:trHeight w:val="495"/>
+        </w:trPr>
+        <w:tc>
+          <w:tcPr>
+            <w:tcW w:w="1104" w:type="dxa"/>
+          </w:tcPr>
+          <w:p>
+            <w:pPr>
+              <w:spacing w:after="240"/>
+              <w:ind w:firstLine="0"/>
+              <w:jc w:val="both"/>
+              <w:rPr>
+                <w:lang w:val="de-DE"/>
+              </w:rPr>
+            </w:pPr>
+            <w:r>
+              <w:rPr>
+                <w:lang w:val="de-DE"/>
+              </w:rPr>
+              <w:t>EF53</w:t>
+            </w:r>
+          </w:p>
+        </w:tc>
+        <w:tc>
+          <w:tcPr>
+            <w:tcW w:w="1799" w:type="dxa"/>
+          </w:tcPr>
+          <w:p>
+            <w:pPr>
+              <w:spacing w:after="240"/>
+              <w:ind w:firstLine="0"/>
+              <w:jc w:val="both"/>
+              <w:rPr>
+                <w:lang w:val="de-DE"/>
+              </w:rPr>
+            </w:pPr>
+            <w:r>
+              <w:rPr>
+                <w:lang w:val="de-DE"/>
+              </w:rPr>
+              <w:t>Erklärung der Funktionsweisen</w:t>
+            </w:r>
+          </w:p>
+        </w:tc>
+        <w:tc>
+          <w:tcPr>
+            <w:tcW w:w="5264" w:type="dxa"/>
+          </w:tcPr>
+          <w:p>
+            <w:pPr>
+              <w:ind w:firstLine="0"/>
+              <w:rPr>
+                <w:lang w:val="de-DE"/>
+              </w:rPr>
+            </w:pPr>
+            <w:r>
+              <w:rPr>
+                <w:lang w:val="de-DE"/>
+              </w:rPr>
+              <w:t>Pop-up mit einer Erklärung der Funktionsweise und Steuerung nach Klicken eines Buttons auf der Auswahlseite der Modi.</w:t>
+            </w:r>
+          </w:p>
+          <w:p>
+            <w:pPr>
+              <w:spacing w:after="240"/>
+              <w:ind w:firstLine="0"/>
+              <w:jc w:val="both"/>
+              <w:rPr>
+                <w:lang w:val="de-DE"/>
+              </w:rPr>
+            </w:pPr>
+          </w:p>
+        </w:tc>
+        <w:tc>
+          <w:tcPr>
+            <w:tcW w:w="1085" w:type="dxa"/>
+          </w:tcPr>
+          <w:p>
+            <w:pPr>
+              <w:spacing w:after="240"/>
+              <w:ind w:firstLine="0"/>
+              <w:jc w:val="both"/>
+              <w:rPr>
+                <w:lang w:val="de-DE"/>
+              </w:rPr>
+            </w:pPr>
+            <w:r>
+              <w:rPr>
+                <w:lang w:val="de-DE"/>
+              </w:rPr>
+              <w:t>5</w:t>
+            </w:r>
+          </w:p>
+        </w:tc>
+      </w:tr>
+    </w:tbl>
+    <w:p>
+      <w:pPr>
+        <w:ind w:firstLine="0"/>
+        <w:rPr>
+          <w:lang w:val="de-DE"/>
+        </w:rPr>
+      </w:pPr>
     </w:p>
     <w:p>
       <w:pPr>
-        <w:pStyle w:val="Listenabsatz"/>
-        <w:numPr>
-          <w:ilvl w:val="0"/>
-          <w:numId w:val="3"/>
-        </w:numPr>
-        <w:rPr>
-          <w:lang w:val="de-DE"/>
-        </w:rPr>
-      </w:pPr>
-      <w:r>
-        <w:rPr>
-          <w:lang w:val="de-DE"/>
-        </w:rPr>
-        <w:t>WMB22: Wechseln der Modi im Benutzerinterface:</w:t>
-      </w:r>
-    </w:p>
-    <w:p>
-      <w:pPr>
-        <w:pStyle w:val="Listenabsatz"/>
-        <w:numPr>
-          <w:ilvl w:val="1"/>
-          <w:numId w:val="3"/>
-        </w:numPr>
-        <w:rPr>
-          <w:lang w:val="de-DE"/>
-        </w:rPr>
-      </w:pPr>
-      <w:r>
-        <w:rPr>
-          <w:lang w:val="de-DE"/>
-        </w:rPr>
-        <w:t>Nach der Willkommensseite erscheint ein Auswahlmenü mit verschiedenen Modi</w:t>
-      </w:r>
-    </w:p>
-    <w:p>
-      <w:pPr>
-        <w:pStyle w:val="Listenabsatz"/>
-        <w:numPr>
-          <w:ilvl w:val="1"/>
-          <w:numId w:val="3"/>
-        </w:numPr>
-        <w:rPr>
-          <w:lang w:val="de-DE"/>
-        </w:rPr>
-      </w:pPr>
-      <w:r>
-        <w:rPr>
-          <w:lang w:val="de-DE"/>
-        </w:rPr>
-        <w:t>Diese sind Fahren, Raum Scannen und Strecke zeichnen, autonomes Fahren</w:t>
-      </w:r>
-    </w:p>
-    <w:p>
-      <w:pPr>
-        <w:pStyle w:val="Listenabsatz"/>
-        <w:numPr>
-          <w:ilvl w:val="0"/>
-          <w:numId w:val="3"/>
-        </w:numPr>
-        <w:rPr>
-          <w:lang w:val="de-DE"/>
-        </w:rPr>
-      </w:pPr>
-      <w:r>
-        <w:rPr>
-          <w:lang w:val="de-DE"/>
-        </w:rPr>
-        <w:t>RLM21: Rechts- und Linkshänder Modus</w:t>
-      </w:r>
-    </w:p>
-    <w:p>
-      <w:pPr>
-        <w:pStyle w:val="Listenabsatz"/>
-        <w:numPr>
-          <w:ilvl w:val="1"/>
-          <w:numId w:val="3"/>
-        </w:numPr>
-        <w:rPr>
-          <w:lang w:val="de-DE"/>
-        </w:rPr>
-      </w:pPr>
-      <w:r>
-        <w:rPr>
-          <w:lang w:val="de-DE"/>
-        </w:rPr>
-        <w:t>Mit Klick auf einen Button</w:t>
-      </w:r>
-      <w:r>
-        <w:rPr>
-          <w:lang w:val="de-DE"/>
-        </w:rPr>
-        <w:t xml:space="preserve"> werden die Buttons für die Steuerung (rechts und links) mit den Buttons Gas und Bremse gewechselt</w:t>
-      </w:r>
-      <w:r>
-        <w:rPr>
-          <w:lang w:val="de-DE"/>
-        </w:rPr>
-        <w:t>.</w:t>
-      </w:r>
-    </w:p>
-    <w:p>
-      <w:pPr>
-        <w:pStyle w:val="Listenabsatz"/>
-        <w:numPr>
-          <w:ilvl w:val="0"/>
-          <w:numId w:val="3"/>
-        </w:numPr>
-        <w:rPr>
-          <w:lang w:val="de-DE"/>
-        </w:rPr>
-      </w:pPr>
-      <w:r>
-        <w:rPr>
-          <w:lang w:val="de-DE"/>
-        </w:rPr>
-        <w:t>SAF38: Semi-autonomes Fahren:</w:t>
-      </w:r>
-    </w:p>
-    <w:p>
-      <w:pPr>
-        <w:pStyle w:val="Listenabsatz"/>
-        <w:numPr>
-          <w:ilvl w:val="1"/>
-          <w:numId w:val="3"/>
-        </w:numPr>
-        <w:rPr>
-          <w:lang w:val="de-DE"/>
-        </w:rPr>
-      </w:pPr>
-      <w:r>
-        <w:rPr>
-          <w:lang w:val="de-DE"/>
-        </w:rPr>
-        <w:t>Steuerung des Autos (Komponenten: Links, Rechts, Gas, Bremse, Licht).</w:t>
-      </w:r>
-    </w:p>
-    <w:p>
-      <w:pPr>
-        <w:pStyle w:val="Listenabsatz"/>
-        <w:numPr>
-          <w:ilvl w:val="1"/>
-          <w:numId w:val="3"/>
-        </w:numPr>
-        <w:rPr>
-          <w:lang w:val="de-DE"/>
-        </w:rPr>
-      </w:pPr>
-      <w:r>
-        <w:rPr>
-          <w:lang w:val="de-DE"/>
-        </w:rPr>
-        <w:t>Einlesen von Sensordaten</w:t>
-      </w:r>
-      <w:r>
-        <w:rPr>
-          <w:lang w:val="de-DE"/>
-        </w:rPr>
-        <w:t xml:space="preserve"> durch das Auto. </w:t>
-      </w:r>
-    </w:p>
-    <w:p>
-      <w:pPr>
-        <w:pStyle w:val="Listenabsatz"/>
-        <w:numPr>
-          <w:ilvl w:val="1"/>
-          <w:numId w:val="3"/>
-        </w:numPr>
-        <w:rPr>
-          <w:lang w:val="de-DE"/>
-        </w:rPr>
-      </w:pPr>
-      <w:r>
-        <w:rPr>
-          <w:lang w:val="de-DE"/>
-        </w:rPr>
-        <w:t>Steuerung des Autos durch den Benutzer</w:t>
-      </w:r>
-      <w:r>
-        <w:rPr>
-          <w:lang w:val="de-DE"/>
-        </w:rPr>
-        <w:t>.</w:t>
-      </w:r>
-    </w:p>
-    <w:p>
-      <w:pPr>
-        <w:pStyle w:val="Listenabsatz"/>
-        <w:numPr>
-          <w:ilvl w:val="1"/>
-          <w:numId w:val="3"/>
-        </w:numPr>
-        <w:rPr>
-          <w:lang w:val="de-DE"/>
-        </w:rPr>
-      </w:pPr>
-      <w:r>
-        <w:rPr>
-          <w:lang w:val="de-DE"/>
-        </w:rPr>
-        <w:t>Reaktion des Autos auf die eingelesenen Daten mit Stoppen oder Ausweichen des Autos</w:t>
-      </w:r>
-      <w:r>
-        <w:rPr>
-          <w:lang w:val="de-DE"/>
-        </w:rPr>
-        <w:t>.</w:t>
-      </w:r>
-    </w:p>
-    <w:p>
-      <w:pPr>
-        <w:pStyle w:val="Listenabsatz"/>
-        <w:numPr>
-          <w:ilvl w:val="0"/>
-          <w:numId w:val="3"/>
-        </w:numPr>
-        <w:rPr>
-          <w:lang w:val="de-DE"/>
-        </w:rPr>
-      </w:pPr>
-      <w:r>
-        <w:rPr>
-          <w:lang w:val="de-DE"/>
-        </w:rPr>
-        <w:t>AF45: autonomes Fahren:</w:t>
-      </w:r>
-    </w:p>
-    <w:p>
-      <w:pPr>
-        <w:pStyle w:val="Listenabsatz"/>
-        <w:numPr>
-          <w:ilvl w:val="1"/>
-          <w:numId w:val="3"/>
-        </w:numPr>
-        <w:rPr>
-          <w:lang w:val="de-DE"/>
-        </w:rPr>
-      </w:pPr>
-      <w:r>
-        <w:rPr>
-          <w:lang w:val="de-DE"/>
-        </w:rPr>
-        <w:t>Autonomes Fahren (Start und Stopp).</w:t>
-      </w:r>
-    </w:p>
-    <w:p>
-      <w:pPr>
-        <w:pStyle w:val="Listenabsatz"/>
-        <w:numPr>
-          <w:ilvl w:val="1"/>
-          <w:numId w:val="3"/>
-        </w:numPr>
-        <w:rPr>
-          <w:lang w:val="de-DE"/>
-        </w:rPr>
-      </w:pPr>
-      <w:r>
-        <w:rPr>
-          <w:lang w:val="de-DE"/>
-        </w:rPr>
-        <w:t>Einlesen von Sensordaten.</w:t>
-      </w:r>
-    </w:p>
-    <w:p>
-      <w:pPr>
-        <w:pStyle w:val="Listenabsatz"/>
-        <w:numPr>
-          <w:ilvl w:val="1"/>
-          <w:numId w:val="3"/>
-        </w:numPr>
-        <w:rPr>
-          <w:lang w:val="de-DE"/>
-        </w:rPr>
-      </w:pPr>
-      <w:r>
-        <w:rPr>
-          <w:lang w:val="de-DE"/>
-        </w:rPr>
-        <w:t>Algorithmus zum Selbstfahren des Autos in einem bestimmten Bereich.</w:t>
-      </w:r>
-    </w:p>
-    <w:p>
-      <w:pPr>
-        <w:pStyle w:val="Listenabsatz"/>
-        <w:numPr>
-          <w:ilvl w:val="0"/>
-          <w:numId w:val="3"/>
-        </w:numPr>
-        <w:rPr>
-          <w:lang w:val="de-DE"/>
-        </w:rPr>
-      </w:pPr>
-      <w:r>
-        <w:rPr>
-          <w:lang w:val="de-DE"/>
-        </w:rPr>
-        <w:t xml:space="preserve">KR54: </w:t>
-      </w:r>
-      <w:r>
-        <w:rPr>
-          <w:lang w:val="de-DE"/>
-        </w:rPr>
-        <w:t>Karte des Raums:</w:t>
-      </w:r>
-      <w:r>
-        <w:rPr>
-          <w:lang w:val="de-DE"/>
-        </w:rPr>
-        <w:tab/>
-      </w:r>
-    </w:p>
-    <w:p>
-      <w:pPr>
-        <w:pStyle w:val="Listenabsatz"/>
-        <w:numPr>
-          <w:ilvl w:val="1"/>
-          <w:numId w:val="3"/>
-        </w:numPr>
-        <w:rPr>
-          <w:lang w:val="de-DE"/>
-        </w:rPr>
-      </w:pPr>
-      <w:r>
-        <w:rPr>
-          <w:lang w:val="de-DE"/>
-        </w:rPr>
-        <w:t>Kartenansicht im Benutzerinterface.</w:t>
-      </w:r>
-    </w:p>
-    <w:p>
-      <w:pPr>
-        <w:pStyle w:val="Listenabsatz"/>
-        <w:numPr>
-          <w:ilvl w:val="1"/>
-          <w:numId w:val="3"/>
-        </w:numPr>
-        <w:rPr>
-          <w:lang w:val="de-DE"/>
-        </w:rPr>
-      </w:pPr>
-      <w:r>
-        <w:rPr>
-          <w:lang w:val="de-DE"/>
-        </w:rPr>
-        <w:t>Scannen des Raums durch das Auto und anschließend Anzeige der Karte.</w:t>
-      </w:r>
-    </w:p>
-    <w:p>
-      <w:pPr>
-        <w:pStyle w:val="Listenabsatz"/>
-        <w:numPr>
-          <w:ilvl w:val="1"/>
-          <w:numId w:val="3"/>
-        </w:numPr>
-        <w:rPr>
-          <w:lang w:val="de-DE"/>
-        </w:rPr>
-      </w:pPr>
-      <w:r>
-        <w:rPr>
-          <w:lang w:val="de-DE"/>
-        </w:rPr>
-        <w:t>Zeichnen des Weges auf der Karte mittels Touch Screen, welchem das Auto anschließend folgt.</w:t>
-      </w:r>
-    </w:p>
-    <w:p>
-      <w:pPr>
-        <w:pStyle w:val="Listenabsatz"/>
-        <w:numPr>
-          <w:ilvl w:val="0"/>
-          <w:numId w:val="3"/>
-        </w:numPr>
-        <w:rPr>
-          <w:lang w:val="de-DE"/>
-        </w:rPr>
-      </w:pPr>
-      <w:r>
-        <w:rPr>
-          <w:lang w:val="de-DE"/>
-        </w:rPr>
-        <w:t xml:space="preserve">EF53: Erklärung der Funktionsweisen: </w:t>
-      </w:r>
-    </w:p>
-    <w:p>
-      <w:pPr>
-        <w:pStyle w:val="Listenabsatz"/>
-        <w:numPr>
-          <w:ilvl w:val="1"/>
-          <w:numId w:val="3"/>
-        </w:numPr>
-        <w:rPr>
-          <w:lang w:val="de-DE"/>
-        </w:rPr>
-      </w:pPr>
-      <w:r>
-        <w:rPr>
-          <w:lang w:val="de-DE"/>
-        </w:rPr>
-        <w:t>Pop-up mit einer Erklärung der Funktionsweise und Steuerung nach Klicken eines Buttons</w:t>
-      </w:r>
-      <w:r>
-        <w:rPr>
-          <w:lang w:val="de-DE"/>
-        </w:rPr>
-        <w:t xml:space="preserve"> auf der Auswahlseite der Modi.</w:t>
-      </w:r>
-    </w:p>
-    <w:p>
-      <w:pPr>
         <w:pStyle w:val="berschrift2"/>
         <w:rPr>
           <w:lang w:val="de-DE"/>
         </w:rPr>
       </w:pPr>
-      <w:bookmarkStart w:id="3" w:name="_Toc215650438"/>
+      <w:bookmarkStart w:id="4" w:name="_Toc216338486"/>
       <w:r>
         <w:rPr>
           <w:lang w:val="de-DE"/>
@@ -3432,7 +5183,7 @@
         </w:rPr>
         <w:t xml:space="preserve"> zur Umsetzung</w:t>
       </w:r>
-      <w:bookmarkEnd w:id="3"/>
+      <w:bookmarkEnd w:id="4"/>
     </w:p>
     <w:p>
       <w:pPr>
@@ -3503,7 +5254,19 @@
         <w:rPr>
           <w:lang w:val="de-DE"/>
         </w:rPr>
-        <w:t>Benötigte Hardware Komponenten: ESP12 Shield Board (Elektrische Komponenten), ESP8266 12E (Logik und Access Point), HC-SR04 (Ultraschallsensor), LED für Unterbodenbeleuchtung, Auto</w:t>
+        <w:t>Benötigte Hardware Komponenten: ESP12</w:t>
+      </w:r>
+      <w:r>
+        <w:rPr>
+          <w:lang w:val="de-DE"/>
+        </w:rPr>
+        <w:t>E</w:t>
+      </w:r>
+      <w:r>
+        <w:rPr>
+          <w:lang w:val="de-DE"/>
+        </w:rPr>
+        <w:t xml:space="preserve"> Shield Board (Elektrische Komponenten), ESP8266 12E (Logik und Access Point), HC-SR04 (Ultraschallsensor), LED für Unterbodenbeleuchtung, Auto</w:t>
       </w:r>
     </w:p>
     <w:p>
@@ -3626,7 +5389,7 @@
           <w:lang w:val="de-DE"/>
         </w:rPr>
         <w:sectPr>
-          <w:headerReference w:type="default" r:id="rId19"/>
+          <w:headerReference w:type="default" r:id="rId20"/>
           <w:pgSz w:w="11906" w:h="16838"/>
           <w:pgMar w:top="1440" w:right="1440" w:bottom="1440" w:left="1440" w:header="708" w:footer="708" w:gutter="0"/>
           <w:pgNumType w:start="0"/>
@@ -3643,7 +5406,7 @@
           <w:lang w:val="de-DE"/>
         </w:rPr>
       </w:pPr>
-      <w:bookmarkStart w:id="4" w:name="_Toc215650439"/>
+      <w:bookmarkStart w:id="5" w:name="_Toc216338487"/>
       <w:r>
         <w:rPr>
           <w:lang w:val="de-DE"/>
@@ -3651,7 +5414,7 @@
         <w:lastRenderedPageBreak/>
         <w:t>Entwurf</w:t>
       </w:r>
-      <w:bookmarkEnd w:id="4"/>
+      <w:bookmarkEnd w:id="5"/>
       <w:r>
         <w:rPr>
           <w:lang w:val="de-DE"/>
@@ -3666,14 +5429,14 @@
           <w:lang w:val="de-DE"/>
         </w:rPr>
       </w:pPr>
-      <w:bookmarkStart w:id="5" w:name="_Toc215650440"/>
+      <w:bookmarkStart w:id="6" w:name="_Toc216338488"/>
       <w:r>
         <w:rPr>
           <w:noProof/>
           <w:lang w:val="de-DE"/>
         </w:rPr>
         <w:drawing>
-          <wp:anchor distT="0" distB="0" distL="114300" distR="114300" simplePos="0" relativeHeight="251664391" behindDoc="0" locked="0" layoutInCell="1" allowOverlap="1" wp14:anchorId="4FEF5557" wp14:editId="5A1B3393">
+          <wp:anchor distT="0" distB="0" distL="114300" distR="114300" simplePos="0" relativeHeight="251658249" behindDoc="0" locked="0" layoutInCell="1" allowOverlap="1" wp14:anchorId="4FEF5557" wp14:editId="5A1B3393">
             <wp:simplePos x="0" y="0"/>
             <wp:positionH relativeFrom="column">
               <wp:posOffset>781685</wp:posOffset>
@@ -3696,7 +5459,7 @@
                     <pic:cNvPicPr/>
                   </pic:nvPicPr>
                   <pic:blipFill rotWithShape="1">
-                    <a:blip r:embed="rId20" cstate="print">
+                    <a:blip r:embed="rId21" cstate="print">
                       <a:extLst>
                         <a:ext uri="{28A0092B-C50C-407E-A947-70E740481C1C}">
                           <a14:useLocalDpi xmlns:a14="http://schemas.microsoft.com/office/drawing/2010/main" val="0"/>
@@ -3745,7 +5508,7 @@
         </w:rPr>
         <w:t>Entwurf der Hardwarekomponenten am Auto</w:t>
       </w:r>
-      <w:bookmarkEnd w:id="5"/>
+      <w:bookmarkEnd w:id="6"/>
     </w:p>
     <w:p>
       <w:pPr>
@@ -3761,7 +5524,7 @@
           <w:lang w:val="de-DE"/>
         </w:rPr>
         <w:sectPr>
-          <w:headerReference w:type="first" r:id="rId21"/>
+          <w:headerReference w:type="first" r:id="rId22"/>
           <w:pgSz w:w="16838" w:h="11906" w:orient="landscape"/>
           <w:pgMar w:top="0" w:right="816" w:bottom="567" w:left="720" w:header="709" w:footer="709" w:gutter="0"/>
           <w:pgNumType w:start="0"/>
@@ -3779,7 +5542,7 @@
           <w:lang w:val="de-DE"/>
         </w:rPr>
       </w:pPr>
-      <w:bookmarkStart w:id="6" w:name="_Toc215650441"/>
+      <w:bookmarkStart w:id="7" w:name="_Toc216338489"/>
       <w:r>
         <w:rPr>
           <w:lang w:val="de-DE"/>
@@ -3793,7 +5556,7 @@
         </w:rPr>
         <w:t>für die Applikation</w:t>
       </w:r>
-      <w:bookmarkEnd w:id="6"/>
+      <w:bookmarkEnd w:id="7"/>
     </w:p>
     <w:p>
       <w:pPr>
@@ -3836,14 +5599,14 @@
           <w:lang w:val="de-DE"/>
         </w:rPr>
       </w:pPr>
-      <w:bookmarkStart w:id="7" w:name="_Toc215650442"/>
+      <w:bookmarkStart w:id="8" w:name="_Toc216338490"/>
       <w:r>
         <w:rPr>
           <w:noProof/>
           <w:lang w:val="de-DE"/>
         </w:rPr>
         <w:drawing>
-          <wp:anchor distT="0" distB="0" distL="114300" distR="114300" simplePos="0" relativeHeight="251671559" behindDoc="0" locked="0" layoutInCell="1" allowOverlap="1" wp14:anchorId="512DD5B0" wp14:editId="3C166E66">
+          <wp:anchor distT="0" distB="0" distL="114300" distR="114300" simplePos="0" relativeHeight="251658255" behindDoc="0" locked="0" layoutInCell="1" allowOverlap="1" wp14:anchorId="512DD5B0" wp14:editId="16636349">
             <wp:simplePos x="0" y="0"/>
             <wp:positionH relativeFrom="column">
               <wp:posOffset>1435</wp:posOffset>
@@ -3866,7 +5629,7 @@
                     <pic:cNvPicPr/>
                   </pic:nvPicPr>
                   <pic:blipFill rotWithShape="1">
-                    <a:blip r:embed="rId22" cstate="print">
+                    <a:blip r:embed="rId23" cstate="print">
                       <a:extLst>
                         <a:ext uri="{28A0092B-C50C-407E-A947-70E740481C1C}">
                           <a14:useLocalDpi xmlns:a14="http://schemas.microsoft.com/office/drawing/2010/main" val="0"/>
@@ -3913,7 +5676,7 @@
         </w:rPr>
         <w:t>Willkommensseite</w:t>
       </w:r>
-      <w:bookmarkEnd w:id="7"/>
+      <w:bookmarkEnd w:id="8"/>
     </w:p>
     <w:p>
       <w:pPr>
@@ -3965,14 +5728,14 @@
           <w:lang w:val="de-DE"/>
         </w:rPr>
       </w:pPr>
-      <w:bookmarkStart w:id="8" w:name="_Toc215650443"/>
+      <w:bookmarkStart w:id="9" w:name="_Toc216338491"/>
       <w:r>
         <w:rPr>
           <w:lang w:val="de-DE"/>
         </w:rPr>
         <w:t>Auswahlmenü</w:t>
       </w:r>
-      <w:bookmarkEnd w:id="8"/>
+      <w:bookmarkEnd w:id="9"/>
     </w:p>
     <w:p>
       <w:pPr>
@@ -4003,7 +5766,7 @@
                     <pic:cNvPicPr/>
                   </pic:nvPicPr>
                   <pic:blipFill>
-                    <a:blip r:embed="rId23">
+                    <a:blip r:embed="rId24">
                       <a:extLst>
                         <a:ext uri="{28A0092B-C50C-407E-A947-70E740481C1C}">
                           <a14:useLocalDpi xmlns:a14="http://schemas.microsoft.com/office/drawing/2010/main" val="0"/>
@@ -4083,14 +5846,14 @@
           <w:lang w:val="de-DE"/>
         </w:rPr>
       </w:pPr>
-      <w:bookmarkStart w:id="9" w:name="_Toc215650444"/>
+      <w:bookmarkStart w:id="10" w:name="_Toc216338492"/>
       <w:r>
         <w:rPr>
           <w:lang w:val="de-DE"/>
         </w:rPr>
         <w:t>Fahrmodus</w:t>
       </w:r>
-      <w:bookmarkEnd w:id="9"/>
+      <w:bookmarkEnd w:id="10"/>
     </w:p>
     <w:p>
       <w:pPr>
@@ -4107,7 +5870,7 @@
           <w:lang w:val="de-DE"/>
         </w:rPr>
         <w:drawing>
-          <wp:anchor distT="0" distB="0" distL="114300" distR="114300" simplePos="0" relativeHeight="251672583" behindDoc="0" locked="0" layoutInCell="1" allowOverlap="1" wp14:anchorId="438F90ED" wp14:editId="10342905">
+          <wp:anchor distT="0" distB="0" distL="114300" distR="114300" simplePos="0" relativeHeight="251658256" behindDoc="0" locked="0" layoutInCell="1" allowOverlap="1" wp14:anchorId="438F90ED" wp14:editId="03635FEB">
             <wp:simplePos x="0" y="0"/>
             <wp:positionH relativeFrom="column">
               <wp:posOffset>9525</wp:posOffset>
@@ -4130,7 +5893,7 @@
                     <pic:cNvPicPr/>
                   </pic:nvPicPr>
                   <pic:blipFill rotWithShape="1">
-                    <a:blip r:embed="rId24" cstate="print">
+                    <a:blip r:embed="rId25" cstate="print">
                       <a:extLst>
                         <a:ext uri="{28A0092B-C50C-407E-A947-70E740481C1C}">
                           <a14:useLocalDpi xmlns:a14="http://schemas.microsoft.com/office/drawing/2010/main" val="0"/>
@@ -4183,6 +5946,7 @@
         </w:rPr>
         <w:t xml:space="preserve">soll das Auto aber in diesem Modus Hindernisse eigenständig erkennen und ihnen ausweichen. Bei </w:t>
       </w:r>
+      <w:proofErr w:type="spellStart"/>
       <w:r>
         <w:rPr>
           <w:i/>
@@ -4191,6 +5955,7 @@
         </w:rPr>
         <w:t>Accelerate</w:t>
       </w:r>
+      <w:proofErr w:type="spellEnd"/>
       <w:r>
         <w:rPr>
           <w:lang w:val="de-DE"/>
@@ -4211,45 +5976,29 @@
         </w:rPr>
         <w:t xml:space="preserve">bremsen. Mit </w:t>
       </w:r>
+      <w:proofErr w:type="spellStart"/>
       <w:r>
         <w:rPr>
           <w:i/>
           <w:iCs/>
           <w:lang w:val="de-DE"/>
         </w:rPr>
-        <w:t xml:space="preserve">Left </w:t>
-      </w:r>
-      <w:r>
-        <w:rPr>
-          <w:lang w:val="de-DE"/>
-        </w:rPr>
-        <w:t xml:space="preserve">und </w:t>
-      </w:r>
+        <w:t>Left</w:t>
+      </w:r>
+      <w:proofErr w:type="spellEnd"/>
       <w:r>
         <w:rPr>
           <w:i/>
           <w:iCs/>
           <w:lang w:val="de-DE"/>
         </w:rPr>
-        <w:t xml:space="preserve">Right </w:t>
-      </w:r>
-      <w:r>
-        <w:rPr>
-          <w:lang w:val="de-DE"/>
-        </w:rPr>
-        <w:t xml:space="preserve">soll die Richtung bestimmt werden können. </w:t>
-      </w:r>
-      <w:r>
-        <w:rPr>
-          <w:lang w:val="de-DE"/>
-        </w:rPr>
-        <w:t>Mithilfe von Invert Controls soll es die Möglichkeit geben, zwischen Rechts- und Linkshändermodus zu wechseln</w:t>
-      </w:r>
-      <w:r>
-        <w:rPr>
-          <w:lang w:val="de-DE"/>
-        </w:rPr>
-        <w:t xml:space="preserve">, indem dann die Button an der Seite vertauscht werden. </w:t>
+        <w:t xml:space="preserve"> </w:t>
+      </w:r>
+      <w:r>
+        <w:rPr>
+          <w:lang w:val="de-DE"/>
+        </w:rPr>
+        <w:t xml:space="preserve">und </w:t>
       </w:r>
       <w:r>
         <w:rPr>
@@ -4257,6 +6006,60 @@
           <w:iCs/>
           <w:lang w:val="de-DE"/>
         </w:rPr>
+        <w:t xml:space="preserve">Right </w:t>
+      </w:r>
+      <w:r>
+        <w:rPr>
+          <w:lang w:val="de-DE"/>
+        </w:rPr>
+        <w:t xml:space="preserve">soll die Richtung bestimmt werden können. </w:t>
+      </w:r>
+      <w:r>
+        <w:rPr>
+          <w:lang w:val="de-DE"/>
+        </w:rPr>
+        <w:t xml:space="preserve">Mithilfe von Invert Controls soll es die Möglichkeit geben, zwischen Rechts- und </w:t>
+      </w:r>
+      <w:proofErr w:type="spellStart"/>
+      <w:r>
+        <w:rPr>
+          <w:lang w:val="de-DE"/>
+        </w:rPr>
+        <w:t>Linkshändermodus</w:t>
+      </w:r>
+      <w:proofErr w:type="spellEnd"/>
+      <w:r>
+        <w:rPr>
+          <w:lang w:val="de-DE"/>
+        </w:rPr>
+        <w:t xml:space="preserve"> zu wechseln</w:t>
+      </w:r>
+      <w:r>
+        <w:rPr>
+          <w:lang w:val="de-DE"/>
+        </w:rPr>
+        <w:t xml:space="preserve">, indem dann </w:t>
+      </w:r>
+      <w:proofErr w:type="gramStart"/>
+      <w:r>
+        <w:rPr>
+          <w:lang w:val="de-DE"/>
+        </w:rPr>
+        <w:t>die Button</w:t>
+      </w:r>
+      <w:proofErr w:type="gramEnd"/>
+      <w:r>
+        <w:rPr>
+          <w:lang w:val="de-DE"/>
+        </w:rPr>
+        <w:t xml:space="preserve"> an der Seite vertauscht werden. </w:t>
+      </w:r>
+      <w:r>
+        <w:rPr>
+          <w:i/>
+          <w:iCs/>
+          <w:lang w:val="de-DE"/>
+        </w:rPr>
         <w:t>Light Off</w:t>
       </w:r>
       <w:r>
@@ -4309,14 +6112,14 @@
           <w:lang w:val="de-DE"/>
         </w:rPr>
       </w:pPr>
-      <w:bookmarkStart w:id="10" w:name="_Toc215650445"/>
+      <w:bookmarkStart w:id="11" w:name="_Toc216338493"/>
       <w:r>
         <w:rPr>
           <w:lang w:val="de-DE"/>
         </w:rPr>
         <w:t>Karte und Zeichenmodus</w:t>
       </w:r>
-      <w:bookmarkEnd w:id="10"/>
+      <w:bookmarkEnd w:id="11"/>
     </w:p>
     <w:p>
       <w:pPr>
@@ -4332,7 +6135,7 @@
           <w:lang w:val="de-DE"/>
         </w:rPr>
         <w:drawing>
-          <wp:anchor distT="0" distB="0" distL="114300" distR="114300" simplePos="0" relativeHeight="251673607" behindDoc="0" locked="0" layoutInCell="1" allowOverlap="1" wp14:anchorId="1696EA93" wp14:editId="39B5D835">
+          <wp:anchor distT="0" distB="0" distL="114300" distR="114300" simplePos="0" relativeHeight="251658257" behindDoc="0" locked="0" layoutInCell="1" allowOverlap="1" wp14:anchorId="1696EA93" wp14:editId="27019950">
             <wp:simplePos x="0" y="0"/>
             <wp:positionH relativeFrom="column">
               <wp:posOffset>0</wp:posOffset>
@@ -4355,7 +6158,7 @@
                     <pic:cNvPicPr/>
                   </pic:nvPicPr>
                   <pic:blipFill rotWithShape="1">
-                    <a:blip r:embed="rId25" cstate="print">
+                    <a:blip r:embed="rId26" cstate="print">
                       <a:extLst>
                         <a:ext uri="{28A0092B-C50C-407E-A947-70E740481C1C}">
                           <a14:useLocalDpi xmlns:a14="http://schemas.microsoft.com/office/drawing/2010/main" val="0"/>
@@ -4440,7 +6243,7 @@
           <w:lang w:val="de-DE"/>
         </w:rPr>
       </w:pPr>
-      <w:bookmarkStart w:id="11" w:name="_Toc215650446"/>
+      <w:bookmarkStart w:id="12" w:name="_Toc216338494"/>
       <w:r>
         <w:rPr>
           <w:lang w:val="de-DE"/>
@@ -4454,7 +6257,7 @@
         </w:rPr>
         <w:t>Fahren</w:t>
       </w:r>
-      <w:bookmarkEnd w:id="11"/>
+      <w:bookmarkEnd w:id="12"/>
     </w:p>
     <w:p>
       <w:pPr>
@@ -4477,7 +6280,7 @@
 </file>
 
 <file path=word/endnotes.xml><?xml version="1.0" encoding="utf-8"?>
-<w:endnotes xmlns:wpc="http://schemas.microsoft.com/office/word/2010/wordprocessingCanvas" xmlns:cx="http://schemas.microsoft.com/office/drawing/2014/chartex" xmlns:cx1="http://schemas.microsoft.com/office/drawing/2015/9/8/chartex" xmlns:cx2="http://schemas.microsoft.com/office/drawing/2015/10/21/chartex" xmlns:cx3="http://schemas.microsoft.com/office/drawing/2016/5/9/chartex" xmlns:cx4="http://schemas.microsoft.com/office/drawing/2016/5/10/chartex" xmlns:cx5="http://schemas.microsoft.com/office/drawing/2016/5/11/chartex" xmlns:cx6="http://schemas.microsoft.com/office/drawing/2016/5/12/chartex" xmlns:cx7="http://schemas.microsoft.com/office/drawing/2016/5/13/chartex" xmlns:cx8="http://schemas.microsoft.com/office/drawing/2016/5/14/chartex" xmlns:mc="http://schemas.openxmlformats.org/markup-compatibility/2006" xmlns:aink="http://schemas.microsoft.com/office/drawing/2016/ink" xmlns:am3d="http://schemas.microsoft.com/office/drawing/2017/model3d" xmlns:o="urn:schemas-microsoft-com:office:office" xmlns:oel="http://schemas.microsoft.com/office/2019/extlst" xmlns:r="http://schemas.openxmlformats.org/officeDocument/2006/relationships" xmlns:m="http://schemas.openxmlformats.org/officeDocument/2006/math" xmlns:v="urn:schemas-microsoft-com:vml" xmlns:wp14="http://schemas.microsoft.com/office/word/2010/wordprocessingDrawing" xmlns:wp="http://schemas.openxmlformats.org/drawingml/2006/wordprocessingDrawing" xmlns:w10="urn:schemas-microsoft-com:office:word" xmlns:w="http://schemas.openxmlformats.org/wordprocessingml/2006/main" xmlns:w14="http://schemas.microsoft.com/office/word/2010/wordml" xmlns:w15="http://schemas.microsoft.com/office/word/2012/wordml" xmlns:w16cex="http://schemas.microsoft.com/office/word/2018/wordml/cex" xmlns:w16cid="http://schemas.microsoft.com/office/word/2016/wordml/cid" xmlns:w16="http://schemas.microsoft.com/office/word/2018/wordml" xmlns:w16du="http://schemas.microsoft.com/office/word/2023/wordml/word16du" xmlns:w16sdtdh="http://schemas.microsoft.com/office/word/2020/wordml/sdtdatahash" xmlns:w16sdtfl="http://schemas.microsoft.com/office/word/2024/wordml/sdtformatlock" xmlns:w16se="http://schemas.microsoft.com/office/word/2015/wordml/symex" xmlns:wpg="http://schemas.microsoft.com/office/word/2010/wordprocessingGroup" xmlns:wpi="http://schemas.microsoft.com/office/word/2010/wordprocessingInk" xmlns:wne="http://schemas.microsoft.com/office/word/2006/wordml" xmlns:wps="http://schemas.microsoft.com/office/word/2010/wordprocessingShape" mc:Ignorable="w14 w15 w16se w16cid w16 w16cex w16sdtdh w16sdtfl w16du wp14">
+<w:endnotes xmlns:wpc="http://schemas.microsoft.com/office/word/2010/wordprocessingCanvas" xmlns:cx="http://schemas.microsoft.com/office/drawing/2014/chartex" xmlns:cx1="http://schemas.microsoft.com/office/drawing/2015/9/8/chartex" xmlns:cx2="http://schemas.microsoft.com/office/drawing/2015/10/21/chartex" xmlns:cx3="http://schemas.microsoft.com/office/drawing/2016/5/9/chartex" xmlns:cx4="http://schemas.microsoft.com/office/drawing/2016/5/10/chartex" xmlns:cx5="http://schemas.microsoft.com/office/drawing/2016/5/11/chartex" xmlns:cx6="http://schemas.microsoft.com/office/drawing/2016/5/12/chartex" xmlns:cx7="http://schemas.microsoft.com/office/drawing/2016/5/13/chartex" xmlns:cx8="http://schemas.microsoft.com/office/drawing/2016/5/14/chartex" xmlns:mc="http://schemas.openxmlformats.org/markup-compatibility/2006" xmlns:aink="http://schemas.microsoft.com/office/drawing/2016/ink" xmlns:am3d="http://schemas.microsoft.com/office/drawing/2017/model3d" xmlns:o="urn:schemas-microsoft-com:office:office" xmlns:oel="http://schemas.microsoft.com/office/2019/extlst" xmlns:r="http://schemas.openxmlformats.org/officeDocument/2006/relationships" xmlns:m="http://schemas.openxmlformats.org/officeDocument/2006/math" xmlns:v="urn:schemas-microsoft-com:vml" xmlns:wp14="http://schemas.microsoft.com/office/word/2010/wordprocessingDrawing" xmlns:wp="http://schemas.openxmlformats.org/drawingml/2006/wordprocessingDrawing" xmlns:w10="urn:schemas-microsoft-com:office:word" xmlns:w="http://schemas.openxmlformats.org/wordprocessingml/2006/main" xmlns:w14="http://schemas.microsoft.com/office/word/2010/wordml" xmlns:w15="http://schemas.microsoft.com/office/word/2012/wordml" xmlns:w16cex="http://schemas.microsoft.com/office/word/2018/wordml/cex" xmlns:w16cid="http://schemas.microsoft.com/office/word/2016/wordml/cid" xmlns:w16="http://schemas.microsoft.com/office/word/2018/wordml" xmlns:w16sdtdh="http://schemas.microsoft.com/office/word/2020/wordml/sdtdatahash" xmlns:w16se="http://schemas.microsoft.com/office/word/2015/wordml/symex" xmlns:wpg="http://schemas.microsoft.com/office/word/2010/wordprocessingGroup" xmlns:wpi="http://schemas.microsoft.com/office/word/2010/wordprocessingInk" xmlns:wne="http://schemas.microsoft.com/office/word/2006/wordml" xmlns:wps="http://schemas.microsoft.com/office/word/2010/wordprocessingShape" mc:Ignorable="w14 w15 w16se w16cid w16 w16cex w16sdtdh wp14">
   <w:endnote w:type="separator" w:id="-1">
     <w:p>
       <w:r>
@@ -4496,7 +6299,7 @@
 </file>
 
 <file path=word/footnotes.xml><?xml version="1.0" encoding="utf-8"?>
-<w:footnotes xmlns:wpc="http://schemas.microsoft.com/office/word/2010/wordprocessingCanvas" xmlns:cx="http://schemas.microsoft.com/office/drawing/2014/chartex" xmlns:cx1="http://schemas.microsoft.com/office/drawing/2015/9/8/chartex" xmlns:cx2="http://schemas.microsoft.com/office/drawing/2015/10/21/chartex" xmlns:cx3="http://schemas.microsoft.com/office/drawing/2016/5/9/chartex" xmlns:cx4="http://schemas.microsoft.com/office/drawing/2016/5/10/chartex" xmlns:cx5="http://schemas.microsoft.com/office/drawing/2016/5/11/chartex" xmlns:cx6="http://schemas.microsoft.com/office/drawing/2016/5/12/chartex" xmlns:cx7="http://schemas.microsoft.com/office/drawing/2016/5/13/chartex" xmlns:cx8="http://schemas.microsoft.com/office/drawing/2016/5/14/chartex" xmlns:mc="http://schemas.openxmlformats.org/markup-compatibility/2006" xmlns:aink="http://schemas.microsoft.com/office/drawing/2016/ink" xmlns:am3d="http://schemas.microsoft.com/office/drawing/2017/model3d" xmlns:o="urn:schemas-microsoft-com:office:office" xmlns:oel="http://schemas.microsoft.com/office/2019/extlst" xmlns:r="http://schemas.openxmlformats.org/officeDocument/2006/relationships" xmlns:m="http://schemas.openxmlformats.org/officeDocument/2006/math" xmlns:v="urn:schemas-microsoft-com:vml" xmlns:wp14="http://schemas.microsoft.com/office/word/2010/wordprocessingDrawing" xmlns:wp="http://schemas.openxmlformats.org/drawingml/2006/wordprocessingDrawing" xmlns:w10="urn:schemas-microsoft-com:office:word" xmlns:w="http://schemas.openxmlformats.org/wordprocessingml/2006/main" xmlns:w14="http://schemas.microsoft.com/office/word/2010/wordml" xmlns:w15="http://schemas.microsoft.com/office/word/2012/wordml" xmlns:w16cex="http://schemas.microsoft.com/office/word/2018/wordml/cex" xmlns:w16cid="http://schemas.microsoft.com/office/word/2016/wordml/cid" xmlns:w16="http://schemas.microsoft.com/office/word/2018/wordml" xmlns:w16du="http://schemas.microsoft.com/office/word/2023/wordml/word16du" xmlns:w16sdtdh="http://schemas.microsoft.com/office/word/2020/wordml/sdtdatahash" xmlns:w16sdtfl="http://schemas.microsoft.com/office/word/2024/wordml/sdtformatlock" xmlns:w16se="http://schemas.microsoft.com/office/word/2015/wordml/symex" xmlns:wpg="http://schemas.microsoft.com/office/word/2010/wordprocessingGroup" xmlns:wpi="http://schemas.microsoft.com/office/word/2010/wordprocessingInk" xmlns:wne="http://schemas.microsoft.com/office/word/2006/wordml" xmlns:wps="http://schemas.microsoft.com/office/word/2010/wordprocessingShape" mc:Ignorable="w14 w15 w16se w16cid w16 w16cex w16sdtdh w16sdtfl w16du wp14">
+<w:footnotes xmlns:wpc="http://schemas.microsoft.com/office/word/2010/wordprocessingCanvas" xmlns:cx="http://schemas.microsoft.com/office/drawing/2014/chartex" xmlns:cx1="http://schemas.microsoft.com/office/drawing/2015/9/8/chartex" xmlns:cx2="http://schemas.microsoft.com/office/drawing/2015/10/21/chartex" xmlns:cx3="http://schemas.microsoft.com/office/drawing/2016/5/9/chartex" xmlns:cx4="http://schemas.microsoft.com/office/drawing/2016/5/10/chartex" xmlns:cx5="http://schemas.microsoft.com/office/drawing/2016/5/11/chartex" xmlns:cx6="http://schemas.microsoft.com/office/drawing/2016/5/12/chartex" xmlns:cx7="http://schemas.microsoft.com/office/drawing/2016/5/13/chartex" xmlns:cx8="http://schemas.microsoft.com/office/drawing/2016/5/14/chartex" xmlns:mc="http://schemas.openxmlformats.org/markup-compatibility/2006" xmlns:aink="http://schemas.microsoft.com/office/drawing/2016/ink" xmlns:am3d="http://schemas.microsoft.com/office/drawing/2017/model3d" xmlns:o="urn:schemas-microsoft-com:office:office" xmlns:oel="http://schemas.microsoft.com/office/2019/extlst" xmlns:r="http://schemas.openxmlformats.org/officeDocument/2006/relationships" xmlns:m="http://schemas.openxmlformats.org/officeDocument/2006/math" xmlns:v="urn:schemas-microsoft-com:vml" xmlns:wp14="http://schemas.microsoft.com/office/word/2010/wordprocessingDrawing" xmlns:wp="http://schemas.openxmlformats.org/drawingml/2006/wordprocessingDrawing" xmlns:w10="urn:schemas-microsoft-com:office:word" xmlns:w="http://schemas.openxmlformats.org/wordprocessingml/2006/main" xmlns:w14="http://schemas.microsoft.com/office/word/2010/wordml" xmlns:w15="http://schemas.microsoft.com/office/word/2012/wordml" xmlns:w16cex="http://schemas.microsoft.com/office/word/2018/wordml/cex" xmlns:w16cid="http://schemas.microsoft.com/office/word/2016/wordml/cid" xmlns:w16="http://schemas.microsoft.com/office/word/2018/wordml" xmlns:w16sdtdh="http://schemas.microsoft.com/office/word/2020/wordml/sdtdatahash" xmlns:w16se="http://schemas.microsoft.com/office/word/2015/wordml/symex" xmlns:wpg="http://schemas.microsoft.com/office/word/2010/wordprocessingGroup" xmlns:wpi="http://schemas.microsoft.com/office/word/2010/wordprocessingInk" xmlns:wne="http://schemas.microsoft.com/office/word/2006/wordml" xmlns:wps="http://schemas.microsoft.com/office/word/2010/wordprocessingShape" mc:Ignorable="w14 w15 w16se w16cid w16 w16cex w16sdtdh wp14">
   <w:footnote w:type="separator" w:id="-1">
     <w:p>
       <w:r>
@@ -4515,7 +6318,7 @@
 </file>
 
 <file path=word/header1.xml><?xml version="1.0" encoding="utf-8"?>
-<w:hdr xmlns:wpc="http://schemas.microsoft.com/office/word/2010/wordprocessingCanvas" xmlns:cx="http://schemas.microsoft.com/office/drawing/2014/chartex" xmlns:cx1="http://schemas.microsoft.com/office/drawing/2015/9/8/chartex" xmlns:cx2="http://schemas.microsoft.com/office/drawing/2015/10/21/chartex" xmlns:cx3="http://schemas.microsoft.com/office/drawing/2016/5/9/chartex" xmlns:cx4="http://schemas.microsoft.com/office/drawing/2016/5/10/chartex" xmlns:cx5="http://schemas.microsoft.com/office/drawing/2016/5/11/chartex" xmlns:cx6="http://schemas.microsoft.com/office/drawing/2016/5/12/chartex" xmlns:cx7="http://schemas.microsoft.com/office/drawing/2016/5/13/chartex" xmlns:cx8="http://schemas.microsoft.com/office/drawing/2016/5/14/chartex" xmlns:mc="http://schemas.openxmlformats.org/markup-compatibility/2006" xmlns:aink="http://schemas.microsoft.com/office/drawing/2016/ink" xmlns:am3d="http://schemas.microsoft.com/office/drawing/2017/model3d" xmlns:o="urn:schemas-microsoft-com:office:office" xmlns:oel="http://schemas.microsoft.com/office/2019/extlst" xmlns:r="http://schemas.openxmlformats.org/officeDocument/2006/relationships" xmlns:m="http://schemas.openxmlformats.org/officeDocument/2006/math" xmlns:v="urn:schemas-microsoft-com:vml" xmlns:wp14="http://schemas.microsoft.com/office/word/2010/wordprocessingDrawing" xmlns:wp="http://schemas.openxmlformats.org/drawingml/2006/wordprocessingDrawing" xmlns:w10="urn:schemas-microsoft-com:office:word" xmlns:w="http://schemas.openxmlformats.org/wordprocessingml/2006/main" xmlns:w14="http://schemas.microsoft.com/office/word/2010/wordml" xmlns:w15="http://schemas.microsoft.com/office/word/2012/wordml" xmlns:w16cex="http://schemas.microsoft.com/office/word/2018/wordml/cex" xmlns:w16cid="http://schemas.microsoft.com/office/word/2016/wordml/cid" xmlns:w16="http://schemas.microsoft.com/office/word/2018/wordml" xmlns:w16du="http://schemas.microsoft.com/office/word/2023/wordml/word16du" xmlns:w16sdtdh="http://schemas.microsoft.com/office/word/2020/wordml/sdtdatahash" xmlns:w16sdtfl="http://schemas.microsoft.com/office/word/2024/wordml/sdtformatlock" xmlns:w16se="http://schemas.microsoft.com/office/word/2015/wordml/symex" xmlns:wpg="http://schemas.microsoft.com/office/word/2010/wordprocessingGroup" xmlns:wpi="http://schemas.microsoft.com/office/word/2010/wordprocessingInk" xmlns:wne="http://schemas.microsoft.com/office/word/2006/wordml" xmlns:wps="http://schemas.microsoft.com/office/word/2010/wordprocessingShape" mc:Ignorable="w14 w15 w16se w16cid w16 w16cex w16sdtdh w16sdtfl w16du wp14">
+<w:hdr xmlns:wpc="http://schemas.microsoft.com/office/word/2010/wordprocessingCanvas" xmlns:cx="http://schemas.microsoft.com/office/drawing/2014/chartex" xmlns:cx1="http://schemas.microsoft.com/office/drawing/2015/9/8/chartex" xmlns:cx2="http://schemas.microsoft.com/office/drawing/2015/10/21/chartex" xmlns:cx3="http://schemas.microsoft.com/office/drawing/2016/5/9/chartex" xmlns:cx4="http://schemas.microsoft.com/office/drawing/2016/5/10/chartex" xmlns:cx5="http://schemas.microsoft.com/office/drawing/2016/5/11/chartex" xmlns:cx6="http://schemas.microsoft.com/office/drawing/2016/5/12/chartex" xmlns:cx7="http://schemas.microsoft.com/office/drawing/2016/5/13/chartex" xmlns:cx8="http://schemas.microsoft.com/office/drawing/2016/5/14/chartex" xmlns:mc="http://schemas.openxmlformats.org/markup-compatibility/2006" xmlns:aink="http://schemas.microsoft.com/office/drawing/2016/ink" xmlns:am3d="http://schemas.microsoft.com/office/drawing/2017/model3d" xmlns:o="urn:schemas-microsoft-com:office:office" xmlns:oel="http://schemas.microsoft.com/office/2019/extlst" xmlns:r="http://schemas.openxmlformats.org/officeDocument/2006/relationships" xmlns:m="http://schemas.openxmlformats.org/officeDocument/2006/math" xmlns:v="urn:schemas-microsoft-com:vml" xmlns:wp14="http://schemas.microsoft.com/office/word/2010/wordprocessingDrawing" xmlns:wp="http://schemas.openxmlformats.org/drawingml/2006/wordprocessingDrawing" xmlns:w10="urn:schemas-microsoft-com:office:word" xmlns:w="http://schemas.openxmlformats.org/wordprocessingml/2006/main" xmlns:w14="http://schemas.microsoft.com/office/word/2010/wordml" xmlns:w15="http://schemas.microsoft.com/office/word/2012/wordml" xmlns:w16cex="http://schemas.microsoft.com/office/word/2018/wordml/cex" xmlns:w16cid="http://schemas.microsoft.com/office/word/2016/wordml/cid" xmlns:w16="http://schemas.microsoft.com/office/word/2018/wordml" xmlns:w16sdtdh="http://schemas.microsoft.com/office/word/2020/wordml/sdtdatahash" xmlns:w16se="http://schemas.microsoft.com/office/word/2015/wordml/symex" xmlns:wpg="http://schemas.microsoft.com/office/word/2010/wordprocessingGroup" xmlns:wpi="http://schemas.microsoft.com/office/word/2010/wordprocessingInk" xmlns:wne="http://schemas.microsoft.com/office/word/2006/wordml" xmlns:wps="http://schemas.microsoft.com/office/word/2010/wordprocessingShape" mc:Ignorable="w14 w15 w16se w16cid w16 w16cex w16sdtdh wp14">
   <w:p>
     <w:pPr>
       <w:pStyle w:val="Kopfzeile"/>
@@ -4526,7 +6329,7 @@
 </file>
 
 <file path=word/header2.xml><?xml version="1.0" encoding="utf-8"?>
-<w:hdr xmlns:wpc="http://schemas.microsoft.com/office/word/2010/wordprocessingCanvas" xmlns:cx="http://schemas.microsoft.com/office/drawing/2014/chartex" xmlns:cx1="http://schemas.microsoft.com/office/drawing/2015/9/8/chartex" xmlns:cx2="http://schemas.microsoft.com/office/drawing/2015/10/21/chartex" xmlns:cx3="http://schemas.microsoft.com/office/drawing/2016/5/9/chartex" xmlns:cx4="http://schemas.microsoft.com/office/drawing/2016/5/10/chartex" xmlns:cx5="http://schemas.microsoft.com/office/drawing/2016/5/11/chartex" xmlns:cx6="http://schemas.microsoft.com/office/drawing/2016/5/12/chartex" xmlns:cx7="http://schemas.microsoft.com/office/drawing/2016/5/13/chartex" xmlns:cx8="http://schemas.microsoft.com/office/drawing/2016/5/14/chartex" xmlns:mc="http://schemas.openxmlformats.org/markup-compatibility/2006" xmlns:aink="http://schemas.microsoft.com/office/drawing/2016/ink" xmlns:am3d="http://schemas.microsoft.com/office/drawing/2017/model3d" xmlns:o="urn:schemas-microsoft-com:office:office" xmlns:oel="http://schemas.microsoft.com/office/2019/extlst" xmlns:r="http://schemas.openxmlformats.org/officeDocument/2006/relationships" xmlns:m="http://schemas.openxmlformats.org/officeDocument/2006/math" xmlns:v="urn:schemas-microsoft-com:vml" xmlns:wp14="http://schemas.microsoft.com/office/word/2010/wordprocessingDrawing" xmlns:wp="http://schemas.openxmlformats.org/drawingml/2006/wordprocessingDrawing" xmlns:w10="urn:schemas-microsoft-com:office:word" xmlns:w="http://schemas.openxmlformats.org/wordprocessingml/2006/main" xmlns:w14="http://schemas.microsoft.com/office/word/2010/wordml" xmlns:w15="http://schemas.microsoft.com/office/word/2012/wordml" xmlns:w16cex="http://schemas.microsoft.com/office/word/2018/wordml/cex" xmlns:w16cid="http://schemas.microsoft.com/office/word/2016/wordml/cid" xmlns:w16="http://schemas.microsoft.com/office/word/2018/wordml" xmlns:w16du="http://schemas.microsoft.com/office/word/2023/wordml/word16du" xmlns:w16sdtdh="http://schemas.microsoft.com/office/word/2020/wordml/sdtdatahash" xmlns:w16sdtfl="http://schemas.microsoft.com/office/word/2024/wordml/sdtformatlock" xmlns:w16se="http://schemas.microsoft.com/office/word/2015/wordml/symex" xmlns:wpg="http://schemas.microsoft.com/office/word/2010/wordprocessingGroup" xmlns:wpi="http://schemas.microsoft.com/office/word/2010/wordprocessingInk" xmlns:wne="http://schemas.microsoft.com/office/word/2006/wordml" xmlns:wps="http://schemas.microsoft.com/office/word/2010/wordprocessingShape" mc:Ignorable="w14 w15 w16se w16cid w16 w16cex w16sdtdh w16sdtfl w16du wp14">
+<w:hdr xmlns:wpc="http://schemas.microsoft.com/office/word/2010/wordprocessingCanvas" xmlns:cx="http://schemas.microsoft.com/office/drawing/2014/chartex" xmlns:cx1="http://schemas.microsoft.com/office/drawing/2015/9/8/chartex" xmlns:cx2="http://schemas.microsoft.com/office/drawing/2015/10/21/chartex" xmlns:cx3="http://schemas.microsoft.com/office/drawing/2016/5/9/chartex" xmlns:cx4="http://schemas.microsoft.com/office/drawing/2016/5/10/chartex" xmlns:cx5="http://schemas.microsoft.com/office/drawing/2016/5/11/chartex" xmlns:cx6="http://schemas.microsoft.com/office/drawing/2016/5/12/chartex" xmlns:cx7="http://schemas.microsoft.com/office/drawing/2016/5/13/chartex" xmlns:cx8="http://schemas.microsoft.com/office/drawing/2016/5/14/chartex" xmlns:mc="http://schemas.openxmlformats.org/markup-compatibility/2006" xmlns:aink="http://schemas.microsoft.com/office/drawing/2016/ink" xmlns:am3d="http://schemas.microsoft.com/office/drawing/2017/model3d" xmlns:o="urn:schemas-microsoft-com:office:office" xmlns:oel="http://schemas.microsoft.com/office/2019/extlst" xmlns:r="http://schemas.openxmlformats.org/officeDocument/2006/relationships" xmlns:m="http://schemas.openxmlformats.org/officeDocument/2006/math" xmlns:v="urn:schemas-microsoft-com:vml" xmlns:wp14="http://schemas.microsoft.com/office/word/2010/wordprocessingDrawing" xmlns:wp="http://schemas.openxmlformats.org/drawingml/2006/wordprocessingDrawing" xmlns:w10="urn:schemas-microsoft-com:office:word" xmlns:w="http://schemas.openxmlformats.org/wordprocessingml/2006/main" xmlns:w14="http://schemas.microsoft.com/office/word/2010/wordml" xmlns:w15="http://schemas.microsoft.com/office/word/2012/wordml" xmlns:w16cex="http://schemas.microsoft.com/office/word/2018/wordml/cex" xmlns:w16cid="http://schemas.microsoft.com/office/word/2016/wordml/cid" xmlns:w16="http://schemas.microsoft.com/office/word/2018/wordml" xmlns:w16sdtdh="http://schemas.microsoft.com/office/word/2020/wordml/sdtdatahash" xmlns:w16se="http://schemas.microsoft.com/office/word/2015/wordml/symex" xmlns:wpg="http://schemas.microsoft.com/office/word/2010/wordprocessingGroup" xmlns:wpi="http://schemas.microsoft.com/office/word/2010/wordprocessingInk" xmlns:wne="http://schemas.microsoft.com/office/word/2006/wordml" xmlns:wps="http://schemas.microsoft.com/office/word/2010/wordprocessingShape" mc:Ignorable="w14 w15 w16se w16cid w16 w16cex w16sdtdh wp14">
   <w:p>
     <w:pPr>
       <w:pStyle w:val="Kopfzeile"/>
@@ -4537,7 +6340,7 @@
 </file>
 
 <file path=word/numbering.xml><?xml version="1.0" encoding="utf-8"?>
-<w:numbering xmlns:wpc="http://schemas.microsoft.com/office/word/2010/wordprocessingCanvas" xmlns:cx="http://schemas.microsoft.com/office/drawing/2014/chartex" xmlns:cx1="http://schemas.microsoft.com/office/drawing/2015/9/8/chartex" xmlns:cx2="http://schemas.microsoft.com/office/drawing/2015/10/21/chartex" xmlns:cx3="http://schemas.microsoft.com/office/drawing/2016/5/9/chartex" xmlns:cx4="http://schemas.microsoft.com/office/drawing/2016/5/10/chartex" xmlns:cx5="http://schemas.microsoft.com/office/drawing/2016/5/11/chartex" xmlns:cx6="http://schemas.microsoft.com/office/drawing/2016/5/12/chartex" xmlns:cx7="http://schemas.microsoft.com/office/drawing/2016/5/13/chartex" xmlns:cx8="http://schemas.microsoft.com/office/drawing/2016/5/14/chartex" xmlns:mc="http://schemas.openxmlformats.org/markup-compatibility/2006" xmlns:aink="http://schemas.microsoft.com/office/drawing/2016/ink" xmlns:am3d="http://schemas.microsoft.com/office/drawing/2017/model3d" xmlns:o="urn:schemas-microsoft-com:office:office" xmlns:oel="http://schemas.microsoft.com/office/2019/extlst" xmlns:r="http://schemas.openxmlformats.org/officeDocument/2006/relationships" xmlns:m="http://schemas.openxmlformats.org/officeDocument/2006/math" xmlns:v="urn:schemas-microsoft-com:vml" xmlns:wp14="http://schemas.microsoft.com/office/word/2010/wordprocessingDrawing" xmlns:wp="http://schemas.openxmlformats.org/drawingml/2006/wordprocessingDrawing" xmlns:w10="urn:schemas-microsoft-com:office:word" xmlns:w="http://schemas.openxmlformats.org/wordprocessingml/2006/main" xmlns:w14="http://schemas.microsoft.com/office/word/2010/wordml" xmlns:w15="http://schemas.microsoft.com/office/word/2012/wordml" xmlns:w16cex="http://schemas.microsoft.com/office/word/2018/wordml/cex" xmlns:w16cid="http://schemas.microsoft.com/office/word/2016/wordml/cid" xmlns:w16="http://schemas.microsoft.com/office/word/2018/wordml" xmlns:w16du="http://schemas.microsoft.com/office/word/2023/wordml/word16du" xmlns:w16sdtdh="http://schemas.microsoft.com/office/word/2020/wordml/sdtdatahash" xmlns:w16sdtfl="http://schemas.microsoft.com/office/word/2024/wordml/sdtformatlock" xmlns:w16se="http://schemas.microsoft.com/office/word/2015/wordml/symex" xmlns:wpg="http://schemas.microsoft.com/office/word/2010/wordprocessingGroup" xmlns:wpi="http://schemas.microsoft.com/office/word/2010/wordprocessingInk" xmlns:wne="http://schemas.microsoft.com/office/word/2006/wordml" xmlns:wps="http://schemas.microsoft.com/office/word/2010/wordprocessingShape" mc:Ignorable="w14 w15 w16se w16cid w16 w16cex w16sdtdh w16sdtfl w16du wp14">
+<w:numbering xmlns:wpc="http://schemas.microsoft.com/office/word/2010/wordprocessingCanvas" xmlns:cx="http://schemas.microsoft.com/office/drawing/2014/chartex" xmlns:cx1="http://schemas.microsoft.com/office/drawing/2015/9/8/chartex" xmlns:cx2="http://schemas.microsoft.com/office/drawing/2015/10/21/chartex" xmlns:cx3="http://schemas.microsoft.com/office/drawing/2016/5/9/chartex" xmlns:cx4="http://schemas.microsoft.com/office/drawing/2016/5/10/chartex" xmlns:cx5="http://schemas.microsoft.com/office/drawing/2016/5/11/chartex" xmlns:cx6="http://schemas.microsoft.com/office/drawing/2016/5/12/chartex" xmlns:cx7="http://schemas.microsoft.com/office/drawing/2016/5/13/chartex" xmlns:cx8="http://schemas.microsoft.com/office/drawing/2016/5/14/chartex" xmlns:mc="http://schemas.openxmlformats.org/markup-compatibility/2006" xmlns:aink="http://schemas.microsoft.com/office/drawing/2016/ink" xmlns:am3d="http://schemas.microsoft.com/office/drawing/2017/model3d" xmlns:o="urn:schemas-microsoft-com:office:office" xmlns:oel="http://schemas.microsoft.com/office/2019/extlst" xmlns:r="http://schemas.openxmlformats.org/officeDocument/2006/relationships" xmlns:m="http://schemas.openxmlformats.org/officeDocument/2006/math" xmlns:v="urn:schemas-microsoft-com:vml" xmlns:wp14="http://schemas.microsoft.com/office/word/2010/wordprocessingDrawing" xmlns:wp="http://schemas.openxmlformats.org/drawingml/2006/wordprocessingDrawing" xmlns:w10="urn:schemas-microsoft-com:office:word" xmlns:w="http://schemas.openxmlformats.org/wordprocessingml/2006/main" xmlns:w14="http://schemas.microsoft.com/office/word/2010/wordml" xmlns:w15="http://schemas.microsoft.com/office/word/2012/wordml" xmlns:w16cex="http://schemas.microsoft.com/office/word/2018/wordml/cex" xmlns:w16cid="http://schemas.microsoft.com/office/word/2016/wordml/cid" xmlns:w16="http://schemas.microsoft.com/office/word/2018/wordml" xmlns:w16sdtdh="http://schemas.microsoft.com/office/word/2020/wordml/sdtdatahash" xmlns:w16se="http://schemas.microsoft.com/office/word/2015/wordml/symex" xmlns:wpg="http://schemas.microsoft.com/office/word/2010/wordprocessingGroup" xmlns:wpi="http://schemas.microsoft.com/office/word/2010/wordprocessingInk" xmlns:wne="http://schemas.microsoft.com/office/word/2006/wordml" xmlns:wps="http://schemas.microsoft.com/office/word/2010/wordprocessingShape" mc:Ignorable="w14 w15 w16se w16cid w16 w16cex w16sdtdh wp14">
   <w:abstractNum w:abstractNumId="0" w15:restartNumberingAfterBreak="0">
     <w:nsid w:val="18E7E183"/>
     <w:multiLevelType w:val="hybridMultilevel"/>
@@ -4824,6 +6627,155 @@
     </w:lvl>
   </w:abstractNum>
   <w:abstractNum w:abstractNumId="3" w15:restartNumberingAfterBreak="0">
+    <w:nsid w:val="1FF837F0"/>
+    <w:multiLevelType w:val="multilevel"/>
+    <w:tmpl w:val="5D44775A"/>
+    <w:lvl w:ilvl="0">
+      <w:start w:val="1"/>
+      <w:numFmt w:val="bullet"/>
+      <w:lvlText w:val=""/>
+      <w:lvlJc w:val="left"/>
+      <w:pPr>
+        <w:tabs>
+          <w:tab w:val="num" w:pos="720"/>
+        </w:tabs>
+        <w:ind w:left="720" w:hanging="360"/>
+      </w:pPr>
+      <w:rPr>
+        <w:rFonts w:ascii="Symbol" w:hAnsi="Symbol" w:hint="default"/>
+        <w:sz w:val="20"/>
+      </w:rPr>
+    </w:lvl>
+    <w:lvl w:ilvl="1" w:tentative="1">
+      <w:start w:val="1"/>
+      <w:numFmt w:val="bullet"/>
+      <w:lvlText w:val="o"/>
+      <w:lvlJc w:val="left"/>
+      <w:pPr>
+        <w:tabs>
+          <w:tab w:val="num" w:pos="1440"/>
+        </w:tabs>
+        <w:ind w:left="1440" w:hanging="360"/>
+      </w:pPr>
+      <w:rPr>
+        <w:rFonts w:ascii="Courier New" w:hAnsi="Courier New" w:hint="default"/>
+        <w:sz w:val="20"/>
+      </w:rPr>
+    </w:lvl>
+    <w:lvl w:ilvl="2" w:tentative="1">
+      <w:start w:val="1"/>
+      <w:numFmt w:val="bullet"/>
+      <w:lvlText w:val=""/>
+      <w:lvlJc w:val="left"/>
+      <w:pPr>
+        <w:tabs>
+          <w:tab w:val="num" w:pos="2160"/>
+        </w:tabs>
+        <w:ind w:left="2160" w:hanging="360"/>
+      </w:pPr>
+      <w:rPr>
+        <w:rFonts w:ascii="Wingdings" w:hAnsi="Wingdings" w:hint="default"/>
+        <w:sz w:val="20"/>
+      </w:rPr>
+    </w:lvl>
+    <w:lvl w:ilvl="3" w:tentative="1">
+      <w:start w:val="1"/>
+      <w:numFmt w:val="bullet"/>
+      <w:lvlText w:val=""/>
+      <w:lvlJc w:val="left"/>
+      <w:pPr>
+        <w:tabs>
+          <w:tab w:val="num" w:pos="2880"/>
+        </w:tabs>
+        <w:ind w:left="2880" w:hanging="360"/>
+      </w:pPr>
+      <w:rPr>
+        <w:rFonts w:ascii="Wingdings" w:hAnsi="Wingdings" w:hint="default"/>
+        <w:sz w:val="20"/>
+      </w:rPr>
+    </w:lvl>
+    <w:lvl w:ilvl="4" w:tentative="1">
+      <w:start w:val="1"/>
+      <w:numFmt w:val="bullet"/>
+      <w:lvlText w:val=""/>
+      <w:lvlJc w:val="left"/>
+      <w:pPr>
+        <w:tabs>
+          <w:tab w:val="num" w:pos="3600"/>
+        </w:tabs>
+        <w:ind w:left="3600" w:hanging="360"/>
+      </w:pPr>
+      <w:rPr>
+        <w:rFonts w:ascii="Wingdings" w:hAnsi="Wingdings" w:hint="default"/>
+        <w:sz w:val="20"/>
+      </w:rPr>
+    </w:lvl>
+    <w:lvl w:ilvl="5" w:tentative="1">
+      <w:start w:val="1"/>
+      <w:numFmt w:val="bullet"/>
+      <w:lvlText w:val=""/>
+      <w:lvlJc w:val="left"/>
+      <w:pPr>
+        <w:tabs>
+          <w:tab w:val="num" w:pos="4320"/>
+        </w:tabs>
+        <w:ind w:left="4320" w:hanging="360"/>
+      </w:pPr>
+      <w:rPr>
+        <w:rFonts w:ascii="Wingdings" w:hAnsi="Wingdings" w:hint="default"/>
+        <w:sz w:val="20"/>
+      </w:rPr>
+    </w:lvl>
+    <w:lvl w:ilvl="6" w:tentative="1">
+      <w:start w:val="1"/>
+      <w:numFmt w:val="bullet"/>
+      <w:lvlText w:val=""/>
+      <w:lvlJc w:val="left"/>
+      <w:pPr>
+        <w:tabs>
+          <w:tab w:val="num" w:pos="5040"/>
+        </w:tabs>
+        <w:ind w:left="5040" w:hanging="360"/>
+      </w:pPr>
+      <w:rPr>
+        <w:rFonts w:ascii="Wingdings" w:hAnsi="Wingdings" w:hint="default"/>
+        <w:sz w:val="20"/>
+      </w:rPr>
+    </w:lvl>
+    <w:lvl w:ilvl="7" w:tentative="1">
+      <w:start w:val="1"/>
+      <w:numFmt w:val="bullet"/>
+      <w:lvlText w:val=""/>
+      <w:lvlJc w:val="left"/>
+      <w:pPr>
+        <w:tabs>
+          <w:tab w:val="num" w:pos="5760"/>
+        </w:tabs>
+        <w:ind w:left="5760" w:hanging="360"/>
+      </w:pPr>
+      <w:rPr>
+        <w:rFonts w:ascii="Wingdings" w:hAnsi="Wingdings" w:hint="default"/>
+        <w:sz w:val="20"/>
+      </w:rPr>
+    </w:lvl>
+    <w:lvl w:ilvl="8" w:tentative="1">
+      <w:start w:val="1"/>
+      <w:numFmt w:val="bullet"/>
+      <w:lvlText w:val=""/>
+      <w:lvlJc w:val="left"/>
+      <w:pPr>
+        <w:tabs>
+          <w:tab w:val="num" w:pos="6480"/>
+        </w:tabs>
+        <w:ind w:left="6480" w:hanging="360"/>
+      </w:pPr>
+      <w:rPr>
+        <w:rFonts w:ascii="Wingdings" w:hAnsi="Wingdings" w:hint="default"/>
+        <w:sz w:val="20"/>
+      </w:rPr>
+    </w:lvl>
+  </w:abstractNum>
+  <w:abstractNum w:abstractNumId="4" w15:restartNumberingAfterBreak="0">
     <w:nsid w:val="4CCA2D54"/>
     <w:multiLevelType w:val="hybridMultilevel"/>
     <w:tmpl w:val="4B740F70"/>
@@ -4909,7 +6861,120 @@
       </w:pPr>
     </w:lvl>
   </w:abstractNum>
-  <w:abstractNum w:abstractNumId="4" w15:restartNumberingAfterBreak="0">
+  <w:abstractNum w:abstractNumId="5" w15:restartNumberingAfterBreak="0">
+    <w:nsid w:val="4F971405"/>
+    <w:multiLevelType w:val="hybridMultilevel"/>
+    <w:tmpl w:val="6436FD10"/>
+    <w:lvl w:ilvl="0" w:tplc="04070001">
+      <w:start w:val="1"/>
+      <w:numFmt w:val="bullet"/>
+      <w:lvlText w:val=""/>
+      <w:lvlJc w:val="left"/>
+      <w:pPr>
+        <w:ind w:left="720" w:hanging="360"/>
+      </w:pPr>
+      <w:rPr>
+        <w:rFonts w:ascii="Symbol" w:hAnsi="Symbol" w:hint="default"/>
+      </w:rPr>
+    </w:lvl>
+    <w:lvl w:ilvl="1" w:tplc="04070003" w:tentative="1">
+      <w:start w:val="1"/>
+      <w:numFmt w:val="bullet"/>
+      <w:lvlText w:val="o"/>
+      <w:lvlJc w:val="left"/>
+      <w:pPr>
+        <w:ind w:left="1440" w:hanging="360"/>
+      </w:pPr>
+      <w:rPr>
+        <w:rFonts w:ascii="Courier New" w:hAnsi="Courier New" w:cs="Courier New" w:hint="default"/>
+      </w:rPr>
+    </w:lvl>
+    <w:lvl w:ilvl="2" w:tplc="04070005" w:tentative="1">
+      <w:start w:val="1"/>
+      <w:numFmt w:val="bullet"/>
+      <w:lvlText w:val=""/>
+      <w:lvlJc w:val="left"/>
+      <w:pPr>
+        <w:ind w:left="2160" w:hanging="360"/>
+      </w:pPr>
+      <w:rPr>
+        <w:rFonts w:ascii="Wingdings" w:hAnsi="Wingdings" w:hint="default"/>
+      </w:rPr>
+    </w:lvl>
+    <w:lvl w:ilvl="3" w:tplc="04070001" w:tentative="1">
+      <w:start w:val="1"/>
+      <w:numFmt w:val="bullet"/>
+      <w:lvlText w:val=""/>
+      <w:lvlJc w:val="left"/>
+      <w:pPr>
+        <w:ind w:left="2880" w:hanging="360"/>
+      </w:pPr>
+      <w:rPr>
+        <w:rFonts w:ascii="Symbol" w:hAnsi="Symbol" w:hint="default"/>
+      </w:rPr>
+    </w:lvl>
+    <w:lvl w:ilvl="4" w:tplc="04070003" w:tentative="1">
+      <w:start w:val="1"/>
+      <w:numFmt w:val="bullet"/>
+      <w:lvlText w:val="o"/>
+      <w:lvlJc w:val="left"/>
+      <w:pPr>
+        <w:ind w:left="3600" w:hanging="360"/>
+      </w:pPr>
+      <w:rPr>
+        <w:rFonts w:ascii="Courier New" w:hAnsi="Courier New" w:cs="Courier New" w:hint="default"/>
+      </w:rPr>
+    </w:lvl>
+    <w:lvl w:ilvl="5" w:tplc="04070005" w:tentative="1">
+      <w:start w:val="1"/>
+      <w:numFmt w:val="bullet"/>
+      <w:lvlText w:val=""/>
+      <w:lvlJc w:val="left"/>
+      <w:pPr>
+        <w:ind w:left="4320" w:hanging="360"/>
+      </w:pPr>
+      <w:rPr>
+        <w:rFonts w:ascii="Wingdings" w:hAnsi="Wingdings" w:hint="default"/>
+      </w:rPr>
+    </w:lvl>
+    <w:lvl w:ilvl="6" w:tplc="04070001" w:tentative="1">
+      <w:start w:val="1"/>
+      <w:numFmt w:val="bullet"/>
+      <w:lvlText w:val=""/>
+      <w:lvlJc w:val="left"/>
+      <w:pPr>
+        <w:ind w:left="5040" w:hanging="360"/>
+      </w:pPr>
+      <w:rPr>
+        <w:rFonts w:ascii="Symbol" w:hAnsi="Symbol" w:hint="default"/>
+      </w:rPr>
+    </w:lvl>
+    <w:lvl w:ilvl="7" w:tplc="04070003" w:tentative="1">
+      <w:start w:val="1"/>
+      <w:numFmt w:val="bullet"/>
+      <w:lvlText w:val="o"/>
+      <w:lvlJc w:val="left"/>
+      <w:pPr>
+        <w:ind w:left="5760" w:hanging="360"/>
+      </w:pPr>
+      <w:rPr>
+        <w:rFonts w:ascii="Courier New" w:hAnsi="Courier New" w:cs="Courier New" w:hint="default"/>
+      </w:rPr>
+    </w:lvl>
+    <w:lvl w:ilvl="8" w:tplc="04070005" w:tentative="1">
+      <w:start w:val="1"/>
+      <w:numFmt w:val="bullet"/>
+      <w:lvlText w:val=""/>
+      <w:lvlJc w:val="left"/>
+      <w:pPr>
+        <w:ind w:left="6480" w:hanging="360"/>
+      </w:pPr>
+      <w:rPr>
+        <w:rFonts w:ascii="Wingdings" w:hAnsi="Wingdings" w:hint="default"/>
+      </w:rPr>
+    </w:lvl>
+  </w:abstractNum>
+  <w:abstractNum w:abstractNumId="6" w15:restartNumberingAfterBreak="0">
     <w:nsid w:val="586B5662"/>
     <w:multiLevelType w:val="hybridMultilevel"/>
     <w:tmpl w:val="83BEB8FA"/>
@@ -4995,7 +7060,156 @@
       </w:pPr>
     </w:lvl>
   </w:abstractNum>
-  <w:abstractNum w:abstractNumId="5" w15:restartNumberingAfterBreak="0">
+  <w:abstractNum w:abstractNumId="7" w15:restartNumberingAfterBreak="0">
+    <w:nsid w:val="63545DB4"/>
+    <w:multiLevelType w:val="multilevel"/>
+    <w:tmpl w:val="0D84BEE6"/>
+    <w:lvl w:ilvl="0">
+      <w:start w:val="1"/>
+      <w:numFmt w:val="bullet"/>
+      <w:lvlText w:val=""/>
+      <w:lvlJc w:val="left"/>
+      <w:pPr>
+        <w:tabs>
+          <w:tab w:val="num" w:pos="720"/>
+        </w:tabs>
+        <w:ind w:left="720" w:hanging="360"/>
+      </w:pPr>
+      <w:rPr>
+        <w:rFonts w:ascii="Symbol" w:hAnsi="Symbol" w:hint="default"/>
+        <w:sz w:val="20"/>
+      </w:rPr>
+    </w:lvl>
+    <w:lvl w:ilvl="1" w:tentative="1">
+      <w:start w:val="1"/>
+      <w:numFmt w:val="bullet"/>
+      <w:lvlText w:val="o"/>
+      <w:lvlJc w:val="left"/>
+      <w:pPr>
+        <w:tabs>
+          <w:tab w:val="num" w:pos="1440"/>
+        </w:tabs>
+        <w:ind w:left="1440" w:hanging="360"/>
+      </w:pPr>
+      <w:rPr>
+        <w:rFonts w:ascii="Courier New" w:hAnsi="Courier New" w:hint="default"/>
+        <w:sz w:val="20"/>
+      </w:rPr>
+    </w:lvl>
+    <w:lvl w:ilvl="2" w:tentative="1">
+      <w:start w:val="1"/>
+      <w:numFmt w:val="bullet"/>
+      <w:lvlText w:val=""/>
+      <w:lvlJc w:val="left"/>
+      <w:pPr>
+        <w:tabs>
+          <w:tab w:val="num" w:pos="2160"/>
+        </w:tabs>
+        <w:ind w:left="2160" w:hanging="360"/>
+      </w:pPr>
+      <w:rPr>
+        <w:rFonts w:ascii="Wingdings" w:hAnsi="Wingdings" w:hint="default"/>
+        <w:sz w:val="20"/>
+      </w:rPr>
+    </w:lvl>
+    <w:lvl w:ilvl="3" w:tentative="1">
+      <w:start w:val="1"/>
+      <w:numFmt w:val="bullet"/>
+      <w:lvlText w:val=""/>
+      <w:lvlJc w:val="left"/>
+      <w:pPr>
+        <w:tabs>
+          <w:tab w:val="num" w:pos="2880"/>
+        </w:tabs>
+        <w:ind w:left="2880" w:hanging="360"/>
+      </w:pPr>
+      <w:rPr>
+        <w:rFonts w:ascii="Wingdings" w:hAnsi="Wingdings" w:hint="default"/>
+        <w:sz w:val="20"/>
+      </w:rPr>
+    </w:lvl>
+    <w:lvl w:ilvl="4" w:tentative="1">
+      <w:start w:val="1"/>
+      <w:numFmt w:val="bullet"/>
+      <w:lvlText w:val=""/>
+      <w:lvlJc w:val="left"/>
+      <w:pPr>
+        <w:tabs>
+          <w:tab w:val="num" w:pos="3600"/>
+        </w:tabs>
+        <w:ind w:left="3600" w:hanging="360"/>
+      </w:pPr>
+      <w:rPr>
+        <w:rFonts w:ascii="Wingdings" w:hAnsi="Wingdings" w:hint="default"/>
+        <w:sz w:val="20"/>
+      </w:rPr>
+    </w:lvl>
+    <w:lvl w:ilvl="5" w:tentative="1">
+      <w:start w:val="1"/>
+      <w:numFmt w:val="bullet"/>
+      <w:lvlText w:val=""/>
+      <w:lvlJc w:val="left"/>
+      <w:pPr>
+        <w:tabs>
+          <w:tab w:val="num" w:pos="4320"/>
+        </w:tabs>
+        <w:ind w:left="4320" w:hanging="360"/>
+      </w:pPr>
+      <w:rPr>
+        <w:rFonts w:ascii="Wingdings" w:hAnsi="Wingdings" w:hint="default"/>
+        <w:sz w:val="20"/>
+      </w:rPr>
+    </w:lvl>
+    <w:lvl w:ilvl="6" w:tentative="1">
+      <w:start w:val="1"/>
+      <w:numFmt w:val="bullet"/>
+      <w:lvlText w:val=""/>
+      <w:lvlJc w:val="left"/>
+      <w:pPr>
+        <w:tabs>
+          <w:tab w:val="num" w:pos="5040"/>
+        </w:tabs>
+        <w:ind w:left="5040" w:hanging="360"/>
+      </w:pPr>
+      <w:rPr>
+        <w:rFonts w:ascii="Wingdings" w:hAnsi="Wingdings" w:hint="default"/>
+        <w:sz w:val="20"/>
+      </w:rPr>
+    </w:lvl>
+    <w:lvl w:ilvl="7" w:tentative="1">
+      <w:start w:val="1"/>
+      <w:numFmt w:val="bullet"/>
+      <w:lvlText w:val=""/>
+      <w:lvlJc w:val="left"/>
+      <w:pPr>
+        <w:tabs>
+          <w:tab w:val="num" w:pos="5760"/>
+        </w:tabs>
+        <w:ind w:left="5760" w:hanging="360"/>
+      </w:pPr>
+      <w:rPr>
+        <w:rFonts w:ascii="Wingdings" w:hAnsi="Wingdings" w:hint="default"/>
+        <w:sz w:val="20"/>
+      </w:rPr>
+    </w:lvl>
+    <w:lvl w:ilvl="8" w:tentative="1">
+      <w:start w:val="1"/>
+      <w:numFmt w:val="bullet"/>
+      <w:lvlText w:val=""/>
+      <w:lvlJc w:val="left"/>
+      <w:pPr>
+        <w:tabs>
+          <w:tab w:val="num" w:pos="6480"/>
+        </w:tabs>
+        <w:ind w:left="6480" w:hanging="360"/>
+      </w:pPr>
+      <w:rPr>
+        <w:rFonts w:ascii="Wingdings" w:hAnsi="Wingdings" w:hint="default"/>
+        <w:sz w:val="20"/>
+      </w:rPr>
+    </w:lvl>
+  </w:abstractNum>
+  <w:abstractNum w:abstractNumId="8" w15:restartNumberingAfterBreak="0">
     <w:nsid w:val="6EBD295C"/>
     <w:multiLevelType w:val="hybridMultilevel"/>
     <w:tmpl w:val="B3042E68"/>
@@ -5081,7 +7295,7 @@
       </w:pPr>
     </w:lvl>
   </w:abstractNum>
-  <w:abstractNum w:abstractNumId="6" w15:restartNumberingAfterBreak="0">
+  <w:abstractNum w:abstractNumId="9" w15:restartNumberingAfterBreak="0">
     <w:nsid w:val="79911088"/>
     <w:multiLevelType w:val="hybridMultilevel"/>
     <w:tmpl w:val="B89254AA"/>
@@ -5198,28 +7412,37 @@
     <w:abstractNumId w:val="0"/>
   </w:num>
   <w:num w:numId="2" w16cid:durableId="483547684">
-    <w:abstractNumId w:val="6"/>
+    <w:abstractNumId w:val="9"/>
   </w:num>
   <w:num w:numId="3" w16cid:durableId="86730405">
     <w:abstractNumId w:val="1"/>
   </w:num>
   <w:num w:numId="4" w16cid:durableId="461310425">
-    <w:abstractNumId w:val="5"/>
+    <w:abstractNumId w:val="8"/>
   </w:num>
   <w:num w:numId="5" w16cid:durableId="622687816">
-    <w:abstractNumId w:val="4"/>
+    <w:abstractNumId w:val="6"/>
   </w:num>
   <w:num w:numId="6" w16cid:durableId="156845624">
     <w:abstractNumId w:val="2"/>
   </w:num>
   <w:num w:numId="7" w16cid:durableId="901527557">
+    <w:abstractNumId w:val="4"/>
+  </w:num>
+  <w:num w:numId="8" w16cid:durableId="223223821">
+    <w:abstractNumId w:val="5"/>
+  </w:num>
+  <w:num w:numId="9" w16cid:durableId="471170051">
     <w:abstractNumId w:val="3"/>
+  </w:num>
+  <w:num w:numId="10" w16cid:durableId="298456306">
+    <w:abstractNumId w:val="7"/>
   </w:num>
 </w:numbering>
 </file>
 
 <file path=word/styles.xml><?xml version="1.0" encoding="utf-8"?>
-<w:styles xmlns:mc="http://schemas.openxmlformats.org/markup-compatibility/2006" xmlns:r="http://schemas.openxmlformats.org/officeDocument/2006/relationships" xmlns:w="http://schemas.openxmlformats.org/wordprocessingml/2006/main" xmlns:w14="http://schemas.microsoft.com/office/word/2010/wordml" xmlns:w15="http://schemas.microsoft.com/office/word/2012/wordml" xmlns:w16cex="http://schemas.microsoft.com/office/word/2018/wordml/cex" xmlns:w16cid="http://schemas.microsoft.com/office/word/2016/wordml/cid" xmlns:w16="http://schemas.microsoft.com/office/word/2018/wordml" xmlns:w16du="http://schemas.microsoft.com/office/word/2023/wordml/word16du" xmlns:w16sdtdh="http://schemas.microsoft.com/office/word/2020/wordml/sdtdatahash" xmlns:w16sdtfl="http://schemas.microsoft.com/office/word/2024/wordml/sdtformatlock" xmlns:w16se="http://schemas.microsoft.com/office/word/2015/wordml/symex" mc:Ignorable="w14 w15 w16se w16cid w16 w16cex w16sdtdh w16sdtfl w16du">
+<w:styles xmlns:mc="http://schemas.openxmlformats.org/markup-compatibility/2006" xmlns:r="http://schemas.openxmlformats.org/officeDocument/2006/relationships" xmlns:w="http://schemas.openxmlformats.org/wordprocessingml/2006/main" xmlns:w14="http://schemas.microsoft.com/office/word/2010/wordml" xmlns:w15="http://schemas.microsoft.com/office/word/2012/wordml" xmlns:w16cex="http://schemas.microsoft.com/office/word/2018/wordml/cex" xmlns:w16cid="http://schemas.microsoft.com/office/word/2016/wordml/cid" xmlns:w16="http://schemas.microsoft.com/office/word/2018/wordml" xmlns:w16sdtdh="http://schemas.microsoft.com/office/word/2020/wordml/sdtdatahash" xmlns:w16se="http://schemas.microsoft.com/office/word/2015/wordml/symex" mc:Ignorable="w14 w15 w16se w16cid w16 w16cex w16sdtdh">
   <w:docDefaults>
     <w:rPrDefault>
       <w:rPr>
@@ -6561,6 +8784,45 @@
       <w:rFonts w:ascii="Aptos Display" w:hAnsi="Aptos Display"/>
     </w:rPr>
   </w:style>
+  <w:style w:type="paragraph" w:styleId="StandardWeb">
+    <w:name w:val="Normal (Web)"/>
+    <w:basedOn w:val="Standard"/>
+    <w:uiPriority w:val="99"/>
+    <w:semiHidden/>
+    <w:unhideWhenUsed/>
+    <w:rsid w:val="00FB6925"/>
+    <w:pPr>
+      <w:spacing w:before="100" w:beforeAutospacing="1" w:after="100" w:afterAutospacing="1"/>
+      <w:ind w:firstLine="0"/>
+    </w:pPr>
+    <w:rPr>
+      <w:rFonts w:ascii="Times New Roman" w:eastAsia="Times New Roman" w:hAnsi="Times New Roman" w:cs="Times New Roman"/>
+      <w:sz w:val="24"/>
+      <w:szCs w:val="24"/>
+      <w:lang w:val="de-DE" w:eastAsia="de-DE"/>
+    </w:rPr>
+  </w:style>
+  <w:style w:type="character" w:customStyle="1" w:styleId="apple-converted-space">
+    <w:name w:val="apple-converted-space"/>
+    <w:basedOn w:val="Absatz-Standardschriftart"/>
+    <w:rsid w:val="00FB6925"/>
+  </w:style>
+  <w:style w:type="table" w:styleId="Tabellenraster">
+    <w:name w:val="Table Grid"/>
+    <w:basedOn w:val="NormaleTabelle"/>
+    <w:uiPriority w:val="39"/>
+    <w:rsid w:val="00342183"/>
+    <w:tblPr>
+      <w:tblBorders>
+        <w:top w:val="single" w:sz="4" w:space="0" w:color="auto"/>
+        <w:left w:val="single" w:sz="4" w:space="0" w:color="auto"/>
+        <w:bottom w:val="single" w:sz="4" w:space="0" w:color="auto"/>
+        <w:right w:val="single" w:sz="4" w:space="0" w:color="auto"/>
+        <w:insideH w:val="single" w:sz="4" w:space="0" w:color="auto"/>
+        <w:insideV w:val="single" w:sz="4" w:space="0" w:color="auto"/>
+      </w:tblBorders>
+    </w:tblPr>
+  </w:style>
 </w:styles>
 </file>
 

</xml_diff>